<commit_message>
charity: reprice the seats and move the start to 19:30
19:25 turns out to be the reception cutoff, not the start, so the flyer,
the page, the LP, the timetable and every banner now say 19:30 with the
cutoff on its own line.

The seats settle as 10口 of VVIP at 300,000 and 15口 of S席 at 150,000,
each with a guest -- 20 and 30 people, filling all 50 chairs, with the
100 standing ライブ席 bringing the room to exactly 150. 最前列席 is folded
into S席 because it was the same block, and both tiers pick up the
practical novelty goods the team chose over the coaster idea.

Co-Authored-By: Claude Opus 5 <noreply@anthropic.com>
</commit_message>
<xml_diff>
--- a/docs/campfire-body-edit.docx
+++ b/docs/campfire-body-edit.docx
@@ -1854,7 +1854,7 @@
           <w:sz-cs w:val="29"/>
           <w:spacing w:val="0"/>
         </w:rPr>
-        <w:t xml:space="preserve">：2026年10月18日（日） OPEN 19:00 ／ START 19:25 ／ 終演 21:10</w:t>
+        <w:t xml:space="preserve">：2026年10月18日（日） OPEN 19:00 ／ START 19:30 ／ 終演 21:10</w:t>
       </w:r>
     </w:p>
     <w:p>
@@ -2528,16 +2528,16 @@
           <w:b/>
           <w:spacing w:val="0"/>
         </w:rPr>
-        <w:t xml:space="preserve">19:20</w:t>
-      </w:r>
-      <w:r>
-        <w:rPr>
-          <w:rFonts w:ascii="Hiragino Sans" w:hAnsi="Hiragino Sans" w:cs="Hiragino Sans"/>
-          <w:sz w:val="29"/>
-          <w:sz-cs w:val="29"/>
-          <w:spacing w:val="0"/>
-        </w:rPr>
-        <w:t xml:space="preserve">　入場締切</w:t>
+        <w:t xml:space="preserve">19:25</w:t>
+      </w:r>
+      <w:r>
+        <w:rPr>
+          <w:rFonts w:ascii="Hiragino Sans" w:hAnsi="Hiragino Sans" w:cs="Hiragino Sans"/>
+          <w:sz w:val="29"/>
+          <w:sz-cs w:val="29"/>
+          <w:spacing w:val="0"/>
+        </w:rPr>
+        <w:t xml:space="preserve">　受付締切</w:t>
       </w:r>
     </w:p>
     <w:p>
@@ -2566,7 +2566,7 @@
           <w:b/>
           <w:spacing w:val="0"/>
         </w:rPr>
-        <w:t xml:space="preserve">19:25</w:t>
+        <w:t xml:space="preserve">19:30</w:t>
       </w:r>
       <w:r>
         <w:rPr>
@@ -3065,16 +3065,16 @@
           <w:b/>
           <w:spacing w:val="0"/>
         </w:rPr>
-        <w:t xml:space="preserve">【最前列席】50,000円</w:t>
-      </w:r>
-      <w:r>
-        <w:rPr>
-          <w:rFonts w:ascii="Hiragino Sans" w:hAnsi="Hiragino Sans" w:cs="Hiragino Sans"/>
-          <w:sz w:val="29"/>
-          <w:sz-cs w:val="29"/>
-          <w:spacing w:val="0"/>
-        </w:rPr>
-        <w:t xml:space="preserve">〔30席〕</w:t>
+        <w:t xml:space="preserve">【S席・MIOタイム】150,000円</w:t>
+      </w:r>
+      <w:r>
+        <w:rPr>
+          <w:rFonts w:ascii="Hiragino Sans" w:hAnsi="Hiragino Sans" w:cs="Hiragino Sans"/>
+          <w:sz w:val="29"/>
+          <w:sz-cs w:val="29"/>
+          <w:spacing w:val="0"/>
+        </w:rPr>
+        <w:t xml:space="preserve">〔15口／同伴1名まで可（計30名）／17:45 先行入場〕</w:t>
       </w:r>
       <w:r>
         <w:rPr>
@@ -3112,7 +3112,16 @@
           <w:b/>
           <w:spacing w:val="0"/>
         </w:rPr>
-        <w:t xml:space="preserve">最前列のお席をご用意します</w:t>
+        <w:t xml:space="preserve">お席をご用意します</w:t>
+      </w:r>
+      <w:r>
+        <w:rPr>
+          <w:rFonts w:ascii="Hiragino Sans" w:hAnsi="Hiragino Sans" w:cs="Hiragino Sans"/>
+          <w:sz w:val="29"/>
+          <w:sz-cs w:val="29"/>
+          <w:spacing w:val="0"/>
+        </w:rPr>
+        <w:t xml:space="preserve">〔S席区画〕</w:t>
       </w:r>
       <w:r>
         <w:rPr>
@@ -3148,7 +3157,7 @@
           <w:sz-cs w:val="29"/>
           <w:spacing w:val="0"/>
         </w:rPr>
-        <w:t xml:space="preserve">アコースティックライブ観覧</w:t>
+        <w:t xml:space="preserve">MIO とのチェキ撮影（お一人1分）</w:t>
       </w:r>
     </w:p>
     <w:p>
@@ -3177,80 +3186,16 @@
           <w:b/>
           <w:spacing w:val="0"/>
         </w:rPr>
-        <w:t xml:space="preserve">ファンミーティング</w:t>
-      </w:r>
-      <w:r>
-        <w:rPr>
-          <w:rFonts w:ascii="Hiragino Sans" w:hAnsi="Hiragino Sans" w:cs="Hiragino Sans"/>
-          <w:sz w:val="29"/>
-          <w:sz-cs w:val="29"/>
-          <w:spacing w:val="0"/>
-        </w:rPr>
-        <w:t xml:space="preserve">（2026年11月・ユグドラシル本店）</w:t>
-      </w:r>
-      <w:r>
-        <w:rPr>
-          <w:rFonts w:ascii="Hiragino Sans" w:hAnsi="Hiragino Sans" w:cs="Hiragino Sans"/>
-          <w:sz w:val="29"/>
-          <w:sz-cs w:val="29"/>
-          <w:spacing w:val="0"/>
-        </w:rPr>
-        <w:t xml:space="preserve">〔日程は調整中〕</w:t>
-      </w:r>
-      <w:r>
-        <w:rPr>
-          <w:rFonts w:ascii="Hiragino Sans" w:hAnsi="Hiragino Sans" w:cs="Hiragino Sans"/>
-          <w:sz w:val="29"/>
-          <w:sz-cs w:val="29"/>
-          <w:spacing w:val="0"/>
-        </w:rPr>
-        <w:t xml:space="preserve"/>
-      </w:r>
-    </w:p>
-    <w:p>
-      <w:pPr/>
-      <w:r>
-        <w:rPr>
-          <w:rFonts w:ascii="Hiragino Sans" w:hAnsi="Hiragino Sans" w:cs="Hiragino Sans"/>
-          <w:sz w:val="29"/>
-          <w:sz-cs w:val="29"/>
-          <w:spacing w:val="0"/>
-          <w:color w:val="6D6D6D"/>
-        </w:rPr>
-        <w:t xml:space="preserve"/>
-      </w:r>
-    </w:p>
-    <w:p>
-      <w:pPr>
-        <w:spacing w:after="240"/>
-      </w:pPr>
-      <w:r>
-        <w:rPr>
-          <w:rFonts w:ascii="Hiragino Sans" w:hAnsi="Hiragino Sans" w:cs="Hiragino Sans"/>
-          <w:sz w:val="29"/>
-          <w:sz-cs w:val="29"/>
-          <w:b/>
-          <w:spacing w:val="0"/>
-        </w:rPr>
-        <w:t xml:space="preserve">【MIOタイム】150,000円</w:t>
-      </w:r>
-      <w:r>
-        <w:rPr>
-          <w:rFonts w:ascii="Hiragino Sans" w:hAnsi="Hiragino Sans" w:cs="Hiragino Sans"/>
-          <w:sz w:val="29"/>
-          <w:sz-cs w:val="29"/>
-          <w:spacing w:val="0"/>
-        </w:rPr>
-        <w:t xml:space="preserve">〔26名／18:00〜・17:45 先行入場〕</w:t>
-      </w:r>
-      <w:r>
-        <w:rPr>
-          <w:rFonts w:ascii="Hiragino Sans" w:hAnsi="Hiragino Sans" w:cs="Hiragino Sans"/>
-          <w:sz w:val="29"/>
-          <w:sz-cs w:val="29"/>
-          <w:spacing w:val="0"/>
-        </w:rPr>
-        <w:t xml:space="preserve"/>
+        <w:t xml:space="preserve">やしろ語録動画</w:t>
+      </w:r>
+      <w:r>
+        <w:rPr>
+          <w:rFonts w:ascii="Hiragino Sans" w:hAnsi="Hiragino Sans" w:cs="Hiragino Sans"/>
+          <w:sz w:val="29"/>
+          <w:sz-cs w:val="29"/>
+          <w:spacing w:val="0"/>
+        </w:rPr>
+        <w:t xml:space="preserve">（MIO の言葉を1つ選び、本人に語ってもらい撮影）</w:t>
       </w:r>
     </w:p>
     <w:p>
@@ -3263,6 +3208,7 @@
           <w:rFonts w:ascii="Hiragino Sans" w:hAnsi="Hiragino Sans" w:cs="Hiragino Sans"/>
           <w:sz w:val="29"/>
           <w:sz-cs w:val="29"/>
+          <w:b/>
         </w:rPr>
         <w:t xml:space="preserve"/>
         <w:tab/>
@@ -3275,9 +3221,19 @@
           <w:rFonts w:ascii="Hiragino Sans" w:hAnsi="Hiragino Sans" w:cs="Hiragino Sans"/>
           <w:sz w:val="29"/>
           <w:sz-cs w:val="29"/>
-          <w:spacing w:val="0"/>
-        </w:rPr>
-        <w:t xml:space="preserve">MIO とのチェキ撮影（お一人1分）</w:t>
+          <w:b/>
+          <w:spacing w:val="0"/>
+        </w:rPr>
+        <w:t xml:space="preserve">限定名刺</w:t>
+      </w:r>
+      <w:r>
+        <w:rPr>
+          <w:rFonts w:ascii="Hiragino Sans" w:hAnsi="Hiragino Sans" w:cs="Hiragino Sans"/>
+          <w:sz w:val="29"/>
+          <w:sz-cs w:val="29"/>
+          <w:spacing w:val="0"/>
+        </w:rPr>
+        <w:t xml:space="preserve">（QRコードから限定シャンパンコール動画を視聴できます）</w:t>
       </w:r>
     </w:p>
     <w:p>
@@ -3306,16 +3262,34 @@
           <w:b/>
           <w:spacing w:val="0"/>
         </w:rPr>
-        <w:t xml:space="preserve">やしろ語録動画</w:t>
-      </w:r>
-      <w:r>
-        <w:rPr>
-          <w:rFonts w:ascii="Hiragino Sans" w:hAnsi="Hiragino Sans" w:cs="Hiragino Sans"/>
-          <w:sz w:val="29"/>
-          <w:sz-cs w:val="29"/>
-          <w:spacing w:val="0"/>
-        </w:rPr>
-        <w:t xml:space="preserve">（MIO の言葉を1つ選び、本人に語ってもらい撮影）</w:t>
+        <w:t xml:space="preserve">ノベルティ</w:t>
+      </w:r>
+      <w:r>
+        <w:rPr>
+          <w:rFonts w:ascii="Hiragino Sans" w:hAnsi="Hiragino Sans" w:cs="Hiragino Sans"/>
+          <w:sz w:val="29"/>
+          <w:sz-cs w:val="29"/>
+          <w:spacing w:val="0"/>
+        </w:rPr>
+        <w:t xml:space="preserve">（ノート・ペン）</w:t>
+      </w:r>
+      <w:r>
+        <w:rPr>
+          <w:rFonts w:ascii="Hiragino Sans" w:hAnsi="Hiragino Sans" w:cs="Hiragino Sans"/>
+          <w:sz w:val="29"/>
+          <w:sz-cs w:val="29"/>
+          <w:spacing w:val="0"/>
+        </w:rPr>
+        <w:t xml:space="preserve">〔デザインは調整中〕</w:t>
+      </w:r>
+      <w:r>
+        <w:rPr>
+          <w:rFonts w:ascii="Hiragino Sans" w:hAnsi="Hiragino Sans" w:cs="Hiragino Sans"/>
+          <w:sz w:val="29"/>
+          <w:sz-cs w:val="29"/>
+          <w:spacing w:val="0"/>
+        </w:rPr>
+        <w:t xml:space="preserve"/>
       </w:r>
     </w:p>
     <w:p>
@@ -3344,16 +3318,67 @@
           <w:b/>
           <w:spacing w:val="0"/>
         </w:rPr>
-        <w:t xml:space="preserve">限定名刺</w:t>
-      </w:r>
-      <w:r>
-        <w:rPr>
-          <w:rFonts w:ascii="Hiragino Sans" w:hAnsi="Hiragino Sans" w:cs="Hiragino Sans"/>
-          <w:sz w:val="29"/>
-          <w:sz-cs w:val="29"/>
-          <w:spacing w:val="0"/>
-        </w:rPr>
-        <w:t xml:space="preserve">（QRコードから限定シャンパンコール動画を視聴できます）</w:t>
+        <w:t xml:space="preserve">ファンミーティング</w:t>
+      </w:r>
+      <w:r>
+        <w:rPr>
+          <w:rFonts w:ascii="Hiragino Sans" w:hAnsi="Hiragino Sans" w:cs="Hiragino Sans"/>
+          <w:sz w:val="29"/>
+          <w:sz-cs w:val="29"/>
+          <w:spacing w:val="0"/>
+        </w:rPr>
+        <w:t xml:space="preserve">（2026年11月・ユグドラシル本店）</w:t>
+      </w:r>
+      <w:r>
+        <w:rPr>
+          <w:rFonts w:ascii="Hiragino Sans" w:hAnsi="Hiragino Sans" w:cs="Hiragino Sans"/>
+          <w:sz w:val="29"/>
+          <w:sz-cs w:val="29"/>
+          <w:spacing w:val="0"/>
+        </w:rPr>
+        <w:t xml:space="preserve">〔日程は調整中〕</w:t>
+      </w:r>
+      <w:r>
+        <w:rPr>
+          <w:rFonts w:ascii="Hiragino Sans" w:hAnsi="Hiragino Sans" w:cs="Hiragino Sans"/>
+          <w:sz w:val="29"/>
+          <w:sz-cs w:val="29"/>
+          <w:spacing w:val="0"/>
+        </w:rPr>
+        <w:t xml:space="preserve"/>
+      </w:r>
+    </w:p>
+    <w:p>
+      <w:pPr>
+        <w:spacing w:after="240"/>
+      </w:pPr>
+      <w:r>
+        <w:rPr>
+          <w:rFonts w:ascii="Hiragino Sans" w:hAnsi="Hiragino Sans" w:cs="Hiragino Sans"/>
+          <w:sz w:val="29"/>
+          <w:sz-cs w:val="29"/>
+          <w:spacing w:val="0"/>
+        </w:rPr>
+        <w:t xml:space="preserve">※ </w:t>
+      </w:r>
+      <w:r>
+        <w:rPr>
+          <w:rFonts w:ascii="Hiragino Sans" w:hAnsi="Hiragino Sans" w:cs="Hiragino Sans"/>
+          <w:sz w:val="29"/>
+          <w:sz-cs w:val="29"/>
+          <w:b/>
+          <w:spacing w:val="0"/>
+        </w:rPr>
+        <w:t xml:space="preserve">やしろ語録動画の撮影はこちらで行います</w:t>
+      </w:r>
+      <w:r>
+        <w:rPr>
+          <w:rFonts w:ascii="Hiragino Sans" w:hAnsi="Hiragino Sans" w:cs="Hiragino Sans"/>
+          <w:sz w:val="29"/>
+          <w:sz-cs w:val="29"/>
+          <w:spacing w:val="0"/>
+        </w:rPr>
+        <w:t xml:space="preserve"/>
       </w:r>
     </w:p>
     <w:p>
@@ -3366,7 +3391,6 @@
           <w:rFonts w:ascii="Hiragino Sans" w:hAnsi="Hiragino Sans" w:cs="Hiragino Sans"/>
           <w:sz w:val="29"/>
           <w:sz-cs w:val="29"/>
-          <w:b/>
         </w:rPr>
         <w:t xml:space="preserve"/>
         <w:tab/>
@@ -3379,70 +3403,9 @@
           <w:rFonts w:ascii="Hiragino Sans" w:hAnsi="Hiragino Sans" w:cs="Hiragino Sans"/>
           <w:sz w:val="29"/>
           <w:sz-cs w:val="29"/>
-          <w:b/>
-          <w:spacing w:val="0"/>
-        </w:rPr>
-        <w:t xml:space="preserve">ファンミーティング</w:t>
-      </w:r>
-      <w:r>
-        <w:rPr>
-          <w:rFonts w:ascii="Hiragino Sans" w:hAnsi="Hiragino Sans" w:cs="Hiragino Sans"/>
-          <w:sz w:val="29"/>
-          <w:sz-cs w:val="29"/>
-          <w:spacing w:val="0"/>
-        </w:rPr>
-        <w:t xml:space="preserve">（2026年11月・ユグドラシル本店）</w:t>
-      </w:r>
-      <w:r>
-        <w:rPr>
-          <w:rFonts w:ascii="Hiragino Sans" w:hAnsi="Hiragino Sans" w:cs="Hiragino Sans"/>
-          <w:sz w:val="29"/>
-          <w:sz-cs w:val="29"/>
-          <w:spacing w:val="0"/>
-        </w:rPr>
-        <w:t xml:space="preserve">〔日程は調整中〕</w:t>
-      </w:r>
-      <w:r>
-        <w:rPr>
-          <w:rFonts w:ascii="Hiragino Sans" w:hAnsi="Hiragino Sans" w:cs="Hiragino Sans"/>
-          <w:sz w:val="29"/>
-          <w:sz-cs w:val="29"/>
-          <w:spacing w:val="0"/>
-        </w:rPr>
-        <w:t xml:space="preserve"/>
-      </w:r>
-    </w:p>
-    <w:p>
-      <w:pPr>
-        <w:spacing w:after="240"/>
-      </w:pPr>
-      <w:r>
-        <w:rPr>
-          <w:rFonts w:ascii="Hiragino Sans" w:hAnsi="Hiragino Sans" w:cs="Hiragino Sans"/>
-          <w:sz w:val="29"/>
-          <w:sz-cs w:val="29"/>
-          <w:spacing w:val="0"/>
-        </w:rPr>
-        <w:t xml:space="preserve">※ </w:t>
-      </w:r>
-      <w:r>
-        <w:rPr>
-          <w:rFonts w:ascii="Hiragino Sans" w:hAnsi="Hiragino Sans" w:cs="Hiragino Sans"/>
-          <w:sz w:val="29"/>
-          <w:sz-cs w:val="29"/>
-          <w:b/>
-          <w:spacing w:val="0"/>
-        </w:rPr>
-        <w:t xml:space="preserve">やしろ語録動画の撮影はこちらで行います</w:t>
-      </w:r>
-      <w:r>
-        <w:rPr>
-          <w:rFonts w:ascii="Hiragino Sans" w:hAnsi="Hiragino Sans" w:cs="Hiragino Sans"/>
-          <w:sz w:val="29"/>
-          <w:sz-cs w:val="29"/>
-          <w:spacing w:val="0"/>
-        </w:rPr>
-        <w:t xml:space="preserve"/>
+          <w:spacing w:val="0"/>
+        </w:rPr>
+        <w:t xml:space="preserve">アコースティックライブ観覧</w:t>
       </w:r>
     </w:p>
     <w:p>
@@ -3455,6 +3418,7 @@
           <w:rFonts w:ascii="Hiragino Sans" w:hAnsi="Hiragino Sans" w:cs="Hiragino Sans"/>
           <w:sz w:val="29"/>
           <w:sz-cs w:val="29"/>
+          <w:b/>
         </w:rPr>
         <w:t xml:space="preserve"/>
         <w:tab/>
@@ -3467,9 +3431,43 @@
           <w:rFonts w:ascii="Hiragino Sans" w:hAnsi="Hiragino Sans" w:cs="Hiragino Sans"/>
           <w:sz w:val="29"/>
           <w:sz-cs w:val="29"/>
-          <w:spacing w:val="0"/>
-        </w:rPr>
-        <w:t xml:space="preserve">アコースティックライブ観覧</w:t>
+          <w:b/>
+          <w:spacing w:val="0"/>
+        </w:rPr>
+        <w:t xml:space="preserve">同伴の方を1名までお連れいただけます</w:t>
+      </w:r>
+      <w:r>
+        <w:rPr>
+          <w:rFonts w:ascii="Hiragino Sans" w:hAnsi="Hiragino Sans" w:cs="Hiragino Sans"/>
+          <w:sz w:val="29"/>
+          <w:sz-cs w:val="29"/>
+          <w:spacing w:val="0"/>
+        </w:rPr>
+        <w:t xml:space="preserve"/>
+      </w:r>
+    </w:p>
+    <w:p>
+      <w:pPr>
+        <w:spacing w:after="240"/>
+      </w:pPr>
+      <w:r>
+        <w:rPr>
+          <w:rFonts w:ascii="Hiragino Sans" w:hAnsi="Hiragino Sans" w:cs="Hiragino Sans"/>
+          <w:sz w:val="29"/>
+          <w:sz-cs w:val="29"/>
+          <w:b/>
+          <w:spacing w:val="0"/>
+        </w:rPr>
+        <w:t xml:space="preserve">※ チェキは先行入場のお時間（18:00〜）にすべて撮影します。そのあとは開演まで、お飲み物とともにご歓談いただけます。</w:t>
+      </w:r>
+      <w:r>
+        <w:rPr>
+          <w:rFonts w:ascii="Hiragino Sans" w:hAnsi="Hiragino Sans" w:cs="Hiragino Sans"/>
+          <w:sz w:val="29"/>
+          <w:sz-cs w:val="29"/>
+          <w:spacing w:val="0"/>
+        </w:rPr>
+        <w:t xml:space="preserve"/>
       </w:r>
     </w:p>
     <w:p>
@@ -3497,16 +3495,16 @@
           <w:b/>
           <w:spacing w:val="0"/>
         </w:rPr>
-        <w:t xml:space="preserve">【VVIP席】330,000円</w:t>
-      </w:r>
-      <w:r>
-        <w:rPr>
-          <w:rFonts w:ascii="Hiragino Sans" w:hAnsi="Hiragino Sans" w:cs="Hiragino Sans"/>
-          <w:sz w:val="29"/>
-          <w:sz-cs w:val="29"/>
-          <w:spacing w:val="0"/>
-        </w:rPr>
-        <w:t xml:space="preserve">〔10口／20:10〜21:10〕</w:t>
+        <w:t xml:space="preserve">【VVIP席】300,000円</w:t>
+      </w:r>
+      <w:r>
+        <w:rPr>
+          <w:rFonts w:ascii="Hiragino Sans" w:hAnsi="Hiragino Sans" w:cs="Hiragino Sans"/>
+          <w:sz w:val="29"/>
+          <w:sz-cs w:val="29"/>
+          <w:spacing w:val="0"/>
+        </w:rPr>
+        <w:t xml:space="preserve">〔10口／同伴1名まで可（計20名）／20:10〜21:10〕</w:t>
       </w:r>
       <w:r>
         <w:rPr>
@@ -3582,25 +3580,35 @@
           <w:b/>
           <w:spacing w:val="0"/>
         </w:rPr>
-        <w:t xml:space="preserve">シャンパンサービス</w:t>
-      </w:r>
-      <w:r>
-        <w:rPr>
-          <w:rFonts w:ascii="Hiragino Sans" w:hAnsi="Hiragino Sans" w:cs="Hiragino Sans"/>
-          <w:sz w:val="29"/>
-          <w:sz-cs w:val="29"/>
-          <w:spacing w:val="0"/>
-        </w:rPr>
-        <w:t xml:space="preserve">〔銘柄・本数は調整中〕</w:t>
-      </w:r>
-      <w:r>
-        <w:rPr>
-          <w:rFonts w:ascii="Hiragino Sans" w:hAnsi="Hiragino Sans" w:cs="Hiragino Sans"/>
-          <w:sz w:val="29"/>
-          <w:sz-cs w:val="29"/>
-          <w:spacing w:val="0"/>
-        </w:rPr>
-        <w:t xml:space="preserve"/>
+        <w:t xml:space="preserve">お好きなお席をお選びいただけます</w:t>
+      </w:r>
+      <w:r>
+        <w:rPr>
+          <w:rFonts w:ascii="Hiragino Sans" w:hAnsi="Hiragino Sans" w:cs="Hiragino Sans"/>
+          <w:sz w:val="29"/>
+          <w:sz-cs w:val="29"/>
+          <w:spacing w:val="0"/>
+        </w:rPr>
+        <w:t xml:space="preserve">（DJ席・V4・V1 より</w:t>
+      </w:r>
+      <w:r>
+        <w:rPr>
+          <w:rFonts w:ascii="Hiragino Sans" w:hAnsi="Hiragino Sans" w:cs="Hiragino Sans"/>
+          <w:sz w:val="29"/>
+          <w:sz-cs w:val="29"/>
+          <w:b/>
+          <w:spacing w:val="0"/>
+        </w:rPr>
+        <w:t xml:space="preserve">先着順</w:t>
+      </w:r>
+      <w:r>
+        <w:rPr>
+          <w:rFonts w:ascii="Hiragino Sans" w:hAnsi="Hiragino Sans" w:cs="Hiragino Sans"/>
+          <w:sz w:val="29"/>
+          <w:sz-cs w:val="29"/>
+          <w:spacing w:val="0"/>
+        </w:rPr>
+        <w:t xml:space="preserve">）</w:t>
       </w:r>
     </w:p>
     <w:p>
@@ -3613,6 +3621,7 @@
           <w:rFonts w:ascii="Hiragino Sans" w:hAnsi="Hiragino Sans" w:cs="Hiragino Sans"/>
           <w:sz w:val="29"/>
           <w:sz-cs w:val="29"/>
+          <w:b/>
         </w:rPr>
         <w:t xml:space="preserve"/>
         <w:tab/>
@@ -3625,9 +3634,28 @@
           <w:rFonts w:ascii="Hiragino Sans" w:hAnsi="Hiragino Sans" w:cs="Hiragino Sans"/>
           <w:sz w:val="29"/>
           <w:sz-cs w:val="29"/>
-          <w:spacing w:val="0"/>
-        </w:rPr>
-        <w:t xml:space="preserve">チェキ／写真／動画OK</w:t>
+          <w:b/>
+          <w:spacing w:val="0"/>
+        </w:rPr>
+        <w:t xml:space="preserve">シャンパンサービス</w:t>
+      </w:r>
+      <w:r>
+        <w:rPr>
+          <w:rFonts w:ascii="Hiragino Sans" w:hAnsi="Hiragino Sans" w:cs="Hiragino Sans"/>
+          <w:sz w:val="29"/>
+          <w:sz-cs w:val="29"/>
+          <w:spacing w:val="0"/>
+        </w:rPr>
+        <w:t xml:space="preserve">〔銘柄・本数は調整中〕</w:t>
+      </w:r>
+      <w:r>
+        <w:rPr>
+          <w:rFonts w:ascii="Hiragino Sans" w:hAnsi="Hiragino Sans" w:cs="Hiragino Sans"/>
+          <w:sz w:val="29"/>
+          <w:sz-cs w:val="29"/>
+          <w:spacing w:val="0"/>
+        </w:rPr>
+        <w:t xml:space="preserve"/>
       </w:r>
     </w:p>
     <w:p>
@@ -3640,7 +3668,6 @@
           <w:rFonts w:ascii="Hiragino Sans" w:hAnsi="Hiragino Sans" w:cs="Hiragino Sans"/>
           <w:sz w:val="29"/>
           <w:sz-cs w:val="29"/>
-          <w:b/>
         </w:rPr>
         <w:t xml:space="preserve"/>
         <w:tab/>
@@ -3653,19 +3680,9 @@
           <w:rFonts w:ascii="Hiragino Sans" w:hAnsi="Hiragino Sans" w:cs="Hiragino Sans"/>
           <w:sz w:val="29"/>
           <w:sz-cs w:val="29"/>
-          <w:b/>
-          <w:spacing w:val="0"/>
-        </w:rPr>
-        <w:t xml:space="preserve">限定名刺</w:t>
-      </w:r>
-      <w:r>
-        <w:rPr>
-          <w:rFonts w:ascii="Hiragino Sans" w:hAnsi="Hiragino Sans" w:cs="Hiragino Sans"/>
-          <w:sz w:val="29"/>
-          <w:sz-cs w:val="29"/>
-          <w:spacing w:val="0"/>
-        </w:rPr>
-        <w:t xml:space="preserve">（QRコードから限定シャンパンコール動画を視聴できます）</w:t>
+          <w:spacing w:val="0"/>
+        </w:rPr>
+        <w:t xml:space="preserve">チェキ／写真／動画OK</w:t>
       </w:r>
     </w:p>
     <w:p>
@@ -3678,6 +3695,7 @@
           <w:rFonts w:ascii="Hiragino Sans" w:hAnsi="Hiragino Sans" w:cs="Hiragino Sans"/>
           <w:sz w:val="29"/>
           <w:sz-cs w:val="29"/>
+          <w:b/>
         </w:rPr>
         <w:t xml:space="preserve"/>
         <w:tab/>
@@ -3690,9 +3708,19 @@
           <w:rFonts w:ascii="Hiragino Sans" w:hAnsi="Hiragino Sans" w:cs="Hiragino Sans"/>
           <w:sz w:val="29"/>
           <w:sz-cs w:val="29"/>
-          <w:spacing w:val="0"/>
-        </w:rPr>
-        <w:t xml:space="preserve">アコースティックライブ観覧</w:t>
+          <w:b/>
+          <w:spacing w:val="0"/>
+        </w:rPr>
+        <w:t xml:space="preserve">限定名刺</w:t>
+      </w:r>
+      <w:r>
+        <w:rPr>
+          <w:rFonts w:ascii="Hiragino Sans" w:hAnsi="Hiragino Sans" w:cs="Hiragino Sans"/>
+          <w:sz w:val="29"/>
+          <w:sz-cs w:val="29"/>
+          <w:spacing w:val="0"/>
+        </w:rPr>
+        <w:t xml:space="preserve">（QRコードから限定シャンパンコール動画を視聴できます）</w:t>
       </w:r>
     </w:p>
     <w:p>
@@ -3721,31 +3749,25 @@
           <w:b/>
           <w:spacing w:val="0"/>
         </w:rPr>
-        <w:t xml:space="preserve">同伴の方を1名までお連れいただけます</w:t>
-      </w:r>
-      <w:r>
-        <w:rPr>
-          <w:rFonts w:ascii="Hiragino Sans" w:hAnsi="Hiragino Sans" w:cs="Hiragino Sans"/>
-          <w:sz w:val="29"/>
-          <w:sz-cs w:val="29"/>
-          <w:spacing w:val="0"/>
-        </w:rPr>
-        <w:t xml:space="preserve"/>
-      </w:r>
-    </w:p>
-    <w:p>
-      <w:pPr>
-        <w:spacing w:after="240"/>
-      </w:pPr>
-      <w:r>
-        <w:rPr>
-          <w:rFonts w:ascii="Hiragino Sans" w:hAnsi="Hiragino Sans" w:cs="Hiragino Sans"/>
-          <w:sz w:val="29"/>
-          <w:sz-cs w:val="29"/>
-          <w:b/>
-          <w:spacing w:val="0"/>
-        </w:rPr>
-        <w:t xml:space="preserve">⭐️ VVIP席だけの特典</w:t>
+        <w:t xml:space="preserve">ノベルティ</w:t>
+      </w:r>
+      <w:r>
+        <w:rPr>
+          <w:rFonts w:ascii="Hiragino Sans" w:hAnsi="Hiragino Sans" w:cs="Hiragino Sans"/>
+          <w:sz w:val="29"/>
+          <w:sz-cs w:val="29"/>
+          <w:spacing w:val="0"/>
+        </w:rPr>
+        <w:t xml:space="preserve">（ノート・ペン・トートバッグ・キーホルダーほか）</w:t>
+      </w:r>
+      <w:r>
+        <w:rPr>
+          <w:rFonts w:ascii="Hiragino Sans" w:hAnsi="Hiragino Sans" w:cs="Hiragino Sans"/>
+          <w:sz w:val="29"/>
+          <w:sz-cs w:val="29"/>
+          <w:spacing w:val="0"/>
+        </w:rPr>
+        <w:t xml:space="preserve">〔内容・デザインは調整中〕</w:t>
       </w:r>
       <w:r>
         <w:rPr>
@@ -3767,7 +3789,6 @@
           <w:rFonts w:ascii="Hiragino Sans" w:hAnsi="Hiragino Sans" w:cs="Hiragino Sans"/>
           <w:sz w:val="29"/>
           <w:sz-cs w:val="29"/>
-          <w:b/>
         </w:rPr>
         <w:t xml:space="preserve"/>
         <w:tab/>
@@ -3780,102 +3801,9 @@
           <w:rFonts w:ascii="Hiragino Sans" w:hAnsi="Hiragino Sans" w:cs="Hiragino Sans"/>
           <w:sz w:val="29"/>
           <w:sz-cs w:val="29"/>
-          <w:b/>
-          <w:spacing w:val="0"/>
-        </w:rPr>
-        <w:t xml:space="preserve">当日、MIO と直接お話しいただけるのは VVIP席のみです。</w:t>
-      </w:r>
-      <w:r>
-        <w:rPr>
-          <w:rFonts w:ascii="Hiragino Sans" w:hAnsi="Hiragino Sans" w:cs="Hiragino Sans"/>
-          <w:sz w:val="29"/>
-          <w:sz-cs w:val="29"/>
-          <w:spacing w:val="0"/>
-        </w:rPr>
-        <w:t xml:space="preserve"/>
-      </w:r>
-    </w:p>
-    <w:p>
-      <w:pPr/>
-      <w:r>
-        <w:rPr>
-          <w:rFonts w:ascii="Hiragino Sans" w:hAnsi="Hiragino Sans" w:cs="Hiragino Sans"/>
-          <w:sz w:val="29"/>
-          <w:sz-cs w:val="29"/>
-          <w:spacing w:val="0"/>
-          <w:color w:val="6D6D6D"/>
-        </w:rPr>
-        <w:t xml:space="preserve"/>
-      </w:r>
-    </w:p>
-    <w:p>
-      <w:pPr>
-        <w:spacing w:after="240"/>
-      </w:pPr>
-      <w:r>
-        <w:rPr>
-          <w:rFonts w:ascii="Hiragino Sans" w:hAnsi="Hiragino Sans" w:cs="Hiragino Sans"/>
-          <w:sz w:val="29"/>
-          <w:sz-cs w:val="29"/>
-          <w:b/>
-          <w:spacing w:val="0"/>
-        </w:rPr>
-        <w:t xml:space="preserve">■ 会場に来られない方へ</w:t>
-      </w:r>
-      <w:r>
-        <w:rPr>
-          <w:rFonts w:ascii="Hiragino Sans" w:hAnsi="Hiragino Sans" w:cs="Hiragino Sans"/>
-          <w:sz w:val="29"/>
-          <w:sz-cs w:val="29"/>
-          <w:spacing w:val="0"/>
-        </w:rPr>
-        <w:t xml:space="preserve"/>
-      </w:r>
-    </w:p>
-    <w:p>
-      <w:pPr/>
-      <w:r>
-        <w:rPr>
-          <w:rFonts w:ascii="Hiragino Sans" w:hAnsi="Hiragino Sans" w:cs="Hiragino Sans"/>
-          <w:sz w:val="29"/>
-          <w:sz-cs w:val="29"/>
-          <w:spacing w:val="0"/>
-          <w:color w:val="6D6D6D"/>
-        </w:rPr>
-        <w:t xml:space="preserve"/>
-      </w:r>
-    </w:p>
-    <w:p>
-      <w:pPr>
-        <w:spacing w:after="240"/>
-      </w:pPr>
-      <w:r>
-        <w:rPr>
-          <w:rFonts w:ascii="Hiragino Sans" w:hAnsi="Hiragino Sans" w:cs="Hiragino Sans"/>
-          <w:sz w:val="29"/>
-          <w:sz-cs w:val="29"/>
-          <w:b/>
-          <w:spacing w:val="0"/>
-        </w:rPr>
-        <w:t xml:space="preserve">【シンプル応援】5,000円</w:t>
-      </w:r>
-      <w:r>
-        <w:rPr>
-          <w:rFonts w:ascii="Hiragino Sans" w:hAnsi="Hiragino Sans" w:cs="Hiragino Sans"/>
-          <w:sz w:val="29"/>
-          <w:sz-cs w:val="29"/>
-          <w:spacing w:val="0"/>
-        </w:rPr>
-        <w:t xml:space="preserve">〔無制限〕</w:t>
-      </w:r>
-      <w:r>
-        <w:rPr>
-          <w:rFonts w:ascii="Hiragino Sans" w:hAnsi="Hiragino Sans" w:cs="Hiragino Sans"/>
-          <w:sz w:val="29"/>
-          <w:sz-cs w:val="29"/>
-          <w:spacing w:val="0"/>
-        </w:rPr>
-        <w:t xml:space="preserve"/>
+          <w:spacing w:val="0"/>
+        </w:rPr>
+        <w:t xml:space="preserve">アコースティックライブ観覧</w:t>
       </w:r>
     </w:p>
     <w:p>
@@ -3904,6 +3832,213 @@
           <w:b/>
           <w:spacing w:val="0"/>
         </w:rPr>
+        <w:t xml:space="preserve">同伴の方を1名までお連れいただけます</w:t>
+      </w:r>
+      <w:r>
+        <w:rPr>
+          <w:rFonts w:ascii="Hiragino Sans" w:hAnsi="Hiragino Sans" w:cs="Hiragino Sans"/>
+          <w:sz w:val="29"/>
+          <w:sz-cs w:val="29"/>
+          <w:spacing w:val="0"/>
+        </w:rPr>
+        <w:t xml:space="preserve"/>
+      </w:r>
+    </w:p>
+    <w:p>
+      <w:pPr>
+        <w:spacing w:after="240"/>
+      </w:pPr>
+      <w:r>
+        <w:rPr>
+          <w:rFonts w:ascii="Hiragino Sans" w:hAnsi="Hiragino Sans" w:cs="Hiragino Sans"/>
+          <w:sz w:val="29"/>
+          <w:sz-cs w:val="29"/>
+          <w:b/>
+          <w:spacing w:val="0"/>
+        </w:rPr>
+        <w:t xml:space="preserve">※ 先行入場（17:45〜）もご利用いただけますが、必須ではありません。開演までのお好きなお時間にお越しください。</w:t>
+      </w:r>
+      <w:r>
+        <w:rPr>
+          <w:rFonts w:ascii="Hiragino Sans" w:hAnsi="Hiragino Sans" w:cs="Hiragino Sans"/>
+          <w:sz w:val="29"/>
+          <w:sz-cs w:val="29"/>
+          <w:spacing w:val="0"/>
+        </w:rPr>
+        <w:t xml:space="preserve"/>
+      </w:r>
+    </w:p>
+    <w:p>
+      <w:pPr>
+        <w:spacing w:after="240"/>
+      </w:pPr>
+      <w:r>
+        <w:rPr>
+          <w:rFonts w:ascii="Hiragino Sans" w:hAnsi="Hiragino Sans" w:cs="Hiragino Sans"/>
+          <w:sz w:val="29"/>
+          <w:sz-cs w:val="29"/>
+          <w:b/>
+          <w:spacing w:val="0"/>
+        </w:rPr>
+        <w:t xml:space="preserve">⭐️ VVIP席だけの特典</w:t>
+      </w:r>
+      <w:r>
+        <w:rPr>
+          <w:rFonts w:ascii="Hiragino Sans" w:hAnsi="Hiragino Sans" w:cs="Hiragino Sans"/>
+          <w:sz w:val="29"/>
+          <w:sz-cs w:val="29"/>
+          <w:spacing w:val="0"/>
+        </w:rPr>
+        <w:t xml:space="preserve"/>
+      </w:r>
+    </w:p>
+    <w:p>
+      <w:pPr>
+        <w:ind w:left="720" w:first-line="-720"/>
+        <w:spacing w:after="106"/>
+      </w:pPr>
+      <w:r>
+        <w:rPr>
+          <w:rFonts w:ascii="Hiragino Sans" w:hAnsi="Hiragino Sans" w:cs="Hiragino Sans"/>
+          <w:sz w:val="29"/>
+          <w:sz-cs w:val="29"/>
+          <w:b/>
+        </w:rPr>
+        <w:t xml:space="preserve"/>
+        <w:tab/>
+        <w:t xml:space="preserve">•</w:t>
+        <w:tab/>
+        <w:t xml:space="preserve"/>
+      </w:r>
+      <w:r>
+        <w:rPr>
+          <w:rFonts w:ascii="Hiragino Sans" w:hAnsi="Hiragino Sans" w:cs="Hiragino Sans"/>
+          <w:sz w:val="29"/>
+          <w:sz-cs w:val="29"/>
+          <w:b/>
+          <w:spacing w:val="0"/>
+        </w:rPr>
+        <w:t xml:space="preserve">当日、MIO と直接お話しいただけるのは VVIP席のみです。</w:t>
+      </w:r>
+      <w:r>
+        <w:rPr>
+          <w:rFonts w:ascii="Hiragino Sans" w:hAnsi="Hiragino Sans" w:cs="Hiragino Sans"/>
+          <w:sz w:val="29"/>
+          <w:sz-cs w:val="29"/>
+          <w:spacing w:val="0"/>
+        </w:rPr>
+        <w:t xml:space="preserve"/>
+      </w:r>
+    </w:p>
+    <w:p>
+      <w:pPr/>
+      <w:r>
+        <w:rPr>
+          <w:rFonts w:ascii="Hiragino Sans" w:hAnsi="Hiragino Sans" w:cs="Hiragino Sans"/>
+          <w:sz w:val="29"/>
+          <w:sz-cs w:val="29"/>
+          <w:spacing w:val="0"/>
+          <w:color w:val="6D6D6D"/>
+        </w:rPr>
+        <w:t xml:space="preserve"/>
+      </w:r>
+    </w:p>
+    <w:p>
+      <w:pPr>
+        <w:spacing w:after="240"/>
+      </w:pPr>
+      <w:r>
+        <w:rPr>
+          <w:rFonts w:ascii="Hiragino Sans" w:hAnsi="Hiragino Sans" w:cs="Hiragino Sans"/>
+          <w:sz w:val="29"/>
+          <w:sz-cs w:val="29"/>
+          <w:b/>
+          <w:spacing w:val="0"/>
+        </w:rPr>
+        <w:t xml:space="preserve">■ 会場に来られない方へ</w:t>
+      </w:r>
+      <w:r>
+        <w:rPr>
+          <w:rFonts w:ascii="Hiragino Sans" w:hAnsi="Hiragino Sans" w:cs="Hiragino Sans"/>
+          <w:sz w:val="29"/>
+          <w:sz-cs w:val="29"/>
+          <w:spacing w:val="0"/>
+        </w:rPr>
+        <w:t xml:space="preserve"/>
+      </w:r>
+    </w:p>
+    <w:p>
+      <w:pPr/>
+      <w:r>
+        <w:rPr>
+          <w:rFonts w:ascii="Hiragino Sans" w:hAnsi="Hiragino Sans" w:cs="Hiragino Sans"/>
+          <w:sz w:val="29"/>
+          <w:sz-cs w:val="29"/>
+          <w:spacing w:val="0"/>
+          <w:color w:val="6D6D6D"/>
+        </w:rPr>
+        <w:t xml:space="preserve"/>
+      </w:r>
+    </w:p>
+    <w:p>
+      <w:pPr>
+        <w:spacing w:after="240"/>
+      </w:pPr>
+      <w:r>
+        <w:rPr>
+          <w:rFonts w:ascii="Hiragino Sans" w:hAnsi="Hiragino Sans" w:cs="Hiragino Sans"/>
+          <w:sz w:val="29"/>
+          <w:sz-cs w:val="29"/>
+          <w:b/>
+          <w:spacing w:val="0"/>
+        </w:rPr>
+        <w:t xml:space="preserve">【シンプル応援】5,000円</w:t>
+      </w:r>
+      <w:r>
+        <w:rPr>
+          <w:rFonts w:ascii="Hiragino Sans" w:hAnsi="Hiragino Sans" w:cs="Hiragino Sans"/>
+          <w:sz w:val="29"/>
+          <w:sz-cs w:val="29"/>
+          <w:spacing w:val="0"/>
+        </w:rPr>
+        <w:t xml:space="preserve">〔無制限〕</w:t>
+      </w:r>
+      <w:r>
+        <w:rPr>
+          <w:rFonts w:ascii="Hiragino Sans" w:hAnsi="Hiragino Sans" w:cs="Hiragino Sans"/>
+          <w:sz w:val="29"/>
+          <w:sz-cs w:val="29"/>
+          <w:spacing w:val="0"/>
+        </w:rPr>
+        <w:t xml:space="preserve"/>
+      </w:r>
+    </w:p>
+    <w:p>
+      <w:pPr>
+        <w:ind w:left="720" w:first-line="-720"/>
+        <w:spacing w:after="106"/>
+      </w:pPr>
+      <w:r>
+        <w:rPr>
+          <w:rFonts w:ascii="Hiragino Sans" w:hAnsi="Hiragino Sans" w:cs="Hiragino Sans"/>
+          <w:sz w:val="29"/>
+          <w:sz-cs w:val="29"/>
+          <w:b/>
+        </w:rPr>
+        <w:t xml:space="preserve"/>
+        <w:tab/>
+        <w:t xml:space="preserve">•</w:t>
+        <w:tab/>
+        <w:t xml:space="preserve"/>
+      </w:r>
+      <w:r>
+        <w:rPr>
+          <w:rFonts w:ascii="Hiragino Sans" w:hAnsi="Hiragino Sans" w:cs="Hiragino Sans"/>
+          <w:sz w:val="29"/>
+          <w:sz-cs w:val="29"/>
+          <w:b/>
+          <w:spacing w:val="0"/>
+        </w:rPr>
         <w:t xml:space="preserve">限定名刺</w:t>
       </w:r>
       <w:r>
@@ -3941,7 +4076,7 @@
           <w:b/>
           <w:spacing w:val="0"/>
         </w:rPr>
-        <w:t xml:space="preserve">■ ファンミーティングについて最前列席・MIOタイム</w:t>
+        <w:t xml:space="preserve">■ ファンミーティングについてS席・MIOタイム</w:t>
       </w:r>
       <w:r>
         <w:rPr>
@@ -4165,7 +4300,7 @@
           <w:sz-cs w:val="29"/>
           <w:spacing w:val="0"/>
         </w:rPr>
-        <w:t xml:space="preserve">　昼：WRAPPING THE EARTH TOKYO 2026 ／ 夜：VALHALLA CHARITY LIVE（渋谷・19:25 開演）</w:t>
+        <w:t xml:space="preserve">　昼：WRAPPING THE EARTH TOKYO 2026 ／ 夜：VALHALLA CHARITY LIVE（渋谷・19:30 開演）</w:t>
       </w:r>
     </w:p>
     <w:p>
@@ -4279,7 +4414,7 @@
           <w:sz-cs w:val="29"/>
           <w:spacing w:val="0"/>
         </w:rPr>
-        <w:t xml:space="preserve">　ファンミーティング実施（最前列席・MIOタイム／ユグドラシル本店）</w:t>
+        <w:t xml:space="preserve">　ファンミーティング実施（S席・MIOタイム／ユグドラシル本店）</w:t>
       </w:r>
     </w:p>
     <w:p>

</xml_diff>

<commit_message>
charity: the 50,000 tier is the standing front row
It was never a seated block, so it sits alongside the 100 standing
ライブ席 rather than folding into S席: 30 people at the front, 100 behind,
130 standing in all, with the 50 seats above that. The room reaches 180,
not 150, and sold out that is 805万.

The 2026-09-07 seat reconciliation is gone -- the plan section that came
back on the 8th supersedes it, and leaving both meant two different
answers to the same question.

Co-Authored-By: Claude Opus 5 <noreply@anthropic.com>
</commit_message>
<xml_diff>
--- a/docs/campfire-body-edit.docx
+++ b/docs/campfire-body-edit.docx
@@ -3001,7 +3001,7 @@
           <w:sz-cs w:val="29"/>
           <w:spacing w:val="0"/>
         </w:rPr>
-        <w:t xml:space="preserve">〔100名〕</w:t>
+        <w:t xml:space="preserve">〔100名／スタンディング〕</w:t>
       </w:r>
       <w:r>
         <w:rPr>
@@ -3065,16 +3065,16 @@
           <w:b/>
           <w:spacing w:val="0"/>
         </w:rPr>
-        <w:t xml:space="preserve">【S席・MIOタイム】150,000円</w:t>
-      </w:r>
-      <w:r>
-        <w:rPr>
-          <w:rFonts w:ascii="Hiragino Sans" w:hAnsi="Hiragino Sans" w:cs="Hiragino Sans"/>
-          <w:sz w:val="29"/>
-          <w:sz-cs w:val="29"/>
-          <w:spacing w:val="0"/>
-        </w:rPr>
-        <w:t xml:space="preserve">〔15口／同伴1名まで可（計30名）／17:45 先行入場〕</w:t>
+        <w:t xml:space="preserve">【最前列席】50,000円</w:t>
+      </w:r>
+      <w:r>
+        <w:rPr>
+          <w:rFonts w:ascii="Hiragino Sans" w:hAnsi="Hiragino Sans" w:cs="Hiragino Sans"/>
+          <w:sz w:val="29"/>
+          <w:sz-cs w:val="29"/>
+          <w:spacing w:val="0"/>
+        </w:rPr>
+        <w:t xml:space="preserve">〔30名／スタンディング最前列〕</w:t>
       </w:r>
       <w:r>
         <w:rPr>
@@ -3112,25 +3112,16 @@
           <w:b/>
           <w:spacing w:val="0"/>
         </w:rPr>
-        <w:t xml:space="preserve">お席をご用意します</w:t>
-      </w:r>
-      <w:r>
-        <w:rPr>
-          <w:rFonts w:ascii="Hiragino Sans" w:hAnsi="Hiragino Sans" w:cs="Hiragino Sans"/>
-          <w:sz w:val="29"/>
-          <w:sz-cs w:val="29"/>
-          <w:spacing w:val="0"/>
-        </w:rPr>
-        <w:t xml:space="preserve">〔S席区画〕</w:t>
-      </w:r>
-      <w:r>
-        <w:rPr>
-          <w:rFonts w:ascii="Hiragino Sans" w:hAnsi="Hiragino Sans" w:cs="Hiragino Sans"/>
-          <w:sz w:val="29"/>
-          <w:sz-cs w:val="29"/>
-          <w:spacing w:val="0"/>
-        </w:rPr>
-        <w:t xml:space="preserve"/>
+        <w:t xml:space="preserve">最前列でご覧いただけます</w:t>
+      </w:r>
+      <w:r>
+        <w:rPr>
+          <w:rFonts w:ascii="Hiragino Sans" w:hAnsi="Hiragino Sans" w:cs="Hiragino Sans"/>
+          <w:sz w:val="29"/>
+          <w:sz-cs w:val="29"/>
+          <w:spacing w:val="0"/>
+        </w:rPr>
+        <w:t xml:space="preserve">（スタンディング）</w:t>
       </w:r>
     </w:p>
     <w:p>
@@ -3157,7 +3148,7 @@
           <w:sz-cs w:val="29"/>
           <w:spacing w:val="0"/>
         </w:rPr>
-        <w:t xml:space="preserve">MIO とのチェキ撮影（お一人1分）</w:t>
+        <w:t xml:space="preserve">アコースティックライブ観覧</w:t>
       </w:r>
     </w:p>
     <w:p>
@@ -3186,16 +3177,80 @@
           <w:b/>
           <w:spacing w:val="0"/>
         </w:rPr>
-        <w:t xml:space="preserve">やしろ語録動画</w:t>
-      </w:r>
-      <w:r>
-        <w:rPr>
-          <w:rFonts w:ascii="Hiragino Sans" w:hAnsi="Hiragino Sans" w:cs="Hiragino Sans"/>
-          <w:sz w:val="29"/>
-          <w:sz-cs w:val="29"/>
-          <w:spacing w:val="0"/>
-        </w:rPr>
-        <w:t xml:space="preserve">（MIO の言葉を1つ選び、本人に語ってもらい撮影）</w:t>
+        <w:t xml:space="preserve">ファンミーティング</w:t>
+      </w:r>
+      <w:r>
+        <w:rPr>
+          <w:rFonts w:ascii="Hiragino Sans" w:hAnsi="Hiragino Sans" w:cs="Hiragino Sans"/>
+          <w:sz w:val="29"/>
+          <w:sz-cs w:val="29"/>
+          <w:spacing w:val="0"/>
+        </w:rPr>
+        <w:t xml:space="preserve">（2026年11月・ユグドラシル本店）</w:t>
+      </w:r>
+      <w:r>
+        <w:rPr>
+          <w:rFonts w:ascii="Hiragino Sans" w:hAnsi="Hiragino Sans" w:cs="Hiragino Sans"/>
+          <w:sz w:val="29"/>
+          <w:sz-cs w:val="29"/>
+          <w:spacing w:val="0"/>
+        </w:rPr>
+        <w:t xml:space="preserve">〔日程は調整中〕</w:t>
+      </w:r>
+      <w:r>
+        <w:rPr>
+          <w:rFonts w:ascii="Hiragino Sans" w:hAnsi="Hiragino Sans" w:cs="Hiragino Sans"/>
+          <w:sz w:val="29"/>
+          <w:sz-cs w:val="29"/>
+          <w:spacing w:val="0"/>
+        </w:rPr>
+        <w:t xml:space="preserve"/>
+      </w:r>
+    </w:p>
+    <w:p>
+      <w:pPr/>
+      <w:r>
+        <w:rPr>
+          <w:rFonts w:ascii="Hiragino Sans" w:hAnsi="Hiragino Sans" w:cs="Hiragino Sans"/>
+          <w:sz w:val="29"/>
+          <w:sz-cs w:val="29"/>
+          <w:spacing w:val="0"/>
+          <w:color w:val="6D6D6D"/>
+        </w:rPr>
+        <w:t xml:space="preserve"/>
+      </w:r>
+    </w:p>
+    <w:p>
+      <w:pPr>
+        <w:spacing w:after="240"/>
+      </w:pPr>
+      <w:r>
+        <w:rPr>
+          <w:rFonts w:ascii="Hiragino Sans" w:hAnsi="Hiragino Sans" w:cs="Hiragino Sans"/>
+          <w:sz w:val="29"/>
+          <w:sz-cs w:val="29"/>
+          <w:b/>
+          <w:spacing w:val="0"/>
+        </w:rPr>
+        <w:t xml:space="preserve">【S席・MIOタイム】150,000円</w:t>
+      </w:r>
+      <w:r>
+        <w:rPr>
+          <w:rFonts w:ascii="Hiragino Sans" w:hAnsi="Hiragino Sans" w:cs="Hiragino Sans"/>
+          <w:sz w:val="29"/>
+          <w:sz-cs w:val="29"/>
+          <w:spacing w:val="0"/>
+        </w:rPr>
+        <w:t xml:space="preserve">〔15口／同伴1名まで可（計30名）／17:45 先行入場〕</w:t>
+      </w:r>
+      <w:r>
+        <w:rPr>
+          <w:rFonts w:ascii="Hiragino Sans" w:hAnsi="Hiragino Sans" w:cs="Hiragino Sans"/>
+          <w:sz w:val="29"/>
+          <w:sz-cs w:val="29"/>
+          <w:spacing w:val="0"/>
+        </w:rPr>
+        <w:t xml:space="preserve"/>
       </w:r>
     </w:p>
     <w:p>
@@ -3224,16 +3279,25 @@
           <w:b/>
           <w:spacing w:val="0"/>
         </w:rPr>
-        <w:t xml:space="preserve">限定名刺</w:t>
-      </w:r>
-      <w:r>
-        <w:rPr>
-          <w:rFonts w:ascii="Hiragino Sans" w:hAnsi="Hiragino Sans" w:cs="Hiragino Sans"/>
-          <w:sz w:val="29"/>
-          <w:sz-cs w:val="29"/>
-          <w:spacing w:val="0"/>
-        </w:rPr>
-        <w:t xml:space="preserve">（QRコードから限定シャンパンコール動画を視聴できます）</w:t>
+        <w:t xml:space="preserve">お席をご用意します</w:t>
+      </w:r>
+      <w:r>
+        <w:rPr>
+          <w:rFonts w:ascii="Hiragino Sans" w:hAnsi="Hiragino Sans" w:cs="Hiragino Sans"/>
+          <w:sz w:val="29"/>
+          <w:sz-cs w:val="29"/>
+          <w:spacing w:val="0"/>
+        </w:rPr>
+        <w:t xml:space="preserve">〔S席区画〕</w:t>
+      </w:r>
+      <w:r>
+        <w:rPr>
+          <w:rFonts w:ascii="Hiragino Sans" w:hAnsi="Hiragino Sans" w:cs="Hiragino Sans"/>
+          <w:sz w:val="29"/>
+          <w:sz-cs w:val="29"/>
+          <w:spacing w:val="0"/>
+        </w:rPr>
+        <w:t xml:space="preserve"/>
       </w:r>
     </w:p>
     <w:p>
@@ -3246,7 +3310,6 @@
           <w:rFonts w:ascii="Hiragino Sans" w:hAnsi="Hiragino Sans" w:cs="Hiragino Sans"/>
           <w:sz w:val="29"/>
           <w:sz-cs w:val="29"/>
-          <w:b/>
         </w:rPr>
         <w:t xml:space="preserve"/>
         <w:tab/>
@@ -3259,37 +3322,9 @@
           <w:rFonts w:ascii="Hiragino Sans" w:hAnsi="Hiragino Sans" w:cs="Hiragino Sans"/>
           <w:sz w:val="29"/>
           <w:sz-cs w:val="29"/>
-          <w:b/>
-          <w:spacing w:val="0"/>
-        </w:rPr>
-        <w:t xml:space="preserve">ノベルティ</w:t>
-      </w:r>
-      <w:r>
-        <w:rPr>
-          <w:rFonts w:ascii="Hiragino Sans" w:hAnsi="Hiragino Sans" w:cs="Hiragino Sans"/>
-          <w:sz w:val="29"/>
-          <w:sz-cs w:val="29"/>
-          <w:spacing w:val="0"/>
-        </w:rPr>
-        <w:t xml:space="preserve">（ノート・ペン）</w:t>
-      </w:r>
-      <w:r>
-        <w:rPr>
-          <w:rFonts w:ascii="Hiragino Sans" w:hAnsi="Hiragino Sans" w:cs="Hiragino Sans"/>
-          <w:sz w:val="29"/>
-          <w:sz-cs w:val="29"/>
-          <w:spacing w:val="0"/>
-        </w:rPr>
-        <w:t xml:space="preserve">〔デザインは調整中〕</w:t>
-      </w:r>
-      <w:r>
-        <w:rPr>
-          <w:rFonts w:ascii="Hiragino Sans" w:hAnsi="Hiragino Sans" w:cs="Hiragino Sans"/>
-          <w:sz w:val="29"/>
-          <w:sz-cs w:val="29"/>
-          <w:spacing w:val="0"/>
-        </w:rPr>
-        <w:t xml:space="preserve"/>
+          <w:spacing w:val="0"/>
+        </w:rPr>
+        <w:t xml:space="preserve">MIO とのチェキ撮影（お一人1分）</w:t>
       </w:r>
     </w:p>
     <w:p>
@@ -3318,67 +3353,16 @@
           <w:b/>
           <w:spacing w:val="0"/>
         </w:rPr>
-        <w:t xml:space="preserve">ファンミーティング</w:t>
-      </w:r>
-      <w:r>
-        <w:rPr>
-          <w:rFonts w:ascii="Hiragino Sans" w:hAnsi="Hiragino Sans" w:cs="Hiragino Sans"/>
-          <w:sz w:val="29"/>
-          <w:sz-cs w:val="29"/>
-          <w:spacing w:val="0"/>
-        </w:rPr>
-        <w:t xml:space="preserve">（2026年11月・ユグドラシル本店）</w:t>
-      </w:r>
-      <w:r>
-        <w:rPr>
-          <w:rFonts w:ascii="Hiragino Sans" w:hAnsi="Hiragino Sans" w:cs="Hiragino Sans"/>
-          <w:sz w:val="29"/>
-          <w:sz-cs w:val="29"/>
-          <w:spacing w:val="0"/>
-        </w:rPr>
-        <w:t xml:space="preserve">〔日程は調整中〕</w:t>
-      </w:r>
-      <w:r>
-        <w:rPr>
-          <w:rFonts w:ascii="Hiragino Sans" w:hAnsi="Hiragino Sans" w:cs="Hiragino Sans"/>
-          <w:sz w:val="29"/>
-          <w:sz-cs w:val="29"/>
-          <w:spacing w:val="0"/>
-        </w:rPr>
-        <w:t xml:space="preserve"/>
-      </w:r>
-    </w:p>
-    <w:p>
-      <w:pPr>
-        <w:spacing w:after="240"/>
-      </w:pPr>
-      <w:r>
-        <w:rPr>
-          <w:rFonts w:ascii="Hiragino Sans" w:hAnsi="Hiragino Sans" w:cs="Hiragino Sans"/>
-          <w:sz w:val="29"/>
-          <w:sz-cs w:val="29"/>
-          <w:spacing w:val="0"/>
-        </w:rPr>
-        <w:t xml:space="preserve">※ </w:t>
-      </w:r>
-      <w:r>
-        <w:rPr>
-          <w:rFonts w:ascii="Hiragino Sans" w:hAnsi="Hiragino Sans" w:cs="Hiragino Sans"/>
-          <w:sz w:val="29"/>
-          <w:sz-cs w:val="29"/>
-          <w:b/>
-          <w:spacing w:val="0"/>
-        </w:rPr>
-        <w:t xml:space="preserve">やしろ語録動画の撮影はこちらで行います</w:t>
-      </w:r>
-      <w:r>
-        <w:rPr>
-          <w:rFonts w:ascii="Hiragino Sans" w:hAnsi="Hiragino Sans" w:cs="Hiragino Sans"/>
-          <w:sz w:val="29"/>
-          <w:sz-cs w:val="29"/>
-          <w:spacing w:val="0"/>
-        </w:rPr>
-        <w:t xml:space="preserve"/>
+        <w:t xml:space="preserve">やしろ語録動画</w:t>
+      </w:r>
+      <w:r>
+        <w:rPr>
+          <w:rFonts w:ascii="Hiragino Sans" w:hAnsi="Hiragino Sans" w:cs="Hiragino Sans"/>
+          <w:sz w:val="29"/>
+          <w:sz-cs w:val="29"/>
+          <w:spacing w:val="0"/>
+        </w:rPr>
+        <w:t xml:space="preserve">（MIO の言葉を1つ選び、本人に語ってもらい撮影）</w:t>
       </w:r>
     </w:p>
     <w:p>
@@ -3391,6 +3375,7 @@
           <w:rFonts w:ascii="Hiragino Sans" w:hAnsi="Hiragino Sans" w:cs="Hiragino Sans"/>
           <w:sz w:val="29"/>
           <w:sz-cs w:val="29"/>
+          <w:b/>
         </w:rPr>
         <w:t xml:space="preserve"/>
         <w:tab/>
@@ -3403,9 +3388,19 @@
           <w:rFonts w:ascii="Hiragino Sans" w:hAnsi="Hiragino Sans" w:cs="Hiragino Sans"/>
           <w:sz w:val="29"/>
           <w:sz-cs w:val="29"/>
-          <w:spacing w:val="0"/>
-        </w:rPr>
-        <w:t xml:space="preserve">アコースティックライブ観覧</w:t>
+          <w:b/>
+          <w:spacing w:val="0"/>
+        </w:rPr>
+        <w:t xml:space="preserve">限定名刺</w:t>
+      </w:r>
+      <w:r>
+        <w:rPr>
+          <w:rFonts w:ascii="Hiragino Sans" w:hAnsi="Hiragino Sans" w:cs="Hiragino Sans"/>
+          <w:sz w:val="29"/>
+          <w:sz-cs w:val="29"/>
+          <w:spacing w:val="0"/>
+        </w:rPr>
+        <w:t xml:space="preserve">（QRコードから限定シャンパンコール動画を視聴できます）</w:t>
       </w:r>
     </w:p>
     <w:p>
@@ -3434,77 +3429,25 @@
           <w:b/>
           <w:spacing w:val="0"/>
         </w:rPr>
-        <w:t xml:space="preserve">同伴の方を1名までお連れいただけます</w:t>
-      </w:r>
-      <w:r>
-        <w:rPr>
-          <w:rFonts w:ascii="Hiragino Sans" w:hAnsi="Hiragino Sans" w:cs="Hiragino Sans"/>
-          <w:sz w:val="29"/>
-          <w:sz-cs w:val="29"/>
-          <w:spacing w:val="0"/>
-        </w:rPr>
-        <w:t xml:space="preserve"/>
-      </w:r>
-    </w:p>
-    <w:p>
-      <w:pPr>
-        <w:spacing w:after="240"/>
-      </w:pPr>
-      <w:r>
-        <w:rPr>
-          <w:rFonts w:ascii="Hiragino Sans" w:hAnsi="Hiragino Sans" w:cs="Hiragino Sans"/>
-          <w:sz w:val="29"/>
-          <w:sz-cs w:val="29"/>
-          <w:b/>
-          <w:spacing w:val="0"/>
-        </w:rPr>
-        <w:t xml:space="preserve">※ チェキは先行入場のお時間（18:00〜）にすべて撮影します。そのあとは開演まで、お飲み物とともにご歓談いただけます。</w:t>
-      </w:r>
-      <w:r>
-        <w:rPr>
-          <w:rFonts w:ascii="Hiragino Sans" w:hAnsi="Hiragino Sans" w:cs="Hiragino Sans"/>
-          <w:sz w:val="29"/>
-          <w:sz-cs w:val="29"/>
-          <w:spacing w:val="0"/>
-        </w:rPr>
-        <w:t xml:space="preserve"/>
-      </w:r>
-    </w:p>
-    <w:p>
-      <w:pPr/>
-      <w:r>
-        <w:rPr>
-          <w:rFonts w:ascii="Hiragino Sans" w:hAnsi="Hiragino Sans" w:cs="Hiragino Sans"/>
-          <w:sz w:val="29"/>
-          <w:sz-cs w:val="29"/>
-          <w:spacing w:val="0"/>
-          <w:color w:val="6D6D6D"/>
-        </w:rPr>
-        <w:t xml:space="preserve"/>
-      </w:r>
-    </w:p>
-    <w:p>
-      <w:pPr>
-        <w:spacing w:after="240"/>
-      </w:pPr>
-      <w:r>
-        <w:rPr>
-          <w:rFonts w:ascii="Hiragino Sans" w:hAnsi="Hiragino Sans" w:cs="Hiragino Sans"/>
-          <w:sz w:val="29"/>
-          <w:sz-cs w:val="29"/>
-          <w:b/>
-          <w:spacing w:val="0"/>
-        </w:rPr>
-        <w:t xml:space="preserve">【VVIP席】330,000円</w:t>
-      </w:r>
-      <w:r>
-        <w:rPr>
-          <w:rFonts w:ascii="Hiragino Sans" w:hAnsi="Hiragino Sans" w:cs="Hiragino Sans"/>
-          <w:sz w:val="29"/>
-          <w:sz-cs w:val="29"/>
-          <w:spacing w:val="0"/>
-        </w:rPr>
-        <w:t xml:space="preserve">〔10口／同伴1名まで可（計20名）／20:10〜21:10〕</w:t>
+        <w:t xml:space="preserve">ノベルティ</w:t>
+      </w:r>
+      <w:r>
+        <w:rPr>
+          <w:rFonts w:ascii="Hiragino Sans" w:hAnsi="Hiragino Sans" w:cs="Hiragino Sans"/>
+          <w:sz w:val="29"/>
+          <w:sz-cs w:val="29"/>
+          <w:spacing w:val="0"/>
+        </w:rPr>
+        <w:t xml:space="preserve">（ノート・ペン）</w:t>
+      </w:r>
+      <w:r>
+        <w:rPr>
+          <w:rFonts w:ascii="Hiragino Sans" w:hAnsi="Hiragino Sans" w:cs="Hiragino Sans"/>
+          <w:sz w:val="29"/>
+          <w:sz-cs w:val="29"/>
+          <w:spacing w:val="0"/>
+        </w:rPr>
+        <w:t xml:space="preserve">〔デザインは調整中〕</w:t>
       </w:r>
       <w:r>
         <w:rPr>
@@ -3542,7 +3485,58 @@
           <w:b/>
           <w:spacing w:val="0"/>
         </w:rPr>
-        <w:t xml:space="preserve">MIO と対面で、6分前後お話しいただけます</w:t>
+        <w:t xml:space="preserve">ファンミーティング</w:t>
+      </w:r>
+      <w:r>
+        <w:rPr>
+          <w:rFonts w:ascii="Hiragino Sans" w:hAnsi="Hiragino Sans" w:cs="Hiragino Sans"/>
+          <w:sz w:val="29"/>
+          <w:sz-cs w:val="29"/>
+          <w:spacing w:val="0"/>
+        </w:rPr>
+        <w:t xml:space="preserve">（2026年11月・ユグドラシル本店）</w:t>
+      </w:r>
+      <w:r>
+        <w:rPr>
+          <w:rFonts w:ascii="Hiragino Sans" w:hAnsi="Hiragino Sans" w:cs="Hiragino Sans"/>
+          <w:sz w:val="29"/>
+          <w:sz-cs w:val="29"/>
+          <w:spacing w:val="0"/>
+        </w:rPr>
+        <w:t xml:space="preserve">〔日程は調整中〕</w:t>
+      </w:r>
+      <w:r>
+        <w:rPr>
+          <w:rFonts w:ascii="Hiragino Sans" w:hAnsi="Hiragino Sans" w:cs="Hiragino Sans"/>
+          <w:sz w:val="29"/>
+          <w:sz-cs w:val="29"/>
+          <w:spacing w:val="0"/>
+        </w:rPr>
+        <w:t xml:space="preserve"/>
+      </w:r>
+    </w:p>
+    <w:p>
+      <w:pPr>
+        <w:spacing w:after="240"/>
+      </w:pPr>
+      <w:r>
+        <w:rPr>
+          <w:rFonts w:ascii="Hiragino Sans" w:hAnsi="Hiragino Sans" w:cs="Hiragino Sans"/>
+          <w:sz w:val="29"/>
+          <w:sz-cs w:val="29"/>
+          <w:spacing w:val="0"/>
+        </w:rPr>
+        <w:t xml:space="preserve">※ </w:t>
+      </w:r>
+      <w:r>
+        <w:rPr>
+          <w:rFonts w:ascii="Hiragino Sans" w:hAnsi="Hiragino Sans" w:cs="Hiragino Sans"/>
+          <w:sz w:val="29"/>
+          <w:sz-cs w:val="29"/>
+          <w:b/>
+          <w:spacing w:val="0"/>
+        </w:rPr>
+        <w:t xml:space="preserve">やしろ語録動画の撮影はこちらで行います</w:t>
       </w:r>
       <w:r>
         <w:rPr>
@@ -3564,7 +3558,6 @@
           <w:rFonts w:ascii="Hiragino Sans" w:hAnsi="Hiragino Sans" w:cs="Hiragino Sans"/>
           <w:sz w:val="29"/>
           <w:sz-cs w:val="29"/>
-          <w:b/>
         </w:rPr>
         <w:t xml:space="preserve"/>
         <w:tab/>
@@ -3577,38 +3570,9 @@
           <w:rFonts w:ascii="Hiragino Sans" w:hAnsi="Hiragino Sans" w:cs="Hiragino Sans"/>
           <w:sz w:val="29"/>
           <w:sz-cs w:val="29"/>
-          <w:b/>
-          <w:spacing w:val="0"/>
-        </w:rPr>
-        <w:t xml:space="preserve">お好きなお席をお選びいただけます</w:t>
-      </w:r>
-      <w:r>
-        <w:rPr>
-          <w:rFonts w:ascii="Hiragino Sans" w:hAnsi="Hiragino Sans" w:cs="Hiragino Sans"/>
-          <w:sz w:val="29"/>
-          <w:sz-cs w:val="29"/>
-          <w:spacing w:val="0"/>
-        </w:rPr>
-        <w:t xml:space="preserve">（DJ席・V4・V1 より</w:t>
-      </w:r>
-      <w:r>
-        <w:rPr>
-          <w:rFonts w:ascii="Hiragino Sans" w:hAnsi="Hiragino Sans" w:cs="Hiragino Sans"/>
-          <w:sz w:val="29"/>
-          <w:sz-cs w:val="29"/>
-          <w:b/>
-          <w:spacing w:val="0"/>
-        </w:rPr>
-        <w:t xml:space="preserve">先着順</w:t>
-      </w:r>
-      <w:r>
-        <w:rPr>
-          <w:rFonts w:ascii="Hiragino Sans" w:hAnsi="Hiragino Sans" w:cs="Hiragino Sans"/>
-          <w:sz w:val="29"/>
-          <w:sz-cs w:val="29"/>
-          <w:spacing w:val="0"/>
-        </w:rPr>
-        <w:t xml:space="preserve">）</w:t>
+          <w:spacing w:val="0"/>
+        </w:rPr>
+        <w:t xml:space="preserve">アコースティックライブ観覧</w:t>
       </w:r>
     </w:p>
     <w:p>
@@ -3637,16 +3601,77 @@
           <w:b/>
           <w:spacing w:val="0"/>
         </w:rPr>
-        <w:t xml:space="preserve">シャンパンサービス</w:t>
-      </w:r>
-      <w:r>
-        <w:rPr>
-          <w:rFonts w:ascii="Hiragino Sans" w:hAnsi="Hiragino Sans" w:cs="Hiragino Sans"/>
-          <w:sz w:val="29"/>
-          <w:sz-cs w:val="29"/>
-          <w:spacing w:val="0"/>
-        </w:rPr>
-        <w:t xml:space="preserve">〔銘柄・本数は調整中〕</w:t>
+        <w:t xml:space="preserve">同伴の方を1名までお連れいただけます</w:t>
+      </w:r>
+      <w:r>
+        <w:rPr>
+          <w:rFonts w:ascii="Hiragino Sans" w:hAnsi="Hiragino Sans" w:cs="Hiragino Sans"/>
+          <w:sz w:val="29"/>
+          <w:sz-cs w:val="29"/>
+          <w:spacing w:val="0"/>
+        </w:rPr>
+        <w:t xml:space="preserve"/>
+      </w:r>
+    </w:p>
+    <w:p>
+      <w:pPr>
+        <w:spacing w:after="240"/>
+      </w:pPr>
+      <w:r>
+        <w:rPr>
+          <w:rFonts w:ascii="Hiragino Sans" w:hAnsi="Hiragino Sans" w:cs="Hiragino Sans"/>
+          <w:sz w:val="29"/>
+          <w:sz-cs w:val="29"/>
+          <w:b/>
+          <w:spacing w:val="0"/>
+        </w:rPr>
+        <w:t xml:space="preserve">※ チェキは先行入場のお時間（18:00〜）にすべて撮影します。そのあとは開演まで、お飲み物とともにご歓談いただけます。</w:t>
+      </w:r>
+      <w:r>
+        <w:rPr>
+          <w:rFonts w:ascii="Hiragino Sans" w:hAnsi="Hiragino Sans" w:cs="Hiragino Sans"/>
+          <w:sz w:val="29"/>
+          <w:sz-cs w:val="29"/>
+          <w:spacing w:val="0"/>
+        </w:rPr>
+        <w:t xml:space="preserve"/>
+      </w:r>
+    </w:p>
+    <w:p>
+      <w:pPr/>
+      <w:r>
+        <w:rPr>
+          <w:rFonts w:ascii="Hiragino Sans" w:hAnsi="Hiragino Sans" w:cs="Hiragino Sans"/>
+          <w:sz w:val="29"/>
+          <w:sz-cs w:val="29"/>
+          <w:spacing w:val="0"/>
+          <w:color w:val="6D6D6D"/>
+        </w:rPr>
+        <w:t xml:space="preserve"/>
+      </w:r>
+    </w:p>
+    <w:p>
+      <w:pPr>
+        <w:spacing w:after="240"/>
+      </w:pPr>
+      <w:r>
+        <w:rPr>
+          <w:rFonts w:ascii="Hiragino Sans" w:hAnsi="Hiragino Sans" w:cs="Hiragino Sans"/>
+          <w:sz w:val="29"/>
+          <w:sz-cs w:val="29"/>
+          <w:b/>
+          <w:spacing w:val="0"/>
+        </w:rPr>
+        <w:t xml:space="preserve">【VVIP席】330,000円</w:t>
+      </w:r>
+      <w:r>
+        <w:rPr>
+          <w:rFonts w:ascii="Hiragino Sans" w:hAnsi="Hiragino Sans" w:cs="Hiragino Sans"/>
+          <w:sz w:val="29"/>
+          <w:sz-cs w:val="29"/>
+          <w:spacing w:val="0"/>
+        </w:rPr>
+        <w:t xml:space="preserve">〔10口／同伴1名まで可（計20名）／20:10〜21:10〕</w:t>
       </w:r>
       <w:r>
         <w:rPr>
@@ -3668,6 +3693,7 @@
           <w:rFonts w:ascii="Hiragino Sans" w:hAnsi="Hiragino Sans" w:cs="Hiragino Sans"/>
           <w:sz w:val="29"/>
           <w:sz-cs w:val="29"/>
+          <w:b/>
         </w:rPr>
         <w:t xml:space="preserve"/>
         <w:tab/>
@@ -3680,9 +3706,19 @@
           <w:rFonts w:ascii="Hiragino Sans" w:hAnsi="Hiragino Sans" w:cs="Hiragino Sans"/>
           <w:sz w:val="29"/>
           <w:sz-cs w:val="29"/>
-          <w:spacing w:val="0"/>
-        </w:rPr>
-        <w:t xml:space="preserve">チェキ／写真／動画OK</w:t>
+          <w:b/>
+          <w:spacing w:val="0"/>
+        </w:rPr>
+        <w:t xml:space="preserve">MIO と対面で、6分前後お話しいただけます</w:t>
+      </w:r>
+      <w:r>
+        <w:rPr>
+          <w:rFonts w:ascii="Hiragino Sans" w:hAnsi="Hiragino Sans" w:cs="Hiragino Sans"/>
+          <w:sz w:val="29"/>
+          <w:sz-cs w:val="29"/>
+          <w:spacing w:val="0"/>
+        </w:rPr>
+        <w:t xml:space="preserve"/>
       </w:r>
     </w:p>
     <w:p>
@@ -3711,16 +3747,35 @@
           <w:b/>
           <w:spacing w:val="0"/>
         </w:rPr>
-        <w:t xml:space="preserve">限定名刺</w:t>
-      </w:r>
-      <w:r>
-        <w:rPr>
-          <w:rFonts w:ascii="Hiragino Sans" w:hAnsi="Hiragino Sans" w:cs="Hiragino Sans"/>
-          <w:sz w:val="29"/>
-          <w:sz-cs w:val="29"/>
-          <w:spacing w:val="0"/>
-        </w:rPr>
-        <w:t xml:space="preserve">（QRコードから限定シャンパンコール動画を視聴できます）</w:t>
+        <w:t xml:space="preserve">お好きなお席をお選びいただけます</w:t>
+      </w:r>
+      <w:r>
+        <w:rPr>
+          <w:rFonts w:ascii="Hiragino Sans" w:hAnsi="Hiragino Sans" w:cs="Hiragino Sans"/>
+          <w:sz w:val="29"/>
+          <w:sz-cs w:val="29"/>
+          <w:spacing w:val="0"/>
+        </w:rPr>
+        <w:t xml:space="preserve">（DJ席・V4・V1 より</w:t>
+      </w:r>
+      <w:r>
+        <w:rPr>
+          <w:rFonts w:ascii="Hiragino Sans" w:hAnsi="Hiragino Sans" w:cs="Hiragino Sans"/>
+          <w:sz w:val="29"/>
+          <w:sz-cs w:val="29"/>
+          <w:b/>
+          <w:spacing w:val="0"/>
+        </w:rPr>
+        <w:t xml:space="preserve">先着順</w:t>
+      </w:r>
+      <w:r>
+        <w:rPr>
+          <w:rFonts w:ascii="Hiragino Sans" w:hAnsi="Hiragino Sans" w:cs="Hiragino Sans"/>
+          <w:sz w:val="29"/>
+          <w:sz-cs w:val="29"/>
+          <w:spacing w:val="0"/>
+        </w:rPr>
+        <w:t xml:space="preserve">）</w:t>
       </w:r>
     </w:p>
     <w:p>
@@ -3749,25 +3804,16 @@
           <w:b/>
           <w:spacing w:val="0"/>
         </w:rPr>
-        <w:t xml:space="preserve">ノベルティ</w:t>
-      </w:r>
-      <w:r>
-        <w:rPr>
-          <w:rFonts w:ascii="Hiragino Sans" w:hAnsi="Hiragino Sans" w:cs="Hiragino Sans"/>
-          <w:sz w:val="29"/>
-          <w:sz-cs w:val="29"/>
-          <w:spacing w:val="0"/>
-        </w:rPr>
-        <w:t xml:space="preserve">（ノート・ペン・トートバッグ・キーホルダーほか）</w:t>
-      </w:r>
-      <w:r>
-        <w:rPr>
-          <w:rFonts w:ascii="Hiragino Sans" w:hAnsi="Hiragino Sans" w:cs="Hiragino Sans"/>
-          <w:sz w:val="29"/>
-          <w:sz-cs w:val="29"/>
-          <w:spacing w:val="0"/>
-        </w:rPr>
-        <w:t xml:space="preserve">〔内容・デザインは調整中〕</w:t>
+        <w:t xml:space="preserve">シャンパンサービス</w:t>
+      </w:r>
+      <w:r>
+        <w:rPr>
+          <w:rFonts w:ascii="Hiragino Sans" w:hAnsi="Hiragino Sans" w:cs="Hiragino Sans"/>
+          <w:sz w:val="29"/>
+          <w:sz-cs w:val="29"/>
+          <w:spacing w:val="0"/>
+        </w:rPr>
+        <w:t xml:space="preserve">〔銘柄・本数は調整中〕</w:t>
       </w:r>
       <w:r>
         <w:rPr>
@@ -3803,7 +3849,7 @@
           <w:sz-cs w:val="29"/>
           <w:spacing w:val="0"/>
         </w:rPr>
-        <w:t xml:space="preserve">アコースティックライブ観覧</w:t>
+        <w:t xml:space="preserve">チェキ／写真／動画OK</w:t>
       </w:r>
     </w:p>
     <w:p>
@@ -3832,64 +3878,16 @@
           <w:b/>
           <w:spacing w:val="0"/>
         </w:rPr>
-        <w:t xml:space="preserve">同伴の方を1名までお連れいただけます</w:t>
-      </w:r>
-      <w:r>
-        <w:rPr>
-          <w:rFonts w:ascii="Hiragino Sans" w:hAnsi="Hiragino Sans" w:cs="Hiragino Sans"/>
-          <w:sz w:val="29"/>
-          <w:sz-cs w:val="29"/>
-          <w:spacing w:val="0"/>
-        </w:rPr>
-        <w:t xml:space="preserve"/>
-      </w:r>
-    </w:p>
-    <w:p>
-      <w:pPr>
-        <w:spacing w:after="240"/>
-      </w:pPr>
-      <w:r>
-        <w:rPr>
-          <w:rFonts w:ascii="Hiragino Sans" w:hAnsi="Hiragino Sans" w:cs="Hiragino Sans"/>
-          <w:sz w:val="29"/>
-          <w:sz-cs w:val="29"/>
-          <w:b/>
-          <w:spacing w:val="0"/>
-        </w:rPr>
-        <w:t xml:space="preserve">※ 先行入場（17:45〜）もご利用いただけますが、必須ではありません。開演までのお好きなお時間にお越しください。</w:t>
-      </w:r>
-      <w:r>
-        <w:rPr>
-          <w:rFonts w:ascii="Hiragino Sans" w:hAnsi="Hiragino Sans" w:cs="Hiragino Sans"/>
-          <w:sz w:val="29"/>
-          <w:sz-cs w:val="29"/>
-          <w:spacing w:val="0"/>
-        </w:rPr>
-        <w:t xml:space="preserve"/>
-      </w:r>
-    </w:p>
-    <w:p>
-      <w:pPr>
-        <w:spacing w:after="240"/>
-      </w:pPr>
-      <w:r>
-        <w:rPr>
-          <w:rFonts w:ascii="Hiragino Sans" w:hAnsi="Hiragino Sans" w:cs="Hiragino Sans"/>
-          <w:sz w:val="29"/>
-          <w:sz-cs w:val="29"/>
-          <w:b/>
-          <w:spacing w:val="0"/>
-        </w:rPr>
-        <w:t xml:space="preserve">⭐️ VVIP席だけの特典</w:t>
-      </w:r>
-      <w:r>
-        <w:rPr>
-          <w:rFonts w:ascii="Hiragino Sans" w:hAnsi="Hiragino Sans" w:cs="Hiragino Sans"/>
-          <w:sz w:val="29"/>
-          <w:sz-cs w:val="29"/>
-          <w:spacing w:val="0"/>
-        </w:rPr>
-        <w:t xml:space="preserve"/>
+        <w:t xml:space="preserve">限定名刺</w:t>
+      </w:r>
+      <w:r>
+        <w:rPr>
+          <w:rFonts w:ascii="Hiragino Sans" w:hAnsi="Hiragino Sans" w:cs="Hiragino Sans"/>
+          <w:sz w:val="29"/>
+          <w:sz-cs w:val="29"/>
+          <w:spacing w:val="0"/>
+        </w:rPr>
+        <w:t xml:space="preserve">（QRコードから限定シャンパンコール動画を視聴できます）</w:t>
       </w:r>
     </w:p>
     <w:p>
@@ -3918,90 +3916,25 @@
           <w:b/>
           <w:spacing w:val="0"/>
         </w:rPr>
-        <w:t xml:space="preserve">当日、MIO と直接お話しいただけるのは VVIP席のみです。</w:t>
-      </w:r>
-      <w:r>
-        <w:rPr>
-          <w:rFonts w:ascii="Hiragino Sans" w:hAnsi="Hiragino Sans" w:cs="Hiragino Sans"/>
-          <w:sz w:val="29"/>
-          <w:sz-cs w:val="29"/>
-          <w:spacing w:val="0"/>
-        </w:rPr>
-        <w:t xml:space="preserve"/>
-      </w:r>
-    </w:p>
-    <w:p>
-      <w:pPr/>
-      <w:r>
-        <w:rPr>
-          <w:rFonts w:ascii="Hiragino Sans" w:hAnsi="Hiragino Sans" w:cs="Hiragino Sans"/>
-          <w:sz w:val="29"/>
-          <w:sz-cs w:val="29"/>
-          <w:spacing w:val="0"/>
-          <w:color w:val="6D6D6D"/>
-        </w:rPr>
-        <w:t xml:space="preserve"/>
-      </w:r>
-    </w:p>
-    <w:p>
-      <w:pPr>
-        <w:spacing w:after="240"/>
-      </w:pPr>
-      <w:r>
-        <w:rPr>
-          <w:rFonts w:ascii="Hiragino Sans" w:hAnsi="Hiragino Sans" w:cs="Hiragino Sans"/>
-          <w:sz w:val="29"/>
-          <w:sz-cs w:val="29"/>
-          <w:b/>
-          <w:spacing w:val="0"/>
-        </w:rPr>
-        <w:t xml:space="preserve">■ 会場に来られない方へ</w:t>
-      </w:r>
-      <w:r>
-        <w:rPr>
-          <w:rFonts w:ascii="Hiragino Sans" w:hAnsi="Hiragino Sans" w:cs="Hiragino Sans"/>
-          <w:sz w:val="29"/>
-          <w:sz-cs w:val="29"/>
-          <w:spacing w:val="0"/>
-        </w:rPr>
-        <w:t xml:space="preserve"/>
-      </w:r>
-    </w:p>
-    <w:p>
-      <w:pPr/>
-      <w:r>
-        <w:rPr>
-          <w:rFonts w:ascii="Hiragino Sans" w:hAnsi="Hiragino Sans" w:cs="Hiragino Sans"/>
-          <w:sz w:val="29"/>
-          <w:sz-cs w:val="29"/>
-          <w:spacing w:val="0"/>
-          <w:color w:val="6D6D6D"/>
-        </w:rPr>
-        <w:t xml:space="preserve"/>
-      </w:r>
-    </w:p>
-    <w:p>
-      <w:pPr>
-        <w:spacing w:after="240"/>
-      </w:pPr>
-      <w:r>
-        <w:rPr>
-          <w:rFonts w:ascii="Hiragino Sans" w:hAnsi="Hiragino Sans" w:cs="Hiragino Sans"/>
-          <w:sz w:val="29"/>
-          <w:sz-cs w:val="29"/>
-          <w:b/>
-          <w:spacing w:val="0"/>
-        </w:rPr>
-        <w:t xml:space="preserve">【シンプル応援】5,000円</w:t>
-      </w:r>
-      <w:r>
-        <w:rPr>
-          <w:rFonts w:ascii="Hiragino Sans" w:hAnsi="Hiragino Sans" w:cs="Hiragino Sans"/>
-          <w:sz w:val="29"/>
-          <w:sz-cs w:val="29"/>
-          <w:spacing w:val="0"/>
-        </w:rPr>
-        <w:t xml:space="preserve">〔無制限〕</w:t>
+        <w:t xml:space="preserve">ノベルティ</w:t>
+      </w:r>
+      <w:r>
+        <w:rPr>
+          <w:rFonts w:ascii="Hiragino Sans" w:hAnsi="Hiragino Sans" w:cs="Hiragino Sans"/>
+          <w:sz w:val="29"/>
+          <w:sz-cs w:val="29"/>
+          <w:spacing w:val="0"/>
+        </w:rPr>
+        <w:t xml:space="preserve">（ノート・ペン・トートバッグ・キーホルダーほか）</w:t>
+      </w:r>
+      <w:r>
+        <w:rPr>
+          <w:rFonts w:ascii="Hiragino Sans" w:hAnsi="Hiragino Sans" w:cs="Hiragino Sans"/>
+          <w:sz w:val="29"/>
+          <w:sz-cs w:val="29"/>
+          <w:spacing w:val="0"/>
+        </w:rPr>
+        <w:t xml:space="preserve">〔内容・デザインは調整中〕</w:t>
       </w:r>
       <w:r>
         <w:rPr>
@@ -4023,7 +3956,6 @@
           <w:rFonts w:ascii="Hiragino Sans" w:hAnsi="Hiragino Sans" w:cs="Hiragino Sans"/>
           <w:sz w:val="29"/>
           <w:sz-cs w:val="29"/>
-          <w:b/>
         </w:rPr>
         <w:t xml:space="preserve"/>
         <w:tab/>
@@ -4036,6 +3968,241 @@
           <w:rFonts w:ascii="Hiragino Sans" w:hAnsi="Hiragino Sans" w:cs="Hiragino Sans"/>
           <w:sz w:val="29"/>
           <w:sz-cs w:val="29"/>
+          <w:spacing w:val="0"/>
+        </w:rPr>
+        <w:t xml:space="preserve">アコースティックライブ観覧</w:t>
+      </w:r>
+    </w:p>
+    <w:p>
+      <w:pPr>
+        <w:ind w:left="720" w:first-line="-720"/>
+        <w:spacing w:after="106"/>
+      </w:pPr>
+      <w:r>
+        <w:rPr>
+          <w:rFonts w:ascii="Hiragino Sans" w:hAnsi="Hiragino Sans" w:cs="Hiragino Sans"/>
+          <w:sz w:val="29"/>
+          <w:sz-cs w:val="29"/>
+          <w:b/>
+        </w:rPr>
+        <w:t xml:space="preserve"/>
+        <w:tab/>
+        <w:t xml:space="preserve">•</w:t>
+        <w:tab/>
+        <w:t xml:space="preserve"/>
+      </w:r>
+      <w:r>
+        <w:rPr>
+          <w:rFonts w:ascii="Hiragino Sans" w:hAnsi="Hiragino Sans" w:cs="Hiragino Sans"/>
+          <w:sz w:val="29"/>
+          <w:sz-cs w:val="29"/>
+          <w:b/>
+          <w:spacing w:val="0"/>
+        </w:rPr>
+        <w:t xml:space="preserve">同伴の方を1名までお連れいただけます</w:t>
+      </w:r>
+      <w:r>
+        <w:rPr>
+          <w:rFonts w:ascii="Hiragino Sans" w:hAnsi="Hiragino Sans" w:cs="Hiragino Sans"/>
+          <w:sz w:val="29"/>
+          <w:sz-cs w:val="29"/>
+          <w:spacing w:val="0"/>
+        </w:rPr>
+        <w:t xml:space="preserve"/>
+      </w:r>
+    </w:p>
+    <w:p>
+      <w:pPr>
+        <w:spacing w:after="240"/>
+      </w:pPr>
+      <w:r>
+        <w:rPr>
+          <w:rFonts w:ascii="Hiragino Sans" w:hAnsi="Hiragino Sans" w:cs="Hiragino Sans"/>
+          <w:sz w:val="29"/>
+          <w:sz-cs w:val="29"/>
+          <w:b/>
+          <w:spacing w:val="0"/>
+        </w:rPr>
+        <w:t xml:space="preserve">※ 先行入場（17:45〜）もご利用いただけますが、必須ではありません。開演までのお好きなお時間にお越しください。</w:t>
+      </w:r>
+      <w:r>
+        <w:rPr>
+          <w:rFonts w:ascii="Hiragino Sans" w:hAnsi="Hiragino Sans" w:cs="Hiragino Sans"/>
+          <w:sz w:val="29"/>
+          <w:sz-cs w:val="29"/>
+          <w:spacing w:val="0"/>
+        </w:rPr>
+        <w:t xml:space="preserve"/>
+      </w:r>
+    </w:p>
+    <w:p>
+      <w:pPr>
+        <w:spacing w:after="240"/>
+      </w:pPr>
+      <w:r>
+        <w:rPr>
+          <w:rFonts w:ascii="Hiragino Sans" w:hAnsi="Hiragino Sans" w:cs="Hiragino Sans"/>
+          <w:sz w:val="29"/>
+          <w:sz-cs w:val="29"/>
+          <w:b/>
+          <w:spacing w:val="0"/>
+        </w:rPr>
+        <w:t xml:space="preserve">⭐️ VVIP席だけの特典</w:t>
+      </w:r>
+      <w:r>
+        <w:rPr>
+          <w:rFonts w:ascii="Hiragino Sans" w:hAnsi="Hiragino Sans" w:cs="Hiragino Sans"/>
+          <w:sz w:val="29"/>
+          <w:sz-cs w:val="29"/>
+          <w:spacing w:val="0"/>
+        </w:rPr>
+        <w:t xml:space="preserve"/>
+      </w:r>
+    </w:p>
+    <w:p>
+      <w:pPr>
+        <w:ind w:left="720" w:first-line="-720"/>
+        <w:spacing w:after="106"/>
+      </w:pPr>
+      <w:r>
+        <w:rPr>
+          <w:rFonts w:ascii="Hiragino Sans" w:hAnsi="Hiragino Sans" w:cs="Hiragino Sans"/>
+          <w:sz w:val="29"/>
+          <w:sz-cs w:val="29"/>
+          <w:b/>
+        </w:rPr>
+        <w:t xml:space="preserve"/>
+        <w:tab/>
+        <w:t xml:space="preserve">•</w:t>
+        <w:tab/>
+        <w:t xml:space="preserve"/>
+      </w:r>
+      <w:r>
+        <w:rPr>
+          <w:rFonts w:ascii="Hiragino Sans" w:hAnsi="Hiragino Sans" w:cs="Hiragino Sans"/>
+          <w:sz w:val="29"/>
+          <w:sz-cs w:val="29"/>
+          <w:b/>
+          <w:spacing w:val="0"/>
+        </w:rPr>
+        <w:t xml:space="preserve">当日、MIO と直接お話しいただけるのは VVIP席のみです。</w:t>
+      </w:r>
+      <w:r>
+        <w:rPr>
+          <w:rFonts w:ascii="Hiragino Sans" w:hAnsi="Hiragino Sans" w:cs="Hiragino Sans"/>
+          <w:sz w:val="29"/>
+          <w:sz-cs w:val="29"/>
+          <w:spacing w:val="0"/>
+        </w:rPr>
+        <w:t xml:space="preserve"/>
+      </w:r>
+    </w:p>
+    <w:p>
+      <w:pPr/>
+      <w:r>
+        <w:rPr>
+          <w:rFonts w:ascii="Hiragino Sans" w:hAnsi="Hiragino Sans" w:cs="Hiragino Sans"/>
+          <w:sz w:val="29"/>
+          <w:sz-cs w:val="29"/>
+          <w:spacing w:val="0"/>
+          <w:color w:val="6D6D6D"/>
+        </w:rPr>
+        <w:t xml:space="preserve"/>
+      </w:r>
+    </w:p>
+    <w:p>
+      <w:pPr>
+        <w:spacing w:after="240"/>
+      </w:pPr>
+      <w:r>
+        <w:rPr>
+          <w:rFonts w:ascii="Hiragino Sans" w:hAnsi="Hiragino Sans" w:cs="Hiragino Sans"/>
+          <w:sz w:val="29"/>
+          <w:sz-cs w:val="29"/>
+          <w:b/>
+          <w:spacing w:val="0"/>
+        </w:rPr>
+        <w:t xml:space="preserve">■ 会場に来られない方へ</w:t>
+      </w:r>
+      <w:r>
+        <w:rPr>
+          <w:rFonts w:ascii="Hiragino Sans" w:hAnsi="Hiragino Sans" w:cs="Hiragino Sans"/>
+          <w:sz w:val="29"/>
+          <w:sz-cs w:val="29"/>
+          <w:spacing w:val="0"/>
+        </w:rPr>
+        <w:t xml:space="preserve"/>
+      </w:r>
+    </w:p>
+    <w:p>
+      <w:pPr/>
+      <w:r>
+        <w:rPr>
+          <w:rFonts w:ascii="Hiragino Sans" w:hAnsi="Hiragino Sans" w:cs="Hiragino Sans"/>
+          <w:sz w:val="29"/>
+          <w:sz-cs w:val="29"/>
+          <w:spacing w:val="0"/>
+          <w:color w:val="6D6D6D"/>
+        </w:rPr>
+        <w:t xml:space="preserve"/>
+      </w:r>
+    </w:p>
+    <w:p>
+      <w:pPr>
+        <w:spacing w:after="240"/>
+      </w:pPr>
+      <w:r>
+        <w:rPr>
+          <w:rFonts w:ascii="Hiragino Sans" w:hAnsi="Hiragino Sans" w:cs="Hiragino Sans"/>
+          <w:sz w:val="29"/>
+          <w:sz-cs w:val="29"/>
+          <w:b/>
+          <w:spacing w:val="0"/>
+        </w:rPr>
+        <w:t xml:space="preserve">【シンプル応援】5,000円</w:t>
+      </w:r>
+      <w:r>
+        <w:rPr>
+          <w:rFonts w:ascii="Hiragino Sans" w:hAnsi="Hiragino Sans" w:cs="Hiragino Sans"/>
+          <w:sz w:val="29"/>
+          <w:sz-cs w:val="29"/>
+          <w:spacing w:val="0"/>
+        </w:rPr>
+        <w:t xml:space="preserve">〔無制限〕</w:t>
+      </w:r>
+      <w:r>
+        <w:rPr>
+          <w:rFonts w:ascii="Hiragino Sans" w:hAnsi="Hiragino Sans" w:cs="Hiragino Sans"/>
+          <w:sz w:val="29"/>
+          <w:sz-cs w:val="29"/>
+          <w:spacing w:val="0"/>
+        </w:rPr>
+        <w:t xml:space="preserve"/>
+      </w:r>
+    </w:p>
+    <w:p>
+      <w:pPr>
+        <w:ind w:left="720" w:first-line="-720"/>
+        <w:spacing w:after="106"/>
+      </w:pPr>
+      <w:r>
+        <w:rPr>
+          <w:rFonts w:ascii="Hiragino Sans" w:hAnsi="Hiragino Sans" w:cs="Hiragino Sans"/>
+          <w:sz w:val="29"/>
+          <w:sz-cs w:val="29"/>
+          <w:b/>
+        </w:rPr>
+        <w:t xml:space="preserve"/>
+        <w:tab/>
+        <w:t xml:space="preserve">•</w:t>
+        <w:tab/>
+        <w:t xml:space="preserve"/>
+      </w:r>
+      <w:r>
+        <w:rPr>
+          <w:rFonts w:ascii="Hiragino Sans" w:hAnsi="Hiragino Sans" w:cs="Hiragino Sans"/>
+          <w:sz w:val="29"/>
+          <w:sz-cs w:val="29"/>
           <w:b/>
           <w:spacing w:val="0"/>
         </w:rPr>
@@ -4076,7 +4243,7 @@
           <w:b/>
           <w:spacing w:val="0"/>
         </w:rPr>
-        <w:t xml:space="preserve">■ ファンミーティングについてS席・MIOタイム</w:t>
+        <w:t xml:space="preserve">■ ファンミーティングについて最前列席・S席・MIOタイム</w:t>
       </w:r>
       <w:r>
         <w:rPr>
@@ -4414,7 +4581,7 @@
           <w:sz-cs w:val="29"/>
           <w:spacing w:val="0"/>
         </w:rPr>
-        <w:t xml:space="preserve">　ファンミーティング実施（S席・MIOタイム／ユグドラシル本店）</w:t>
+        <w:t xml:space="preserve">　ファンミーティング実施（最前列席・S席・MIOタイム／ユグドラシル本店）</w:t>
       </w:r>
     </w:p>
     <w:p>

</xml_diff>

<commit_message>
charity: drop the champagne, give VVIP a fan meeting, split by timing
VVIP loses the champagne service and gains what the other tiers have --
the fan meeting now reaches every course from 50,000 up, with the
content stepping up per tier: 30 minutes as a group, or Q&A with MIO,
for VVIP; still to be decided for 最前列席 and S席.

Every course now reads in two parts, what is handed over on the night
and what comes later, because a course that mixes both was impossible
to check against CAMPFIRE's single delivery date. The やしろ語録動画
sits on the later side, where the shoot actually happens.

Co-Authored-By: Claude Opus 5 <noreply@anthropic.com>
</commit_message>
<xml_diff>
--- a/docs/campfire-body-edit.docx
+++ b/docs/campfire-body-edit.docx
@@ -3015,6 +3015,30 @@
     </w:p>
     <w:p>
       <w:pPr>
+        <w:spacing w:after="240"/>
+      </w:pPr>
+      <w:r>
+        <w:rPr>
+          <w:rFonts w:ascii="Hiragino Sans" w:hAnsi="Hiragino Sans" w:cs="Hiragino Sans"/>
+          <w:sz w:val="29"/>
+          <w:sz-cs w:val="29"/>
+          <w:b/>
+          <w:spacing w:val="0"/>
+        </w:rPr>
+        <w:t xml:space="preserve">＜当日＞</w:t>
+      </w:r>
+      <w:r>
+        <w:rPr>
+          <w:rFonts w:ascii="Hiragino Sans" w:hAnsi="Hiragino Sans" w:cs="Hiragino Sans"/>
+          <w:sz w:val="29"/>
+          <w:sz-cs w:val="29"/>
+          <w:spacing w:val="0"/>
+        </w:rPr>
+        <w:t xml:space="preserve"/>
+      </w:r>
+    </w:p>
+    <w:p>
+      <w:pPr>
         <w:ind w:left="720" w:first-line="-720"/>
         <w:spacing w:after="106"/>
       </w:pPr>
@@ -3088,6 +3112,30 @@
     </w:p>
     <w:p>
       <w:pPr>
+        <w:spacing w:after="240"/>
+      </w:pPr>
+      <w:r>
+        <w:rPr>
+          <w:rFonts w:ascii="Hiragino Sans" w:hAnsi="Hiragino Sans" w:cs="Hiragino Sans"/>
+          <w:sz w:val="29"/>
+          <w:sz-cs w:val="29"/>
+          <w:b/>
+          <w:spacing w:val="0"/>
+        </w:rPr>
+        <w:t xml:space="preserve">＜当日＞</w:t>
+      </w:r>
+      <w:r>
+        <w:rPr>
+          <w:rFonts w:ascii="Hiragino Sans" w:hAnsi="Hiragino Sans" w:cs="Hiragino Sans"/>
+          <w:sz w:val="29"/>
+          <w:sz-cs w:val="29"/>
+          <w:spacing w:val="0"/>
+        </w:rPr>
+        <w:t xml:space="preserve"/>
+      </w:r>
+    </w:p>
+    <w:p>
+      <w:pPr>
         <w:ind w:left="720" w:first-line="-720"/>
         <w:spacing w:after="106"/>
       </w:pPr>
@@ -3153,6 +3201,30 @@
     </w:p>
     <w:p>
       <w:pPr>
+        <w:spacing w:after="240"/>
+      </w:pPr>
+      <w:r>
+        <w:rPr>
+          <w:rFonts w:ascii="Hiragino Sans" w:hAnsi="Hiragino Sans" w:cs="Hiragino Sans"/>
+          <w:sz w:val="29"/>
+          <w:sz-cs w:val="29"/>
+          <w:b/>
+          <w:spacing w:val="0"/>
+        </w:rPr>
+        <w:t xml:space="preserve">＜後日・ファンミーティング＞</w:t>
+      </w:r>
+      <w:r>
+        <w:rPr>
+          <w:rFonts w:ascii="Hiragino Sans" w:hAnsi="Hiragino Sans" w:cs="Hiragino Sans"/>
+          <w:sz w:val="29"/>
+          <w:sz-cs w:val="29"/>
+          <w:spacing w:val="0"/>
+        </w:rPr>
+        <w:t xml:space="preserve">（2026年11月・ユグドラシル本店）</w:t>
+      </w:r>
+    </w:p>
+    <w:p>
+      <w:pPr>
         <w:ind w:left="720" w:first-line="-720"/>
         <w:spacing w:after="106"/>
       </w:pPr>
@@ -3177,25 +3249,16 @@
           <w:b/>
           <w:spacing w:val="0"/>
         </w:rPr>
-        <w:t xml:space="preserve">ファンミーティング</w:t>
-      </w:r>
-      <w:r>
-        <w:rPr>
-          <w:rFonts w:ascii="Hiragino Sans" w:hAnsi="Hiragino Sans" w:cs="Hiragino Sans"/>
-          <w:sz w:val="29"/>
-          <w:sz-cs w:val="29"/>
-          <w:spacing w:val="0"/>
-        </w:rPr>
-        <w:t xml:space="preserve">（2026年11月・ユグドラシル本店）</w:t>
-      </w:r>
-      <w:r>
-        <w:rPr>
-          <w:rFonts w:ascii="Hiragino Sans" w:hAnsi="Hiragino Sans" w:cs="Hiragino Sans"/>
-          <w:sz w:val="29"/>
-          <w:sz-cs w:val="29"/>
-          <w:spacing w:val="0"/>
-        </w:rPr>
-        <w:t xml:space="preserve">〔日程は調整中〕</w:t>
+        <w:t xml:space="preserve">ファンミーティングへのご参加</w:t>
+      </w:r>
+      <w:r>
+        <w:rPr>
+          <w:rFonts w:ascii="Hiragino Sans" w:hAnsi="Hiragino Sans" w:cs="Hiragino Sans"/>
+          <w:sz w:val="29"/>
+          <w:sz-cs w:val="29"/>
+          <w:spacing w:val="0"/>
+        </w:rPr>
+        <w:t xml:space="preserve">〔内容・日程は調整中〕</w:t>
       </w:r>
       <w:r>
         <w:rPr>
@@ -3242,6 +3305,30 @@
           <w:spacing w:val="0"/>
         </w:rPr>
         <w:t xml:space="preserve">〔15口／同伴1名まで可（計30名）／17:45 先行入場〕</w:t>
+      </w:r>
+      <w:r>
+        <w:rPr>
+          <w:rFonts w:ascii="Hiragino Sans" w:hAnsi="Hiragino Sans" w:cs="Hiragino Sans"/>
+          <w:sz w:val="29"/>
+          <w:sz-cs w:val="29"/>
+          <w:spacing w:val="0"/>
+        </w:rPr>
+        <w:t xml:space="preserve"/>
+      </w:r>
+    </w:p>
+    <w:p>
+      <w:pPr>
+        <w:spacing w:after="240"/>
+      </w:pPr>
+      <w:r>
+        <w:rPr>
+          <w:rFonts w:ascii="Hiragino Sans" w:hAnsi="Hiragino Sans" w:cs="Hiragino Sans"/>
+          <w:sz w:val="29"/>
+          <w:sz-cs w:val="29"/>
+          <w:b/>
+          <w:spacing w:val="0"/>
+        </w:rPr>
+        <w:t xml:space="preserve">＜当日＞</w:t>
       </w:r>
       <w:r>
         <w:rPr>
@@ -3310,6 +3397,7 @@
           <w:rFonts w:ascii="Hiragino Sans" w:hAnsi="Hiragino Sans" w:cs="Hiragino Sans"/>
           <w:sz w:val="29"/>
           <w:sz-cs w:val="29"/>
+          <w:b/>
         </w:rPr>
         <w:t xml:space="preserve"/>
         <w:tab/>
@@ -3322,9 +3410,19 @@
           <w:rFonts w:ascii="Hiragino Sans" w:hAnsi="Hiragino Sans" w:cs="Hiragino Sans"/>
           <w:sz w:val="29"/>
           <w:sz-cs w:val="29"/>
-          <w:spacing w:val="0"/>
-        </w:rPr>
-        <w:t xml:space="preserve">MIO とのチェキ撮影（お一人1分）</w:t>
+          <w:b/>
+          <w:spacing w:val="0"/>
+        </w:rPr>
+        <w:t xml:space="preserve">MIO とのチェキ撮影</w:t>
+      </w:r>
+      <w:r>
+        <w:rPr>
+          <w:rFonts w:ascii="Hiragino Sans" w:hAnsi="Hiragino Sans" w:cs="Hiragino Sans"/>
+          <w:sz w:val="29"/>
+          <w:sz-cs w:val="29"/>
+          <w:spacing w:val="0"/>
+        </w:rPr>
+        <w:t xml:space="preserve">（お一人1分）</w:t>
       </w:r>
     </w:p>
     <w:p>
@@ -3353,16 +3451,16 @@
           <w:b/>
           <w:spacing w:val="0"/>
         </w:rPr>
-        <w:t xml:space="preserve">やしろ語録動画</w:t>
-      </w:r>
-      <w:r>
-        <w:rPr>
-          <w:rFonts w:ascii="Hiragino Sans" w:hAnsi="Hiragino Sans" w:cs="Hiragino Sans"/>
-          <w:sz w:val="29"/>
-          <w:sz-cs w:val="29"/>
-          <w:spacing w:val="0"/>
-        </w:rPr>
-        <w:t xml:space="preserve">（MIO の言葉を1つ選び、本人に語ってもらい撮影）</w:t>
+        <w:t xml:space="preserve">限定名刺</w:t>
+      </w:r>
+      <w:r>
+        <w:rPr>
+          <w:rFonts w:ascii="Hiragino Sans" w:hAnsi="Hiragino Sans" w:cs="Hiragino Sans"/>
+          <w:sz w:val="29"/>
+          <w:sz-cs w:val="29"/>
+          <w:spacing w:val="0"/>
+        </w:rPr>
+        <w:t xml:space="preserve">（QRコードから限定シャンパンコール動画を視聴できます）</w:t>
       </w:r>
     </w:p>
     <w:p>
@@ -3391,16 +3489,34 @@
           <w:b/>
           <w:spacing w:val="0"/>
         </w:rPr>
-        <w:t xml:space="preserve">限定名刺</w:t>
-      </w:r>
-      <w:r>
-        <w:rPr>
-          <w:rFonts w:ascii="Hiragino Sans" w:hAnsi="Hiragino Sans" w:cs="Hiragino Sans"/>
-          <w:sz w:val="29"/>
-          <w:sz-cs w:val="29"/>
-          <w:spacing w:val="0"/>
-        </w:rPr>
-        <w:t xml:space="preserve">（QRコードから限定シャンパンコール動画を視聴できます）</w:t>
+        <w:t xml:space="preserve">ノベルティ</w:t>
+      </w:r>
+      <w:r>
+        <w:rPr>
+          <w:rFonts w:ascii="Hiragino Sans" w:hAnsi="Hiragino Sans" w:cs="Hiragino Sans"/>
+          <w:sz w:val="29"/>
+          <w:sz-cs w:val="29"/>
+          <w:spacing w:val="0"/>
+        </w:rPr>
+        <w:t xml:space="preserve">（ノート・ペン）</w:t>
+      </w:r>
+      <w:r>
+        <w:rPr>
+          <w:rFonts w:ascii="Hiragino Sans" w:hAnsi="Hiragino Sans" w:cs="Hiragino Sans"/>
+          <w:sz w:val="29"/>
+          <w:sz-cs w:val="29"/>
+          <w:spacing w:val="0"/>
+        </w:rPr>
+        <w:t xml:space="preserve">〔デザインは調整中〕</w:t>
+      </w:r>
+      <w:r>
+        <w:rPr>
+          <w:rFonts w:ascii="Hiragino Sans" w:hAnsi="Hiragino Sans" w:cs="Hiragino Sans"/>
+          <w:sz w:val="29"/>
+          <w:sz-cs w:val="29"/>
+          <w:spacing w:val="0"/>
+        </w:rPr>
+        <w:t xml:space="preserve"/>
       </w:r>
     </w:p>
     <w:p>
@@ -3413,7 +3529,6 @@
           <w:rFonts w:ascii="Hiragino Sans" w:hAnsi="Hiragino Sans" w:cs="Hiragino Sans"/>
           <w:sz w:val="29"/>
           <w:sz-cs w:val="29"/>
-          <w:b/>
         </w:rPr>
         <w:t xml:space="preserve"/>
         <w:tab/>
@@ -3426,37 +3541,9 @@
           <w:rFonts w:ascii="Hiragino Sans" w:hAnsi="Hiragino Sans" w:cs="Hiragino Sans"/>
           <w:sz w:val="29"/>
           <w:sz-cs w:val="29"/>
-          <w:b/>
-          <w:spacing w:val="0"/>
-        </w:rPr>
-        <w:t xml:space="preserve">ノベルティ</w:t>
-      </w:r>
-      <w:r>
-        <w:rPr>
-          <w:rFonts w:ascii="Hiragino Sans" w:hAnsi="Hiragino Sans" w:cs="Hiragino Sans"/>
-          <w:sz w:val="29"/>
-          <w:sz-cs w:val="29"/>
-          <w:spacing w:val="0"/>
-        </w:rPr>
-        <w:t xml:space="preserve">（ノート・ペン）</w:t>
-      </w:r>
-      <w:r>
-        <w:rPr>
-          <w:rFonts w:ascii="Hiragino Sans" w:hAnsi="Hiragino Sans" w:cs="Hiragino Sans"/>
-          <w:sz w:val="29"/>
-          <w:sz-cs w:val="29"/>
-          <w:spacing w:val="0"/>
-        </w:rPr>
-        <w:t xml:space="preserve">〔デザインは調整中〕</w:t>
-      </w:r>
-      <w:r>
-        <w:rPr>
-          <w:rFonts w:ascii="Hiragino Sans" w:hAnsi="Hiragino Sans" w:cs="Hiragino Sans"/>
-          <w:sz w:val="29"/>
-          <w:sz-cs w:val="29"/>
-          <w:spacing w:val="0"/>
-        </w:rPr>
-        <w:t xml:space="preserve"/>
+          <w:spacing w:val="0"/>
+        </w:rPr>
+        <w:t xml:space="preserve">アコースティックライブ観覧</w:t>
       </w:r>
     </w:p>
     <w:p>
@@ -3485,7 +3572,31 @@
           <w:b/>
           <w:spacing w:val="0"/>
         </w:rPr>
-        <w:t xml:space="preserve">ファンミーティング</w:t>
+        <w:t xml:space="preserve">同伴の方を1名までお連れいただけます</w:t>
+      </w:r>
+      <w:r>
+        <w:rPr>
+          <w:rFonts w:ascii="Hiragino Sans" w:hAnsi="Hiragino Sans" w:cs="Hiragino Sans"/>
+          <w:sz w:val="29"/>
+          <w:sz-cs w:val="29"/>
+          <w:spacing w:val="0"/>
+        </w:rPr>
+        <w:t xml:space="preserve"/>
+      </w:r>
+    </w:p>
+    <w:p>
+      <w:pPr>
+        <w:spacing w:after="240"/>
+      </w:pPr>
+      <w:r>
+        <w:rPr>
+          <w:rFonts w:ascii="Hiragino Sans" w:hAnsi="Hiragino Sans" w:cs="Hiragino Sans"/>
+          <w:sz w:val="29"/>
+          <w:sz-cs w:val="29"/>
+          <w:b/>
+          <w:spacing w:val="0"/>
+        </w:rPr>
+        <w:t xml:space="preserve">＜後日・ファンミーティング＞</w:t>
       </w:r>
       <w:r>
         <w:rPr>
@@ -3495,57 +3606,6 @@
           <w:spacing w:val="0"/>
         </w:rPr>
         <w:t xml:space="preserve">（2026年11月・ユグドラシル本店）</w:t>
-      </w:r>
-      <w:r>
-        <w:rPr>
-          <w:rFonts w:ascii="Hiragino Sans" w:hAnsi="Hiragino Sans" w:cs="Hiragino Sans"/>
-          <w:sz w:val="29"/>
-          <w:sz-cs w:val="29"/>
-          <w:spacing w:val="0"/>
-        </w:rPr>
-        <w:t xml:space="preserve">〔日程は調整中〕</w:t>
-      </w:r>
-      <w:r>
-        <w:rPr>
-          <w:rFonts w:ascii="Hiragino Sans" w:hAnsi="Hiragino Sans" w:cs="Hiragino Sans"/>
-          <w:sz w:val="29"/>
-          <w:sz-cs w:val="29"/>
-          <w:spacing w:val="0"/>
-        </w:rPr>
-        <w:t xml:space="preserve"/>
-      </w:r>
-    </w:p>
-    <w:p>
-      <w:pPr>
-        <w:spacing w:after="240"/>
-      </w:pPr>
-      <w:r>
-        <w:rPr>
-          <w:rFonts w:ascii="Hiragino Sans" w:hAnsi="Hiragino Sans" w:cs="Hiragino Sans"/>
-          <w:sz w:val="29"/>
-          <w:sz-cs w:val="29"/>
-          <w:spacing w:val="0"/>
-        </w:rPr>
-        <w:t xml:space="preserve">※ </w:t>
-      </w:r>
-      <w:r>
-        <w:rPr>
-          <w:rFonts w:ascii="Hiragino Sans" w:hAnsi="Hiragino Sans" w:cs="Hiragino Sans"/>
-          <w:sz w:val="29"/>
-          <w:sz-cs w:val="29"/>
-          <w:b/>
-          <w:spacing w:val="0"/>
-        </w:rPr>
-        <w:t xml:space="preserve">やしろ語録動画の撮影はこちらで行います</w:t>
-      </w:r>
-      <w:r>
-        <w:rPr>
-          <w:rFonts w:ascii="Hiragino Sans" w:hAnsi="Hiragino Sans" w:cs="Hiragino Sans"/>
-          <w:sz w:val="29"/>
-          <w:sz-cs w:val="29"/>
-          <w:spacing w:val="0"/>
-        </w:rPr>
-        <w:t xml:space="preserve"/>
       </w:r>
     </w:p>
     <w:p>
@@ -3558,6 +3618,7 @@
           <w:rFonts w:ascii="Hiragino Sans" w:hAnsi="Hiragino Sans" w:cs="Hiragino Sans"/>
           <w:sz w:val="29"/>
           <w:sz-cs w:val="29"/>
+          <w:b/>
         </w:rPr>
         <w:t xml:space="preserve"/>
         <w:tab/>
@@ -3570,9 +3631,28 @@
           <w:rFonts w:ascii="Hiragino Sans" w:hAnsi="Hiragino Sans" w:cs="Hiragino Sans"/>
           <w:sz w:val="29"/>
           <w:sz-cs w:val="29"/>
-          <w:spacing w:val="0"/>
-        </w:rPr>
-        <w:t xml:space="preserve">アコースティックライブ観覧</w:t>
+          <w:b/>
+          <w:spacing w:val="0"/>
+        </w:rPr>
+        <w:t xml:space="preserve">ファンミーティングへのご参加</w:t>
+      </w:r>
+      <w:r>
+        <w:rPr>
+          <w:rFonts w:ascii="Hiragino Sans" w:hAnsi="Hiragino Sans" w:cs="Hiragino Sans"/>
+          <w:sz w:val="29"/>
+          <w:sz-cs w:val="29"/>
+          <w:spacing w:val="0"/>
+        </w:rPr>
+        <w:t xml:space="preserve">〔内容・日程は調整中〕</w:t>
+      </w:r>
+      <w:r>
+        <w:rPr>
+          <w:rFonts w:ascii="Hiragino Sans" w:hAnsi="Hiragino Sans" w:cs="Hiragino Sans"/>
+          <w:sz w:val="29"/>
+          <w:sz-cs w:val="29"/>
+          <w:spacing w:val="0"/>
+        </w:rPr>
+        <w:t xml:space="preserve"/>
       </w:r>
     </w:p>
     <w:p>
@@ -3601,7 +3681,40 @@
           <w:b/>
           <w:spacing w:val="0"/>
         </w:rPr>
-        <w:t xml:space="preserve">同伴の方を1名までお連れいただけます</w:t>
+        <w:t xml:space="preserve">やしろ語録動画</w:t>
+      </w:r>
+      <w:r>
+        <w:rPr>
+          <w:rFonts w:ascii="Hiragino Sans" w:hAnsi="Hiragino Sans" w:cs="Hiragino Sans"/>
+          <w:sz w:val="29"/>
+          <w:sz-cs w:val="29"/>
+          <w:spacing w:val="0"/>
+        </w:rPr>
+        <w:t xml:space="preserve">（MIO の言葉を1つ選び、本人に語ってもらい撮影）</w:t>
+      </w:r>
+    </w:p>
+    <w:p>
+      <w:pPr>
+        <w:spacing w:after="240"/>
+      </w:pPr>
+      <w:r>
+        <w:rPr>
+          <w:rFonts w:ascii="Hiragino Sans" w:hAnsi="Hiragino Sans" w:cs="Hiragino Sans"/>
+          <w:sz w:val="29"/>
+          <w:sz-cs w:val="29"/>
+          <w:spacing w:val="0"/>
+        </w:rPr>
+        <w:t xml:space="preserve">※ </w:t>
+      </w:r>
+      <w:r>
+        <w:rPr>
+          <w:rFonts w:ascii="Hiragino Sans" w:hAnsi="Hiragino Sans" w:cs="Hiragino Sans"/>
+          <w:sz w:val="29"/>
+          <w:sz-cs w:val="29"/>
+          <w:b/>
+          <w:spacing w:val="0"/>
+        </w:rPr>
+        <w:t xml:space="preserve">撮影はファンミーティングの場で行います</w:t>
       </w:r>
       <w:r>
         <w:rPr>
@@ -3672,6 +3785,30 @@
           <w:spacing w:val="0"/>
         </w:rPr>
         <w:t xml:space="preserve">〔10口／同伴1名まで可（計20名）／20:10〜21:10〕</w:t>
+      </w:r>
+      <w:r>
+        <w:rPr>
+          <w:rFonts w:ascii="Hiragino Sans" w:hAnsi="Hiragino Sans" w:cs="Hiragino Sans"/>
+          <w:sz w:val="29"/>
+          <w:sz-cs w:val="29"/>
+          <w:spacing w:val="0"/>
+        </w:rPr>
+        <w:t xml:space="preserve"/>
+      </w:r>
+    </w:p>
+    <w:p>
+      <w:pPr>
+        <w:spacing w:after="240"/>
+      </w:pPr>
+      <w:r>
+        <w:rPr>
+          <w:rFonts w:ascii="Hiragino Sans" w:hAnsi="Hiragino Sans" w:cs="Hiragino Sans"/>
+          <w:sz w:val="29"/>
+          <w:sz-cs w:val="29"/>
+          <w:b/>
+          <w:spacing w:val="0"/>
+        </w:rPr>
+        <w:t xml:space="preserve">＜当日＞</w:t>
       </w:r>
       <w:r>
         <w:rPr>
@@ -3788,7 +3925,6 @@
           <w:rFonts w:ascii="Hiragino Sans" w:hAnsi="Hiragino Sans" w:cs="Hiragino Sans"/>
           <w:sz w:val="29"/>
           <w:sz-cs w:val="29"/>
-          <w:b/>
         </w:rPr>
         <w:t xml:space="preserve"/>
         <w:tab/>
@@ -3801,28 +3937,9 @@
           <w:rFonts w:ascii="Hiragino Sans" w:hAnsi="Hiragino Sans" w:cs="Hiragino Sans"/>
           <w:sz w:val="29"/>
           <w:sz-cs w:val="29"/>
-          <w:b/>
-          <w:spacing w:val="0"/>
-        </w:rPr>
-        <w:t xml:space="preserve">シャンパンサービス</w:t>
-      </w:r>
-      <w:r>
-        <w:rPr>
-          <w:rFonts w:ascii="Hiragino Sans" w:hAnsi="Hiragino Sans" w:cs="Hiragino Sans"/>
-          <w:sz w:val="29"/>
-          <w:sz-cs w:val="29"/>
-          <w:spacing w:val="0"/>
-        </w:rPr>
-        <w:t xml:space="preserve">〔銘柄・本数は調整中〕</w:t>
-      </w:r>
-      <w:r>
-        <w:rPr>
-          <w:rFonts w:ascii="Hiragino Sans" w:hAnsi="Hiragino Sans" w:cs="Hiragino Sans"/>
-          <w:sz w:val="29"/>
-          <w:sz-cs w:val="29"/>
-          <w:spacing w:val="0"/>
-        </w:rPr>
-        <w:t xml:space="preserve"/>
+          <w:spacing w:val="0"/>
+        </w:rPr>
+        <w:t xml:space="preserve">チェキ／写真／動画OK</w:t>
       </w:r>
     </w:p>
     <w:p>
@@ -3835,6 +3952,7 @@
           <w:rFonts w:ascii="Hiragino Sans" w:hAnsi="Hiragino Sans" w:cs="Hiragino Sans"/>
           <w:sz w:val="29"/>
           <w:sz-cs w:val="29"/>
+          <w:b/>
         </w:rPr>
         <w:t xml:space="preserve"/>
         <w:tab/>
@@ -3847,9 +3965,19 @@
           <w:rFonts w:ascii="Hiragino Sans" w:hAnsi="Hiragino Sans" w:cs="Hiragino Sans"/>
           <w:sz w:val="29"/>
           <w:sz-cs w:val="29"/>
-          <w:spacing w:val="0"/>
-        </w:rPr>
-        <w:t xml:space="preserve">チェキ／写真／動画OK</w:t>
+          <w:b/>
+          <w:spacing w:val="0"/>
+        </w:rPr>
+        <w:t xml:space="preserve">限定名刺</w:t>
+      </w:r>
+      <w:r>
+        <w:rPr>
+          <w:rFonts w:ascii="Hiragino Sans" w:hAnsi="Hiragino Sans" w:cs="Hiragino Sans"/>
+          <w:sz w:val="29"/>
+          <w:sz-cs w:val="29"/>
+          <w:spacing w:val="0"/>
+        </w:rPr>
+        <w:t xml:space="preserve">（QRコードから限定シャンパンコール動画を視聴できます）</w:t>
       </w:r>
     </w:p>
     <w:p>
@@ -3878,16 +4006,34 @@
           <w:b/>
           <w:spacing w:val="0"/>
         </w:rPr>
-        <w:t xml:space="preserve">限定名刺</w:t>
-      </w:r>
-      <w:r>
-        <w:rPr>
-          <w:rFonts w:ascii="Hiragino Sans" w:hAnsi="Hiragino Sans" w:cs="Hiragino Sans"/>
-          <w:sz w:val="29"/>
-          <w:sz-cs w:val="29"/>
-          <w:spacing w:val="0"/>
-        </w:rPr>
-        <w:t xml:space="preserve">（QRコードから限定シャンパンコール動画を視聴できます）</w:t>
+        <w:t xml:space="preserve">ノベルティ</w:t>
+      </w:r>
+      <w:r>
+        <w:rPr>
+          <w:rFonts w:ascii="Hiragino Sans" w:hAnsi="Hiragino Sans" w:cs="Hiragino Sans"/>
+          <w:sz w:val="29"/>
+          <w:sz-cs w:val="29"/>
+          <w:spacing w:val="0"/>
+        </w:rPr>
+        <w:t xml:space="preserve">（ノート・ペン・トートバッグ・キーホルダーほか）</w:t>
+      </w:r>
+      <w:r>
+        <w:rPr>
+          <w:rFonts w:ascii="Hiragino Sans" w:hAnsi="Hiragino Sans" w:cs="Hiragino Sans"/>
+          <w:sz w:val="29"/>
+          <w:sz-cs w:val="29"/>
+          <w:spacing w:val="0"/>
+        </w:rPr>
+        <w:t xml:space="preserve">〔内容・デザインは調整中〕</w:t>
+      </w:r>
+      <w:r>
+        <w:rPr>
+          <w:rFonts w:ascii="Hiragino Sans" w:hAnsi="Hiragino Sans" w:cs="Hiragino Sans"/>
+          <w:sz w:val="29"/>
+          <w:sz-cs w:val="29"/>
+          <w:spacing w:val="0"/>
+        </w:rPr>
+        <w:t xml:space="preserve"/>
       </w:r>
     </w:p>
     <w:p>
@@ -3900,7 +4046,6 @@
           <w:rFonts w:ascii="Hiragino Sans" w:hAnsi="Hiragino Sans" w:cs="Hiragino Sans"/>
           <w:sz w:val="29"/>
           <w:sz-cs w:val="29"/>
-          <w:b/>
         </w:rPr>
         <w:t xml:space="preserve"/>
         <w:tab/>
@@ -3913,37 +4058,9 @@
           <w:rFonts w:ascii="Hiragino Sans" w:hAnsi="Hiragino Sans" w:cs="Hiragino Sans"/>
           <w:sz w:val="29"/>
           <w:sz-cs w:val="29"/>
-          <w:b/>
-          <w:spacing w:val="0"/>
-        </w:rPr>
-        <w:t xml:space="preserve">ノベルティ</w:t>
-      </w:r>
-      <w:r>
-        <w:rPr>
-          <w:rFonts w:ascii="Hiragino Sans" w:hAnsi="Hiragino Sans" w:cs="Hiragino Sans"/>
-          <w:sz w:val="29"/>
-          <w:sz-cs w:val="29"/>
-          <w:spacing w:val="0"/>
-        </w:rPr>
-        <w:t xml:space="preserve">（ノート・ペン・トートバッグ・キーホルダーほか）</w:t>
-      </w:r>
-      <w:r>
-        <w:rPr>
-          <w:rFonts w:ascii="Hiragino Sans" w:hAnsi="Hiragino Sans" w:cs="Hiragino Sans"/>
-          <w:sz w:val="29"/>
-          <w:sz-cs w:val="29"/>
-          <w:spacing w:val="0"/>
-        </w:rPr>
-        <w:t xml:space="preserve">〔内容・デザインは調整中〕</w:t>
-      </w:r>
-      <w:r>
-        <w:rPr>
-          <w:rFonts w:ascii="Hiragino Sans" w:hAnsi="Hiragino Sans" w:cs="Hiragino Sans"/>
-          <w:sz w:val="29"/>
-          <w:sz-cs w:val="29"/>
-          <w:spacing w:val="0"/>
-        </w:rPr>
-        <w:t xml:space="preserve"/>
+          <w:spacing w:val="0"/>
+        </w:rPr>
+        <w:t xml:space="preserve">アコースティックライブ観覧</w:t>
       </w:r>
     </w:p>
     <w:p>
@@ -3956,6 +4073,7 @@
           <w:rFonts w:ascii="Hiragino Sans" w:hAnsi="Hiragino Sans" w:cs="Hiragino Sans"/>
           <w:sz w:val="29"/>
           <w:sz-cs w:val="29"/>
+          <w:b/>
         </w:rPr>
         <w:t xml:space="preserve"/>
         <w:tab/>
@@ -3968,9 +4086,43 @@
           <w:rFonts w:ascii="Hiragino Sans" w:hAnsi="Hiragino Sans" w:cs="Hiragino Sans"/>
           <w:sz w:val="29"/>
           <w:sz-cs w:val="29"/>
-          <w:spacing w:val="0"/>
-        </w:rPr>
-        <w:t xml:space="preserve">アコースティックライブ観覧</w:t>
+          <w:b/>
+          <w:spacing w:val="0"/>
+        </w:rPr>
+        <w:t xml:space="preserve">同伴の方を1名までお連れいただけます</w:t>
+      </w:r>
+      <w:r>
+        <w:rPr>
+          <w:rFonts w:ascii="Hiragino Sans" w:hAnsi="Hiragino Sans" w:cs="Hiragino Sans"/>
+          <w:sz w:val="29"/>
+          <w:sz-cs w:val="29"/>
+          <w:spacing w:val="0"/>
+        </w:rPr>
+        <w:t xml:space="preserve"/>
+      </w:r>
+    </w:p>
+    <w:p>
+      <w:pPr>
+        <w:spacing w:after="240"/>
+      </w:pPr>
+      <w:r>
+        <w:rPr>
+          <w:rFonts w:ascii="Hiragino Sans" w:hAnsi="Hiragino Sans" w:cs="Hiragino Sans"/>
+          <w:sz w:val="29"/>
+          <w:sz-cs w:val="29"/>
+          <w:b/>
+          <w:spacing w:val="0"/>
+        </w:rPr>
+        <w:t xml:space="preserve">＜後日・ファンミーティング＞</w:t>
+      </w:r>
+      <w:r>
+        <w:rPr>
+          <w:rFonts w:ascii="Hiragino Sans" w:hAnsi="Hiragino Sans" w:cs="Hiragino Sans"/>
+          <w:sz w:val="29"/>
+          <w:sz-cs w:val="29"/>
+          <w:spacing w:val="0"/>
+        </w:rPr>
+        <w:t xml:space="preserve">（2026年11月・ユグドラシル本店）</w:t>
       </w:r>
     </w:p>
     <w:p>
@@ -3999,7 +4151,35 @@
           <w:b/>
           <w:spacing w:val="0"/>
         </w:rPr>
-        <w:t xml:space="preserve">同伴の方を1名までお連れいただけます</w:t>
+        <w:t xml:space="preserve">30分間のグループセッション</w:t>
+      </w:r>
+      <w:r>
+        <w:rPr>
+          <w:rFonts w:ascii="Hiragino Sans" w:hAnsi="Hiragino Sans" w:cs="Hiragino Sans"/>
+          <w:sz w:val="29"/>
+          <w:sz-cs w:val="29"/>
+          <w:spacing w:val="0"/>
+        </w:rPr>
+        <w:t xml:space="preserve">、または </w:t>
+      </w:r>
+      <w:r>
+        <w:rPr>
+          <w:rFonts w:ascii="Hiragino Sans" w:hAnsi="Hiragino Sans" w:cs="Hiragino Sans"/>
+          <w:sz w:val="29"/>
+          <w:sz-cs w:val="29"/>
+          <w:b/>
+          <w:spacing w:val="0"/>
+        </w:rPr>
+        <w:t xml:space="preserve">MIO への Q&amp;A</w:t>
+      </w:r>
+      <w:r>
+        <w:rPr>
+          <w:rFonts w:ascii="Hiragino Sans" w:hAnsi="Hiragino Sans" w:cs="Hiragino Sans"/>
+          <w:sz w:val="29"/>
+          <w:sz-cs w:val="29"/>
+          <w:spacing w:val="0"/>
+        </w:rPr>
+        <w:t xml:space="preserve">〔いずれかを調整中〕</w:t>
       </w:r>
       <w:r>
         <w:rPr>
@@ -4182,6 +4362,30 @@
     </w:p>
     <w:p>
       <w:pPr>
+        <w:spacing w:after="240"/>
+      </w:pPr>
+      <w:r>
+        <w:rPr>
+          <w:rFonts w:ascii="Hiragino Sans" w:hAnsi="Hiragino Sans" w:cs="Hiragino Sans"/>
+          <w:sz w:val="29"/>
+          <w:sz-cs w:val="29"/>
+          <w:b/>
+          <w:spacing w:val="0"/>
+        </w:rPr>
+        <w:t xml:space="preserve">＜後日・郵送＞</w:t>
+      </w:r>
+      <w:r>
+        <w:rPr>
+          <w:rFonts w:ascii="Hiragino Sans" w:hAnsi="Hiragino Sans" w:cs="Hiragino Sans"/>
+          <w:sz w:val="29"/>
+          <w:sz-cs w:val="29"/>
+          <w:spacing w:val="0"/>
+        </w:rPr>
+        <w:t xml:space="preserve"/>
+      </w:r>
+    </w:p>
+    <w:p>
+      <w:pPr>
         <w:ind w:left="720" w:first-line="-720"/>
         <w:spacing w:after="106"/>
       </w:pPr>
@@ -4243,7 +4447,7 @@
           <w:b/>
           <w:spacing w:val="0"/>
         </w:rPr>
-        <w:t xml:space="preserve">■ ファンミーティングについて最前列席・S席・MIOタイム</w:t>
+        <w:t xml:space="preserve">■ ファンミーティングについて50,000円以上のコース（最前列席・S席・MIOタイム・VVIP席）</w:t>
       </w:r>
       <w:r>
         <w:rPr>
@@ -4281,7 +4485,7 @@
           <w:b/>
           <w:spacing w:val="0"/>
         </w:rPr>
-        <w:t xml:space="preserve">2026年11月中</w:t>
+        <w:t xml:space="preserve">コースによって内容が変わります。2026年11月中</w:t>
       </w:r>
       <w:r>
         <w:rPr>
@@ -5560,7 +5764,7 @@
           <w:sz-cs w:val="29"/>
           <w:spacing w:val="0"/>
         </w:rPr>
-        <w:t xml:space="preserve">A. MIO と対面で、6分前後お話しいただけます。あわせてシャンパンサービス、チェキ・写真・動画の撮影、限定名刺をご用意しています。</w:t>
+        <w:t xml:space="preserve">A. 当日は、MIO と対面で6分前後お話しいただけます。あわせてお好きなお席をお選びいただけるほか、チェキ・写真・動画の撮影、限定名刺、ノベルティをご用意しています。後日のファンミーティングでは、30分間のグループセッション、または MIO への Q&amp;A にご参加いただけます。</w:t>
       </w:r>
     </w:p>
     <w:p>

</xml_diff>

<commit_message>
charity: say up front that the seats are shared
Someone paying 150,000 or 330,000 should know before they buy that the
table is not theirs alone. It leads the 支援コース section, sits on both
seated courses, appears in the closing notes, and gets its own FAQ
entry, so there is no way to reach checkout without having read it.

Co-Authored-By: Claude Opus 5 <noreply@anthropic.com>
</commit_message>
<xml_diff>
--- a/docs/campfire-body-edit.docx
+++ b/docs/campfire-body-edit.docx
@@ -2968,6 +2968,30 @@
       </w:r>
     </w:p>
     <w:p>
+      <w:pPr>
+        <w:spacing w:after="240"/>
+      </w:pPr>
+      <w:r>
+        <w:rPr>
+          <w:rFonts w:ascii="Hiragino Sans" w:hAnsi="Hiragino Sans" w:cs="Hiragino Sans"/>
+          <w:sz w:val="29"/>
+          <w:sz-cs w:val="29"/>
+          <w:b/>
+          <w:spacing w:val="0"/>
+        </w:rPr>
+        <w:t xml:space="preserve">※ お席のあるコース（S席・MIOタイム／VVIP席）は、すべて相席となります。グループごとの個室・貸切ではありませんので、あらかじめご了承ください。</w:t>
+      </w:r>
+      <w:r>
+        <w:rPr>
+          <w:rFonts w:ascii="Hiragino Sans" w:hAnsi="Hiragino Sans" w:cs="Hiragino Sans"/>
+          <w:sz w:val="29"/>
+          <w:sz-cs w:val="29"/>
+          <w:spacing w:val="0"/>
+        </w:rPr>
+        <w:t xml:space="preserve"/>
+      </w:r>
+    </w:p>
+    <w:p>
       <w:pPr/>
       <w:r>
         <w:rPr>
@@ -3384,6 +3408,25 @@
           <w:sz-cs w:val="29"/>
           <w:spacing w:val="0"/>
         </w:rPr>
+        <w:t xml:space="preserve">　※</w:t>
+      </w:r>
+      <w:r>
+        <w:rPr>
+          <w:rFonts w:ascii="Hiragino Sans" w:hAnsi="Hiragino Sans" w:cs="Hiragino Sans"/>
+          <w:sz w:val="29"/>
+          <w:sz-cs w:val="29"/>
+          <w:b/>
+          <w:spacing w:val="0"/>
+        </w:rPr>
+        <w:t xml:space="preserve">相席となります</w:t>
+      </w:r>
+      <w:r>
+        <w:rPr>
+          <w:rFonts w:ascii="Hiragino Sans" w:hAnsi="Hiragino Sans" w:cs="Hiragino Sans"/>
+          <w:sz w:val="29"/>
+          <w:sz-cs w:val="29"/>
+          <w:spacing w:val="0"/>
+        </w:rPr>
         <w:t xml:space="preserve"/>
       </w:r>
     </w:p>
@@ -3912,7 +3955,26 @@
           <w:sz-cs w:val="29"/>
           <w:spacing w:val="0"/>
         </w:rPr>
-        <w:t xml:space="preserve">）</w:t>
+        <w:t xml:space="preserve">）　※</w:t>
+      </w:r>
+      <w:r>
+        <w:rPr>
+          <w:rFonts w:ascii="Hiragino Sans" w:hAnsi="Hiragino Sans" w:cs="Hiragino Sans"/>
+          <w:sz w:val="29"/>
+          <w:sz-cs w:val="29"/>
+          <w:b/>
+          <w:spacing w:val="0"/>
+        </w:rPr>
+        <w:t xml:space="preserve">相席となります</w:t>
+      </w:r>
+      <w:r>
+        <w:rPr>
+          <w:rFonts w:ascii="Hiragino Sans" w:hAnsi="Hiragino Sans" w:cs="Hiragino Sans"/>
+          <w:sz w:val="29"/>
+          <w:sz-cs w:val="29"/>
+          <w:spacing w:val="0"/>
+        </w:rPr>
+        <w:t xml:space="preserve"/>
       </w:r>
     </w:p>
     <w:p>
@@ -4579,7 +4641,26 @@
           <w:sz-cs w:val="29"/>
           <w:spacing w:val="0"/>
         </w:rPr>
-        <w:t xml:space="preserve">※ 物販の実施はありません。※ チケットは電子チケットを2026年10月上旬にメールでお送りします。当日受付にてご提示ください。※ お席は主催者にて指定させていただきます。</w:t>
+        <w:t xml:space="preserve">※ 物販の実施はありません。※ チケットは電子チケットを2026年10月上旬にメールでお送りします。当日受付にてご提示ください。※ お席のあるコースは</w:t>
+      </w:r>
+      <w:r>
+        <w:rPr>
+          <w:rFonts w:ascii="Hiragino Sans" w:hAnsi="Hiragino Sans" w:cs="Hiragino Sans"/>
+          <w:sz w:val="29"/>
+          <w:sz-cs w:val="29"/>
+          <w:b/>
+          <w:spacing w:val="0"/>
+        </w:rPr>
+        <w:t xml:space="preserve">相席</w:t>
+      </w:r>
+      <w:r>
+        <w:rPr>
+          <w:rFonts w:ascii="Hiragino Sans" w:hAnsi="Hiragino Sans" w:cs="Hiragino Sans"/>
+          <w:sz w:val="29"/>
+          <w:sz-cs w:val="29"/>
+          <w:spacing w:val="0"/>
+        </w:rPr>
+        <w:t xml:space="preserve">となります。お席は主催者にて指定させていただきます。（VVIP席のみ、DJ席・V4・V1 より先着順でお選びいただけます）</w:t>
       </w:r>
     </w:p>
     <w:p>
@@ -5589,7 +5670,64 @@
           <w:b/>
           <w:spacing w:val="0"/>
         </w:rPr>
-        <w:t xml:space="preserve">Q5. ファンミーティングの会場について教えてください。</w:t>
+        <w:t xml:space="preserve">Q5. お席は相席になりますか？</w:t>
+      </w:r>
+      <w:r>
+        <w:rPr>
+          <w:rFonts w:ascii="Hiragino Sans" w:hAnsi="Hiragino Sans" w:cs="Hiragino Sans"/>
+          <w:sz w:val="29"/>
+          <w:sz-cs w:val="29"/>
+          <w:spacing w:val="0"/>
+        </w:rPr>
+        <w:t xml:space="preserve"/>
+      </w:r>
+    </w:p>
+    <w:p>
+      <w:pPr>
+        <w:spacing w:after="240"/>
+      </w:pPr>
+      <w:r>
+        <w:rPr>
+          <w:rFonts w:ascii="Hiragino Sans" w:hAnsi="Hiragino Sans" w:cs="Hiragino Sans"/>
+          <w:sz w:val="29"/>
+          <w:sz-cs w:val="29"/>
+          <w:spacing w:val="0"/>
+        </w:rPr>
+        <w:t xml:space="preserve">A. </w:t>
+      </w:r>
+      <w:r>
+        <w:rPr>
+          <w:rFonts w:ascii="Hiragino Sans" w:hAnsi="Hiragino Sans" w:cs="Hiragino Sans"/>
+          <w:sz w:val="29"/>
+          <w:sz-cs w:val="29"/>
+          <w:b/>
+          <w:spacing w:val="0"/>
+        </w:rPr>
+        <w:t xml:space="preserve">はい。お席のあるコース（S席・MIOタイム／VVIP席）は、すべて相席となります。</w:t>
+      </w:r>
+      <w:r>
+        <w:rPr>
+          <w:rFonts w:ascii="Hiragino Sans" w:hAnsi="Hiragino Sans" w:cs="Hiragino Sans"/>
+          <w:sz w:val="29"/>
+          <w:sz-cs w:val="29"/>
+          <w:spacing w:val="0"/>
+        </w:rPr>
+        <w:t xml:space="preserve">グループごとの個室や貸切ではございません。VVIP席のみ、DJ席・V4・V1 のなかからお好きなお席を先着順でお選びいただけます。</w:t>
+      </w:r>
+    </w:p>
+    <w:p>
+      <w:pPr>
+        <w:spacing w:after="240"/>
+      </w:pPr>
+      <w:r>
+        <w:rPr>
+          <w:rFonts w:ascii="Hiragino Sans" w:hAnsi="Hiragino Sans" w:cs="Hiragino Sans"/>
+          <w:sz w:val="29"/>
+          <w:sz-cs w:val="29"/>
+          <w:b/>
+          <w:spacing w:val="0"/>
+        </w:rPr>
+        <w:t xml:space="preserve">Q6. ファンミーティングの会場について教えてください。</w:t>
       </w:r>
       <w:r>
         <w:rPr>
@@ -5684,7 +5822,7 @@
           <w:b/>
           <w:spacing w:val="0"/>
         </w:rPr>
-        <w:t xml:space="preserve">Q6. 支援金は何に使われますか？</w:t>
+        <w:t xml:space="preserve">Q7. 支援金は何に使われますか？</w:t>
       </w:r>
       <w:r>
         <w:rPr>
@@ -5741,7 +5879,7 @@
           <w:b/>
           <w:spacing w:val="0"/>
         </w:rPr>
-        <w:t xml:space="preserve">Q7. VVIP席では何ができますか？</w:t>
+        <w:t xml:space="preserve">Q8. VVIP席では何ができますか？</w:t>
       </w:r>
       <w:r>
         <w:rPr>
@@ -5779,7 +5917,7 @@
           <w:b/>
           <w:spacing w:val="0"/>
         </w:rPr>
-        <w:t xml:space="preserve">Q8.「やしろ語録動画」とは何ですか？</w:t>
+        <w:t xml:space="preserve">Q9.「やしろ語録動画」とは何ですか？</w:t>
       </w:r>
       <w:r>
         <w:rPr>
@@ -5817,7 +5955,7 @@
           <w:b/>
           <w:spacing w:val="0"/>
         </w:rPr>
-        <w:t xml:space="preserve">Q9. 出演者やプログラムは確定していますか？</w:t>
+        <w:t xml:space="preserve">Q10. 出演者やプログラムは確定していますか？</w:t>
       </w:r>
       <w:r>
         <w:rPr>
@@ -5855,7 +5993,7 @@
           <w:b/>
           <w:spacing w:val="0"/>
         </w:rPr>
-        <w:t xml:space="preserve">Q10. 参加に年齢や性別の制限はありますか？</w:t>
+        <w:t xml:space="preserve">Q11. 参加に年齢や性別の制限はありますか？</w:t>
       </w:r>
       <w:r>
         <w:rPr>
@@ -5931,7 +6069,7 @@
           <w:b/>
           <w:spacing w:val="0"/>
         </w:rPr>
-        <w:t xml:space="preserve">Q11. 会場での撮影はできますか？</w:t>
+        <w:t xml:space="preserve">Q12. 会場での撮影はできますか？</w:t>
       </w:r>
       <w:r>
         <w:rPr>
@@ -5969,7 +6107,7 @@
           <w:b/>
           <w:spacing w:val="0"/>
         </w:rPr>
-        <w:t xml:space="preserve">Q12. 支援のキャンセルはできますか？</w:t>
+        <w:t xml:space="preserve">Q13. 支援のキャンセルはできますか？</w:t>
       </w:r>
       <w:r>
         <w:rPr>

</xml_diff>

<commit_message>
charity: name the goods set, list what gets posted, restore the plan
「なりきりしゃーみーグッズ」 turns out to be the collective name for the
notebook, pen, tote and keyring rather than a fifth item, so that is
what every surface calls it now.

Alongside it, what actually gets posted: only the 限定名刺 for シンプル応援
is settled. The goods and the やしろ語録動画 have no decided channel, and
that has to be settled before launch, because CAMPFIRE only collects an
address for returns marked as shipped -- switching to post later leaves
you without one.

Also restores the 2026-09-08 operations plan, which an earlier cleanup
of the superseded seat notes had swallowed along with it, brought up to
the standing front row, the 33万 VVIP and 805万 sold out.

Co-Authored-By: Claude Opus 5 <noreply@anthropic.com>
</commit_message>
<xml_diff>
--- a/docs/campfire-body-edit.docx
+++ b/docs/campfire-body-edit.docx
@@ -3532,7 +3532,7 @@
           <w:b/>
           <w:spacing w:val="0"/>
         </w:rPr>
-        <w:t xml:space="preserve">ノベルティ</w:t>
+        <w:t xml:space="preserve">なりきりしゃーみーグッズ</w:t>
       </w:r>
       <w:r>
         <w:rPr>
@@ -4068,25 +4068,25 @@
           <w:b/>
           <w:spacing w:val="0"/>
         </w:rPr>
-        <w:t xml:space="preserve">ノベルティ</w:t>
-      </w:r>
-      <w:r>
-        <w:rPr>
-          <w:rFonts w:ascii="Hiragino Sans" w:hAnsi="Hiragino Sans" w:cs="Hiragino Sans"/>
-          <w:sz w:val="29"/>
-          <w:sz-cs w:val="29"/>
-          <w:spacing w:val="0"/>
-        </w:rPr>
-        <w:t xml:space="preserve">（ノート・ペン・トートバッグ・キーホルダーほか）</w:t>
-      </w:r>
-      <w:r>
-        <w:rPr>
-          <w:rFonts w:ascii="Hiragino Sans" w:hAnsi="Hiragino Sans" w:cs="Hiragino Sans"/>
-          <w:sz w:val="29"/>
-          <w:sz-cs w:val="29"/>
-          <w:spacing w:val="0"/>
-        </w:rPr>
-        <w:t xml:space="preserve">〔内容・デザインは調整中〕</w:t>
+        <w:t xml:space="preserve">なりきりしゃーみーグッズ</w:t>
+      </w:r>
+      <w:r>
+        <w:rPr>
+          <w:rFonts w:ascii="Hiragino Sans" w:hAnsi="Hiragino Sans" w:cs="Hiragino Sans"/>
+          <w:sz w:val="29"/>
+          <w:sz-cs w:val="29"/>
+          <w:spacing w:val="0"/>
+        </w:rPr>
+        <w:t xml:space="preserve">（ノート・ペン・トートバッグ・キーホルダー）</w:t>
+      </w:r>
+      <w:r>
+        <w:rPr>
+          <w:rFonts w:ascii="Hiragino Sans" w:hAnsi="Hiragino Sans" w:cs="Hiragino Sans"/>
+          <w:sz w:val="29"/>
+          <w:sz-cs w:val="29"/>
+          <w:spacing w:val="0"/>
+        </w:rPr>
+        <w:t xml:space="preserve">〔デザインは調整中〕</w:t>
       </w:r>
       <w:r>
         <w:rPr>
@@ -5902,7 +5902,7 @@
           <w:sz-cs w:val="29"/>
           <w:spacing w:val="0"/>
         </w:rPr>
-        <w:t xml:space="preserve">A. 当日は、MIO と対面で6分前後お話しいただけます。あわせてお好きなお席をお選びいただけるほか、チェキ・写真・動画の撮影、限定名刺、ノベルティをご用意しています。後日のファンミーティングでは、30分間のグループセッション、または MIO への Q&amp;A にご参加いただけます。</w:t>
+        <w:t xml:space="preserve">A. 当日は、MIO と対面で6分前後お話しいただけます。あわせてお好きなお席をお選びいただけるほか、チェキ・写真・動画の撮影、限定名刺、なりきりしゃーみーグッズ（ノート・ペン・トートバッグ・キーホルダー）をご用意しています。後日のファンミーティングでは、30分間のグループセッション、または MIO への Q&amp;A にご参加いただけます。</w:t>
       </w:r>
     </w:p>
     <w:p>

</xml_diff>

<commit_message>
charity: the slogan is 文化 × エンタメ × AI now
kazuma's reasoning makes the three one argument rather than three:
MIO wants to lift the entertainment industry, the part of it he chose
is a visual-kei band, he can run companies and still play because AI
buys back the hours -- which is why the money goes to AI literacy --
and it all stands on a culture whose history he means to honour.

So the page is rebuilt around that order: an opening that states the
three words, then a chapter each for エンタメ, AI and 文化, with 根津神社
following 文化 and the charity chapter after. MIO's own words on AI stay
verbatim where they were. The flyer, the main visual, the activity
banner and the mastheads carry the new line, and the axis banner's
three cards are now the three words.

Co-Authored-By: Claude Opus 5 <noreply@anthropic.com>
</commit_message>
<xml_diff>
--- a/docs/campfire-body-edit.docx
+++ b/docs/campfire-body-edit.docx
@@ -62,7 +62,7 @@
           <w:spacing w:val="0"/>
           <w:color w:val="7A0014"/>
         </w:rPr>
-        <w:t xml:space="preserve">1. ビジュアル系文化を守り、継ぐ。</w:t>
+        <w:t xml:space="preserve">1. 文化 × エンタメ × AI。</w:t>
       </w:r>
     </w:p>
     <w:p>
@@ -219,6 +219,153 @@
           <w:spacing w:val="0"/>
         </w:rPr>
         <w:t xml:space="preserve"> を開催します。</w:t>
+      </w:r>
+    </w:p>
+    <w:p>
+      <w:pPr>
+        <w:spacing w:after="240"/>
+      </w:pPr>
+      <w:r>
+        <w:rPr>
+          <w:rFonts w:ascii="Hiragino Sans" w:hAnsi="Hiragino Sans" w:cs="Hiragino Sans"/>
+          <w:sz w:val="29"/>
+          <w:sz-cs w:val="29"/>
+          <w:spacing w:val="0"/>
+        </w:rPr>
+        <w:t xml:space="preserve">この一夜は、</w:t>
+      </w:r>
+      <w:r>
+        <w:rPr>
+          <w:rFonts w:ascii="Hiragino Sans" w:hAnsi="Hiragino Sans" w:cs="Hiragino Sans"/>
+          <w:sz w:val="29"/>
+          <w:sz-cs w:val="29"/>
+          <w:b/>
+          <w:spacing w:val="0"/>
+        </w:rPr>
+        <w:t xml:space="preserve">3つの言葉</w:t>
+      </w:r>
+      <w:r>
+        <w:rPr>
+          <w:rFonts w:ascii="Hiragino Sans" w:hAnsi="Hiragino Sans" w:cs="Hiragino Sans"/>
+          <w:sz w:val="29"/>
+          <w:sz-cs w:val="29"/>
+          <w:spacing w:val="0"/>
+        </w:rPr>
+        <w:t xml:space="preserve">でできています。</w:t>
+      </w:r>
+    </w:p>
+    <w:p>
+      <w:pPr>
+        <w:ind w:left="720" w:first-line="-720"/>
+        <w:spacing w:after="106"/>
+      </w:pPr>
+      <w:r>
+        <w:rPr>
+          <w:rFonts w:ascii="Hiragino Sans" w:hAnsi="Hiragino Sans" w:cs="Hiragino Sans"/>
+          <w:sz w:val="29"/>
+          <w:sz-cs w:val="29"/>
+          <w:b/>
+        </w:rPr>
+        <w:t xml:space="preserve"/>
+        <w:tab/>
+        <w:t xml:space="preserve">•</w:t>
+        <w:tab/>
+        <w:t xml:space="preserve"/>
+      </w:r>
+      <w:r>
+        <w:rPr>
+          <w:rFonts w:ascii="Hiragino Sans" w:hAnsi="Hiragino Sans" w:cs="Hiragino Sans"/>
+          <w:sz w:val="29"/>
+          <w:sz-cs w:val="29"/>
+          <w:b/>
+          <w:spacing w:val="0"/>
+        </w:rPr>
+        <w:t xml:space="preserve">エンタメ</w:t>
+      </w:r>
+      <w:r>
+        <w:rPr>
+          <w:rFonts w:ascii="Hiragino Sans" w:hAnsi="Hiragino Sans" w:cs="Hiragino Sans"/>
+          <w:sz w:val="29"/>
+          <w:sz-cs w:val="29"/>
+          <w:spacing w:val="0"/>
+        </w:rPr>
+        <w:t xml:space="preserve"> ── 僕たちが盛り上げたい業界。その中で選んだのが、ビジュアル系バンドでした</w:t>
+      </w:r>
+    </w:p>
+    <w:p>
+      <w:pPr>
+        <w:ind w:left="720" w:first-line="-720"/>
+        <w:spacing w:after="106"/>
+      </w:pPr>
+      <w:r>
+        <w:rPr>
+          <w:rFonts w:ascii="Hiragino Sans" w:hAnsi="Hiragino Sans" w:cs="Hiragino Sans"/>
+          <w:sz w:val="29"/>
+          <w:sz-cs w:val="29"/>
+          <w:b/>
+        </w:rPr>
+        <w:t xml:space="preserve"/>
+        <w:tab/>
+        <w:t xml:space="preserve">•</w:t>
+        <w:tab/>
+        <w:t xml:space="preserve"/>
+      </w:r>
+      <w:r>
+        <w:rPr>
+          <w:rFonts w:ascii="Hiragino Sans" w:hAnsi="Hiragino Sans" w:cs="Hiragino Sans"/>
+          <w:sz w:val="29"/>
+          <w:sz-cs w:val="29"/>
+          <w:b/>
+          <w:spacing w:val="0"/>
+        </w:rPr>
+        <w:t xml:space="preserve">AI</w:t>
+      </w:r>
+      <w:r>
+        <w:rPr>
+          <w:rFonts w:ascii="Hiragino Sans" w:hAnsi="Hiragino Sans" w:cs="Hiragino Sans"/>
+          <w:sz w:val="29"/>
+          <w:sz-cs w:val="29"/>
+          <w:spacing w:val="0"/>
+        </w:rPr>
+        <w:t xml:space="preserve"> ── 経営をしながらバンドができているのは、AI で時間をつくれているからです</w:t>
+      </w:r>
+    </w:p>
+    <w:p>
+      <w:pPr>
+        <w:ind w:left="720" w:first-line="-720"/>
+        <w:spacing w:after="106"/>
+      </w:pPr>
+      <w:r>
+        <w:rPr>
+          <w:rFonts w:ascii="Hiragino Sans" w:hAnsi="Hiragino Sans" w:cs="Hiragino Sans"/>
+          <w:sz w:val="29"/>
+          <w:sz-cs w:val="29"/>
+          <w:b/>
+        </w:rPr>
+        <w:t xml:space="preserve"/>
+        <w:tab/>
+        <w:t xml:space="preserve">•</w:t>
+        <w:tab/>
+        <w:t xml:space="preserve"/>
+      </w:r>
+      <w:r>
+        <w:rPr>
+          <w:rFonts w:ascii="Hiragino Sans" w:hAnsi="Hiragino Sans" w:cs="Hiragino Sans"/>
+          <w:sz w:val="29"/>
+          <w:sz-cs w:val="29"/>
+          <w:b/>
+          <w:spacing w:val="0"/>
+        </w:rPr>
+        <w:t xml:space="preserve">文化</w:t>
+      </w:r>
+      <w:r>
+        <w:rPr>
+          <w:rFonts w:ascii="Hiragino Sans" w:hAnsi="Hiragino Sans" w:cs="Hiragino Sans"/>
+          <w:sz w:val="29"/>
+          <w:sz-cs w:val="29"/>
+          <w:spacing w:val="0"/>
+        </w:rPr>
+        <w:t xml:space="preserve"> ── 歴史を重んじることで、自分たちのやることが文化のつながりになる</w:t>
       </w:r>
     </w:p>
     <w:p>
@@ -296,7 +443,73 @@
           <w:spacing w:val="0"/>
           <w:color w:val="7A0014"/>
         </w:rPr>
-        <w:t xml:space="preserve">2. なぜ「ビジュアル系文化」なのか</w:t>
+        <w:t xml:space="preserve">2. エンタメ ── 盛り上げたいのは、この業界です</w:t>
+      </w:r>
+    </w:p>
+    <w:p>
+      <w:pPr>
+        <w:spacing w:after="240"/>
+      </w:pPr>
+      <w:r>
+        <w:rPr>
+          <w:rFonts w:ascii="Hiragino Sans" w:hAnsi="Hiragino Sans" w:cs="Hiragino Sans"/>
+          <w:sz w:val="29"/>
+          <w:sz-cs w:val="29"/>
+          <w:spacing w:val="0"/>
+        </w:rPr>
+        <w:t xml:space="preserve">根底にあるのは、</w:t>
+      </w:r>
+      <w:r>
+        <w:rPr>
+          <w:rFonts w:ascii="Hiragino Sans" w:hAnsi="Hiragino Sans" w:cs="Hiragino Sans"/>
+          <w:sz w:val="29"/>
+          <w:sz-cs w:val="29"/>
+          <w:b/>
+          <w:spacing w:val="0"/>
+        </w:rPr>
+        <w:t xml:space="preserve">エンタメ業界そのものを盛り上げたい</w:t>
+      </w:r>
+      <w:r>
+        <w:rPr>
+          <w:rFonts w:ascii="Hiragino Sans" w:hAnsi="Hiragino Sans" w:cs="Hiragino Sans"/>
+          <w:sz w:val="29"/>
+          <w:sz-cs w:val="29"/>
+          <w:spacing w:val="0"/>
+        </w:rPr>
+        <w:t xml:space="preserve">という気持ちです。</w:t>
+      </w:r>
+    </w:p>
+    <w:p>
+      <w:pPr>
+        <w:spacing w:after="240"/>
+      </w:pPr>
+      <w:r>
+        <w:rPr>
+          <w:rFonts w:ascii="Hiragino Sans" w:hAnsi="Hiragino Sans" w:cs="Hiragino Sans"/>
+          <w:sz w:val="29"/>
+          <w:sz-cs w:val="29"/>
+          <w:spacing w:val="0"/>
+        </w:rPr>
+        <w:t xml:space="preserve">そのエンタメの中で、</w:t>
+      </w:r>
+      <w:r>
+        <w:rPr>
+          <w:rFonts w:ascii="Hiragino Sans" w:hAnsi="Hiragino Sans" w:cs="Hiragino Sans"/>
+          <w:sz w:val="29"/>
+          <w:sz-cs w:val="29"/>
+          <w:b/>
+          <w:spacing w:val="0"/>
+        </w:rPr>
+        <w:t xml:space="preserve">僕が選んだのがビジュアル系バンドでした。</w:t>
+      </w:r>
+      <w:r>
+        <w:rPr>
+          <w:rFonts w:ascii="Hiragino Sans" w:hAnsi="Hiragino Sans" w:cs="Hiragino Sans"/>
+          <w:sz w:val="29"/>
+          <w:sz-cs w:val="29"/>
+          <w:spacing w:val="0"/>
+        </w:rPr>
+        <w:t xml:space="preserve"/>
       </w:r>
     </w:p>
     <w:p>
@@ -490,53 +703,6 @@
           <w:spacing w:val="0"/>
         </w:rPr>
         <w:t xml:space="preserve"/>
-      </w:r>
-    </w:p>
-    <w:p>
-      <w:pPr>
-        <w:spacing w:after="240"/>
-      </w:pPr>
-      <w:r>
-        <w:rPr>
-          <w:rFonts w:ascii="Hiragino Sans" w:hAnsi="Hiragino Sans" w:cs="Hiragino Sans"/>
-          <w:sz w:val="29"/>
-          <w:sz-cs w:val="29"/>
-          <w:spacing w:val="0"/>
-        </w:rPr>
-        <w:t xml:space="preserve">同じ日の昼には、文化継承をテーマにしたチャリティーイベント</w:t>
-      </w:r>
-      <w:r>
-        <w:rPr>
-          <w:rFonts w:ascii="Hiragino Sans" w:hAnsi="Hiragino Sans" w:cs="Hiragino Sans"/>
-          <w:sz w:val="29"/>
-          <w:sz-cs w:val="29"/>
-          <w:b/>
-          <w:spacing w:val="0"/>
-        </w:rPr>
-        <w:t xml:space="preserve">「WRAPPING THE EARTH TOKYO 2026」</w:t>
-      </w:r>
-      <w:r>
-        <w:rPr>
-          <w:rFonts w:ascii="Hiragino Sans" w:hAnsi="Hiragino Sans" w:cs="Hiragino Sans"/>
-          <w:sz w:val="29"/>
-          <w:sz-cs w:val="29"/>
-          <w:spacing w:val="0"/>
-        </w:rPr>
-        <w:t xml:space="preserve">が開かれます。守り、次の世代へ渡していく——向いている先は、僕たちと同じです。</w:t>
-      </w:r>
-    </w:p>
-    <w:p>
-      <w:pPr>
-        <w:spacing w:after="240"/>
-      </w:pPr>
-      <w:r>
-        <w:rPr>
-          <w:rFonts w:ascii="Hiragino Sans" w:hAnsi="Hiragino Sans" w:cs="Hiragino Sans"/>
-          <w:sz w:val="29"/>
-          <w:sz-cs w:val="29"/>
-          <w:spacing w:val="0"/>
-        </w:rPr>
-        <w:t xml:space="preserve">その夜を、渋谷の空の上で鳴らします。</w:t>
       </w:r>
     </w:p>
     <w:p>
@@ -552,135 +718,389 @@
           <w:spacing w:val="0"/>
           <w:color w:val="7A0014"/>
         </w:rPr>
-        <w:t xml:space="preserve">3. なぜ、チャリティーライブなのか</w:t>
-      </w:r>
-    </w:p>
-    <w:p>
-      <w:pPr>
-        <w:spacing w:after="240"/>
-      </w:pPr>
-      <w:r>
-        <w:rPr>
-          <w:rFonts w:ascii="Hiragino Sans" w:hAnsi="Hiragino Sans" w:cs="Hiragino Sans"/>
-          <w:sz w:val="29"/>
-          <w:sz-cs w:val="29"/>
-          <w:spacing w:val="0"/>
-        </w:rPr>
-        <w:t xml:space="preserve">はじめに、ひとつだけ書かせてください。</w:t>
-      </w:r>
-    </w:p>
-    <w:p>
-      <w:pPr>
-        <w:spacing w:after="240"/>
-      </w:pPr>
-      <w:r>
-        <w:rPr>
-          <w:rFonts w:ascii="Hiragino Sans" w:hAnsi="Hiragino Sans" w:cs="Hiragino Sans"/>
-          <w:sz w:val="29"/>
-          <w:sz-cs w:val="29"/>
-          <w:b/>
-          <w:spacing w:val="0"/>
-        </w:rPr>
-        <w:t xml:space="preserve">これはホストとしての活動ではありません。VALHALLA というバンドとして、音楽で社会に関わっていきたい</w:t>
-      </w:r>
-      <w:r>
-        <w:rPr>
-          <w:rFonts w:ascii="Hiragino Sans" w:hAnsi="Hiragino Sans" w:cs="Hiragino Sans"/>
-          <w:sz w:val="29"/>
-          <w:sz-cs w:val="29"/>
-          <w:spacing w:val="0"/>
-        </w:rPr>
-        <w:t xml:space="preserve">という想いから始まっています。</w:t>
-      </w:r>
-    </w:p>
-    <w:p>
-      <w:pPr>
-        <w:spacing w:after="240"/>
-      </w:pPr>
-      <w:r>
-        <w:rPr>
-          <w:rFonts w:ascii="Hiragino Sans" w:hAnsi="Hiragino Sans" w:cs="Hiragino Sans"/>
-          <w:sz w:val="29"/>
-          <w:sz-cs w:val="29"/>
-          <w:spacing w:val="0"/>
-        </w:rPr>
-        <w:t xml:space="preserve">そして——</w:t>
-      </w:r>
-      <w:r>
-        <w:rPr>
-          <w:rFonts w:ascii="Hiragino Sans" w:hAnsi="Hiragino Sans" w:cs="Hiragino Sans"/>
-          <w:sz w:val="29"/>
-          <w:sz-cs w:val="29"/>
-          <w:b/>
-          <w:spacing w:val="0"/>
-        </w:rPr>
-        <w:t xml:space="preserve">自分ひとりで寄付をすることは、簡単です。</w:t>
-      </w:r>
-      <w:r>
-        <w:rPr>
-          <w:rFonts w:ascii="Hiragino Sans" w:hAnsi="Hiragino Sans" w:cs="Hiragino Sans"/>
-          <w:sz w:val="29"/>
-          <w:sz-cs w:val="29"/>
-          <w:spacing w:val="0"/>
-        </w:rPr>
-        <w:t xml:space="preserve"/>
-      </w:r>
-    </w:p>
-    <w:p>
-      <w:pPr>
-        <w:spacing w:after="240"/>
-      </w:pPr>
-      <w:r>
-        <w:rPr>
-          <w:rFonts w:ascii="Hiragino Sans" w:hAnsi="Hiragino Sans" w:cs="Hiragino Sans"/>
-          <w:sz w:val="29"/>
-          <w:sz-cs w:val="29"/>
-          <w:spacing w:val="0"/>
-        </w:rPr>
-        <w:t xml:space="preserve">でも僕がやりたいのは、個人で完結させることではありません。</w:t>
-      </w:r>
-    </w:p>
-    <w:p>
-      <w:pPr>
-        <w:spacing w:after="240"/>
-      </w:pPr>
-      <w:r>
-        <w:rPr>
-          <w:rFonts w:ascii="Hiragino Sans" w:hAnsi="Hiragino Sans" w:cs="Hiragino Sans"/>
-          <w:sz w:val="29"/>
-          <w:sz-cs w:val="29"/>
-          <w:b/>
-          <w:spacing w:val="0"/>
-        </w:rPr>
-        <w:t xml:space="preserve">来てくださった方が楽しむことが、そのまま寄付につながる。</w:t>
-      </w:r>
-      <w:r>
-        <w:rPr>
-          <w:rFonts w:ascii="Hiragino Sans" w:hAnsi="Hiragino Sans" w:cs="Hiragino Sans"/>
-          <w:sz w:val="29"/>
-          <w:sz-cs w:val="29"/>
-          <w:spacing w:val="0"/>
-        </w:rPr>
-        <w:t xml:space="preserve">その形にすることで、</w:t>
-      </w:r>
-      <w:r>
-        <w:rPr>
-          <w:rFonts w:ascii="Hiragino Sans" w:hAnsi="Hiragino Sans" w:cs="Hiragino Sans"/>
-          <w:sz w:val="29"/>
-          <w:sz-cs w:val="29"/>
-          <w:b/>
-          <w:spacing w:val="0"/>
-        </w:rPr>
-        <w:t xml:space="preserve">これまで寄付に関わってこなかった人たちも巻き込んでいきたい。</w:t>
-      </w:r>
-      <w:r>
-        <w:rPr>
-          <w:rFonts w:ascii="Hiragino Sans" w:hAnsi="Hiragino Sans" w:cs="Hiragino Sans"/>
-          <w:sz w:val="29"/>
-          <w:sz-cs w:val="29"/>
-          <w:spacing w:val="0"/>
-        </w:rPr>
-        <w:t xml:space="preserve">輪が広がっていくことを、いちばん大切にしたいと考えています。</w:t>
+        <w:t xml:space="preserve">3. AI ── 好きなことをやる時間は、AI がつくる</w:t>
+      </w:r>
+    </w:p>
+    <w:p>
+      <w:pPr>
+        <w:spacing w:after="240"/>
+      </w:pPr>
+      <w:r>
+        <w:rPr>
+          <w:rFonts w:ascii="Hiragino Sans" w:hAnsi="Hiragino Sans" w:cs="Hiragino Sans"/>
+          <w:sz w:val="29"/>
+          <w:sz-cs w:val="29"/>
+          <w:b/>
+          <w:spacing w:val="0"/>
+        </w:rPr>
+        <w:t xml:space="preserve">経営をしながら、バンドができている。</w:t>
+      </w:r>
+      <w:r>
+        <w:rPr>
+          <w:rFonts w:ascii="Hiragino Sans" w:hAnsi="Hiragino Sans" w:cs="Hiragino Sans"/>
+          <w:sz w:val="29"/>
+          <w:sz-cs w:val="29"/>
+          <w:spacing w:val="0"/>
+        </w:rPr>
+        <w:t xml:space="preserve">これができているのは、</w:t>
+      </w:r>
+      <w:r>
+        <w:rPr>
+          <w:rFonts w:ascii="Hiragino Sans" w:hAnsi="Hiragino Sans" w:cs="Hiragino Sans"/>
+          <w:sz w:val="29"/>
+          <w:sz-cs w:val="29"/>
+          <w:b/>
+          <w:spacing w:val="0"/>
+        </w:rPr>
+        <w:t xml:space="preserve">AI を駆使して、空いた時間をつくれているから</w:t>
+      </w:r>
+      <w:r>
+        <w:rPr>
+          <w:rFonts w:ascii="Hiragino Sans" w:hAnsi="Hiragino Sans" w:cs="Hiragino Sans"/>
+          <w:sz w:val="29"/>
+          <w:sz-cs w:val="29"/>
+          <w:spacing w:val="0"/>
+        </w:rPr>
+        <w:t xml:space="preserve">です。</w:t>
+      </w:r>
+    </w:p>
+    <w:p>
+      <w:pPr>
+        <w:spacing w:after="240"/>
+      </w:pPr>
+      <w:r>
+        <w:rPr>
+          <w:rFonts w:ascii="Hiragino Sans" w:hAnsi="Hiragino Sans" w:cs="Hiragino Sans"/>
+          <w:sz w:val="29"/>
+          <w:sz-cs w:val="29"/>
+          <w:spacing w:val="0"/>
+        </w:rPr>
+        <w:t xml:space="preserve">好きなことに使う時間は、勝手には生まれません。</w:t>
+      </w:r>
+      <w:r>
+        <w:rPr>
+          <w:rFonts w:ascii="Hiragino Sans" w:hAnsi="Hiragino Sans" w:cs="Hiragino Sans"/>
+          <w:sz w:val="29"/>
+          <w:sz-cs w:val="29"/>
+          <w:b/>
+          <w:spacing w:val="0"/>
+        </w:rPr>
+        <w:t xml:space="preserve">AI をどう使いこなすかが分かっていないと、その時間はつくれない。</w:t>
+      </w:r>
+      <w:r>
+        <w:rPr>
+          <w:rFonts w:ascii="Hiragino Sans" w:hAnsi="Hiragino Sans" w:cs="Hiragino Sans"/>
+          <w:sz w:val="29"/>
+          <w:sz-cs w:val="29"/>
+          <w:spacing w:val="0"/>
+        </w:rPr>
+        <w:t xml:space="preserve"/>
+      </w:r>
+    </w:p>
+    <w:p>
+      <w:pPr>
+        <w:spacing w:after="240"/>
+      </w:pPr>
+      <w:r>
+        <w:rPr>
+          <w:rFonts w:ascii="Hiragino Sans" w:hAnsi="Hiragino Sans" w:cs="Hiragino Sans"/>
+          <w:sz w:val="29"/>
+          <w:sz-cs w:val="29"/>
+          <w:spacing w:val="0"/>
+        </w:rPr>
+        <w:t xml:space="preserve">だから支援先に </w:t>
+      </w:r>
+      <w:r>
+        <w:rPr>
+          <w:rFonts w:ascii="Hiragino Sans" w:hAnsi="Hiragino Sans" w:cs="Hiragino Sans"/>
+          <w:sz w:val="29"/>
+          <w:sz-cs w:val="29"/>
+          <w:b/>
+          <w:spacing w:val="0"/>
+        </w:rPr>
+        <w:t xml:space="preserve">AIリテラシーの育成</w:t>
+      </w:r>
+      <w:r>
+        <w:rPr>
+          <w:rFonts w:ascii="Hiragino Sans" w:hAnsi="Hiragino Sans" w:cs="Hiragino Sans"/>
+          <w:sz w:val="29"/>
+          <w:sz-cs w:val="29"/>
+          <w:spacing w:val="0"/>
+        </w:rPr>
+        <w:t xml:space="preserve">を選びました。</w:t>
+      </w:r>
+    </w:p>
+    <w:p>
+      <w:pPr>
+        <w:spacing w:after="240"/>
+      </w:pPr>
+      <w:r>
+        <w:rPr>
+          <w:rFonts w:ascii="Hiragino Sans" w:hAnsi="Hiragino Sans" w:cs="Hiragino Sans"/>
+          <w:sz w:val="29"/>
+          <w:sz-cs w:val="29"/>
+          <w:b/>
+          <w:spacing w:val="0"/>
+        </w:rPr>
+        <w:t xml:space="preserve">遠くにある社会課題だから選んだのではありません。私たち自身が、経営の現場で毎日ぶつかっている問題だからです。</w:t>
+      </w:r>
+      <w:r>
+        <w:rPr>
+          <w:rFonts w:ascii="Hiragino Sans" w:hAnsi="Hiragino Sans" w:cs="Hiragino Sans"/>
+          <w:sz w:val="29"/>
+          <w:sz-cs w:val="29"/>
+          <w:spacing w:val="0"/>
+        </w:rPr>
+        <w:t xml:space="preserve"/>
+      </w:r>
+    </w:p>
+    <w:p>
+      <w:pPr>
+        <w:spacing w:after="240"/>
+      </w:pPr>
+      <w:r>
+        <w:rPr>
+          <w:rFonts w:ascii="Hiragino Sans" w:hAnsi="Hiragino Sans" w:cs="Hiragino Sans"/>
+          <w:sz w:val="29"/>
+          <w:sz-cs w:val="29"/>
+          <w:spacing w:val="0"/>
+          <w:color w:val="343434"/>
+        </w:rPr>
+        <w:t xml:space="preserve">世界で1番お金と時間を使うツールが AI である以上、日々使う事が当たり前になった時、使い始めて1年満たない今ですら、社内でのコミュニケーションに違和感を感じたり、思考のロスを感じています。</w:t>
+      </w:r>
+      <w:r>
+        <w:rPr>
+          <w:rFonts w:ascii="Hiragino Sans" w:hAnsi="Hiragino Sans" w:cs="Hiragino Sans"/>
+          <w:sz w:val="29"/>
+          <w:sz-cs w:val="29"/>
+          <w:spacing w:val="0"/>
+          <w:color w:val="343434"/>
+        </w:rPr>
+        <w:t xml:space="preserve"/>
+      </w:r>
+    </w:p>
+    <w:p>
+      <w:pPr>
+        <w:spacing w:after="240"/>
+      </w:pPr>
+      <w:r>
+        <w:rPr>
+          <w:rFonts w:ascii="Hiragino Sans" w:hAnsi="Hiragino Sans" w:cs="Hiragino Sans"/>
+          <w:sz w:val="29"/>
+          <w:sz-cs w:val="29"/>
+          <w:spacing w:val="0"/>
+          <w:color w:val="343434"/>
+        </w:rPr>
+        <w:t xml:space="preserve">その反面、今まで以上に速度早く、簡単に、そしてプロが要らなくなるような内容をAI がつくってくれることも事実です。</w:t>
+      </w:r>
+      <w:r>
+        <w:rPr>
+          <w:rFonts w:ascii="Hiragino Sans" w:hAnsi="Hiragino Sans" w:cs="Hiragino Sans"/>
+          <w:sz w:val="29"/>
+          <w:sz-cs w:val="29"/>
+          <w:spacing w:val="0"/>
+          <w:color w:val="343434"/>
+        </w:rPr>
+        <w:t xml:space="preserve"/>
+      </w:r>
+    </w:p>
+    <w:p>
+      <w:pPr>
+        <w:spacing w:after="240"/>
+      </w:pPr>
+      <w:r>
+        <w:rPr>
+          <w:rFonts w:ascii="Hiragino Sans" w:hAnsi="Hiragino Sans" w:cs="Hiragino Sans"/>
+          <w:sz w:val="29"/>
+          <w:sz-cs w:val="29"/>
+          <w:spacing w:val="0"/>
+          <w:color w:val="343434"/>
+        </w:rPr>
+        <w:t xml:space="preserve">この AI に対して、</w:t>
+      </w:r>
+      <w:r>
+        <w:rPr>
+          <w:rFonts w:ascii="Hiragino Sans" w:hAnsi="Hiragino Sans" w:cs="Hiragino Sans"/>
+          <w:sz w:val="29"/>
+          <w:sz-cs w:val="29"/>
+          <w:b/>
+          <w:spacing w:val="0"/>
+          <w:color w:val="343434"/>
+        </w:rPr>
+        <w:t xml:space="preserve">どう使うか？の倫理観がとっても大切になってくる</w:t>
+      </w:r>
+      <w:r>
+        <w:rPr>
+          <w:rFonts w:ascii="Hiragino Sans" w:hAnsi="Hiragino Sans" w:cs="Hiragino Sans"/>
+          <w:sz w:val="29"/>
+          <w:sz-cs w:val="29"/>
+          <w:spacing w:val="0"/>
+          <w:color w:val="343434"/>
+        </w:rPr>
+        <w:t xml:space="preserve">ことを日々感じています。</w:t>
+      </w:r>
+      <w:r>
+        <w:rPr>
+          <w:rFonts w:ascii="Hiragino Sans" w:hAnsi="Hiragino Sans" w:cs="Hiragino Sans"/>
+          <w:sz w:val="29"/>
+          <w:sz-cs w:val="29"/>
+          <w:spacing w:val="0"/>
+          <w:color w:val="343434"/>
+        </w:rPr>
+        <w:t xml:space="preserve"/>
+      </w:r>
+    </w:p>
+    <w:p>
+      <w:pPr>
+        <w:spacing w:after="240"/>
+      </w:pPr>
+      <w:r>
+        <w:rPr>
+          <w:rFonts w:ascii="Hiragino Sans" w:hAnsi="Hiragino Sans" w:cs="Hiragino Sans"/>
+          <w:sz w:val="29"/>
+          <w:sz-cs w:val="29"/>
+          <w:b/>
+          <w:spacing w:val="0"/>
+          <w:color w:val="343434"/>
+        </w:rPr>
+        <w:t xml:space="preserve">AI は、使われるではなく使いこなし</w:t>
+      </w:r>
+      <w:r>
+        <w:rPr>
+          <w:rFonts w:ascii="Hiragino Sans" w:hAnsi="Hiragino Sans" w:cs="Hiragino Sans"/>
+          <w:sz w:val="29"/>
+          <w:sz-cs w:val="29"/>
+          <w:spacing w:val="0"/>
+          <w:color w:val="343434"/>
+        </w:rPr>
+        <w:t xml:space="preserve">、空いた時間になにをするか？を本当にしたい事を考えられるチャンスと捉え、今の時代だからこそできる時間を楽しんでくれる人たちを増やしていきたいと思っています。</w:t>
+      </w:r>
+      <w:r>
+        <w:rPr>
+          <w:rFonts w:ascii="Hiragino Sans" w:hAnsi="Hiragino Sans" w:cs="Hiragino Sans"/>
+          <w:sz w:val="29"/>
+          <w:sz-cs w:val="29"/>
+          <w:spacing w:val="0"/>
+          <w:color w:val="343434"/>
+        </w:rPr>
+        <w:t xml:space="preserve"/>
+      </w:r>
+    </w:p>
+    <w:p>
+      <w:pPr>
+        <w:spacing w:after="240"/>
+      </w:pPr>
+      <w:r>
+        <w:rPr>
+          <w:rFonts w:ascii="Hiragino Sans" w:hAnsi="Hiragino Sans" w:cs="Hiragino Sans"/>
+          <w:sz w:val="29"/>
+          <w:sz-cs w:val="29"/>
+          <w:spacing w:val="0"/>
+          <w:color w:val="343434"/>
+        </w:rPr>
+        <w:t xml:space="preserve">私が経営者をやりながらも、音楽に没頭できるのも、少なからず AI の力を借りているからと思う分、より AI を追求し、学び、</w:t>
+      </w:r>
+      <w:r>
+        <w:rPr>
+          <w:rFonts w:ascii="Hiragino Sans" w:hAnsi="Hiragino Sans" w:cs="Hiragino Sans"/>
+          <w:sz w:val="29"/>
+          <w:sz-cs w:val="29"/>
+          <w:b/>
+          <w:spacing w:val="0"/>
+          <w:color w:val="343434"/>
+        </w:rPr>
+        <w:t xml:space="preserve">それを新しい体験や価値を生む時間に変えて行きたい</w:t>
+      </w:r>
+      <w:r>
+        <w:rPr>
+          <w:rFonts w:ascii="Hiragino Sans" w:hAnsi="Hiragino Sans" w:cs="Hiragino Sans"/>
+          <w:sz w:val="29"/>
+          <w:sz-cs w:val="29"/>
+          <w:spacing w:val="0"/>
+          <w:color w:val="343434"/>
+        </w:rPr>
+        <w:t xml:space="preserve">と思っています。</w:t>
+      </w:r>
+      <w:r>
+        <w:rPr>
+          <w:rFonts w:ascii="Hiragino Sans" w:hAnsi="Hiragino Sans" w:cs="Hiragino Sans"/>
+          <w:sz w:val="29"/>
+          <w:sz-cs w:val="29"/>
+          <w:spacing w:val="0"/>
+          <w:color w:val="343434"/>
+        </w:rPr>
+        <w:t xml:space="preserve"/>
+      </w:r>
+    </w:p>
+    <w:p>
+      <w:pPr>
+        <w:spacing w:after="240"/>
+      </w:pPr>
+      <w:r>
+        <w:rPr>
+          <w:rFonts w:ascii="Hiragino Sans" w:hAnsi="Hiragino Sans" w:cs="Hiragino Sans"/>
+          <w:sz w:val="29"/>
+          <w:sz-cs w:val="29"/>
+          <w:spacing w:val="0"/>
+          <w:color w:val="343434"/>
+        </w:rPr>
+        <w:t xml:space="preserve">AI が何でも答えてくれる時代に、</w:t>
+      </w:r>
+      <w:r>
+        <w:rPr>
+          <w:rFonts w:ascii="Hiragino Sans" w:hAnsi="Hiragino Sans" w:cs="Hiragino Sans"/>
+          <w:sz w:val="29"/>
+          <w:sz-cs w:val="29"/>
+          <w:b/>
+          <w:spacing w:val="0"/>
+          <w:color w:val="343434"/>
+        </w:rPr>
+        <w:t xml:space="preserve">わざわざ人が集まって、生の音を浴びる意味は何なのか。</w:t>
+      </w:r>
+      <w:r>
+        <w:rPr>
+          <w:rFonts w:ascii="Hiragino Sans" w:hAnsi="Hiragino Sans" w:cs="Hiragino Sans"/>
+          <w:sz w:val="29"/>
+          <w:sz-cs w:val="29"/>
+          <w:spacing w:val="0"/>
+          <w:color w:val="343434"/>
+        </w:rPr>
+        <w:t xml:space="preserve">私たちは、そこに意味があると思っています。だから音楽をやるし、だから人と関わる力を大事にしたい。</w:t>
+      </w:r>
+      <w:r>
+        <w:rPr>
+          <w:rFonts w:ascii="Hiragino Sans" w:hAnsi="Hiragino Sans" w:cs="Hiragino Sans"/>
+          <w:sz w:val="29"/>
+          <w:sz-cs w:val="29"/>
+          <w:spacing w:val="0"/>
+          <w:color w:val="343434"/>
+        </w:rPr>
+        <w:t xml:space="preserve"/>
+      </w:r>
+    </w:p>
+    <w:p>
+      <w:pPr>
+        <w:spacing w:after="240"/>
+      </w:pPr>
+      <w:r>
+        <w:rPr>
+          <w:rFonts w:ascii="Hiragino Sans" w:hAnsi="Hiragino Sans" w:cs="Hiragino Sans"/>
+          <w:sz w:val="29"/>
+          <w:sz-cs w:val="29"/>
+          <w:spacing w:val="0"/>
+          <w:color w:val="343434"/>
+        </w:rPr>
+        <w:t xml:space="preserve">——MIO（社美緒）</w:t>
+      </w:r>
+      <w:r>
+        <w:rPr>
+          <w:rFonts w:ascii="Hiragino Sans" w:hAnsi="Hiragino Sans" w:cs="Hiragino Sans"/>
+          <w:sz w:val="29"/>
+          <w:sz-cs w:val="29"/>
+          <w:spacing w:val="0"/>
+          <w:color w:val="343434"/>
+        </w:rPr>
+        <w:t xml:space="preserve"/>
       </w:r>
     </w:p>
     <w:p>
@@ -705,99 +1125,52 @@
           <w:rFonts w:ascii="Hiragino Sans" w:hAnsi="Hiragino Sans" w:cs="Hiragino Sans"/>
           <w:sz w:val="29"/>
           <w:sz-cs w:val="29"/>
-          <w:spacing w:val="0"/>
-        </w:rPr>
-        <w:t xml:space="preserve">経営者として事業を営みながら、音楽が好きでバンドを始めました。いくつもの顔を持つなかで、僕が大切にしたいと思うようになったのは、</w:t>
-      </w:r>
-      <w:r>
-        <w:rPr>
-          <w:rFonts w:ascii="Hiragino Sans" w:hAnsi="Hiragino Sans" w:cs="Hiragino Sans"/>
-          <w:sz w:val="29"/>
-          <w:sz-cs w:val="29"/>
-          <w:b/>
-          <w:spacing w:val="0"/>
-        </w:rPr>
-        <w:t xml:space="preserve">新しい人との出会いから生まれる、体験と価値を届けること</w:t>
-      </w:r>
-      <w:r>
-        <w:rPr>
-          <w:rFonts w:ascii="Hiragino Sans" w:hAnsi="Hiragino Sans" w:cs="Hiragino Sans"/>
-          <w:sz w:val="29"/>
-          <w:sz-cs w:val="29"/>
-          <w:spacing w:val="0"/>
-        </w:rPr>
-        <w:t xml:space="preserve">です。</w:t>
-      </w:r>
-    </w:p>
-    <w:p>
-      <w:pPr>
-        <w:spacing w:after="240"/>
-      </w:pPr>
-      <w:r>
-        <w:rPr>
-          <w:rFonts w:ascii="Hiragino Sans" w:hAnsi="Hiragino Sans" w:cs="Hiragino Sans"/>
-          <w:sz w:val="29"/>
-          <w:sz-cs w:val="29"/>
-          <w:spacing w:val="0"/>
-        </w:rPr>
-        <w:t xml:space="preserve">ライブの一体感は、その時にしかつくられません。</w:t>
-      </w:r>
-      <w:r>
-        <w:rPr>
-          <w:rFonts w:ascii="Hiragino Sans" w:hAnsi="Hiragino Sans" w:cs="Hiragino Sans"/>
-          <w:sz w:val="29"/>
-          <w:sz-cs w:val="29"/>
-          <w:b/>
-          <w:spacing w:val="0"/>
-        </w:rPr>
-        <w:t xml:space="preserve">その場にいる全員が、同じ想いになる。</w:t>
-      </w:r>
-      <w:r>
-        <w:rPr>
-          <w:rFonts w:ascii="Hiragino Sans" w:hAnsi="Hiragino Sans" w:cs="Hiragino Sans"/>
-          <w:sz w:val="29"/>
-          <w:sz-cs w:val="29"/>
-          <w:spacing w:val="0"/>
-        </w:rPr>
-        <w:t xml:space="preserve"/>
-      </w:r>
-    </w:p>
-    <w:p>
-      <w:pPr>
-        <w:spacing w:after="240"/>
-      </w:pPr>
-      <w:r>
-        <w:rPr>
-          <w:rFonts w:ascii="Hiragino Sans" w:hAnsi="Hiragino Sans" w:cs="Hiragino Sans"/>
-          <w:sz w:val="29"/>
-          <w:sz-cs w:val="29"/>
-          <w:spacing w:val="0"/>
-        </w:rPr>
-        <w:t xml:space="preserve">自分だけがする社会貢献ではなく、これからの世界をつくる若者や、同じ想いを持つ人たちを増やしていくこと。それがこれからの世界に必要だと考えています。</w:t>
-      </w:r>
-    </w:p>
-    <w:p>
-      <w:pPr>
-        <w:spacing w:after="240"/>
-      </w:pPr>
-      <w:r>
-        <w:rPr>
-          <w:rFonts w:ascii="Hiragino Sans" w:hAnsi="Hiragino Sans" w:cs="Hiragino Sans"/>
-          <w:sz w:val="29"/>
-          <w:sz-cs w:val="29"/>
-          <w:b/>
-          <w:spacing w:val="0"/>
-        </w:rPr>
-        <w:t xml:space="preserve">私たちと過ごした楽しい時間——その FUN! が、寄付という形で社会貢献につながる。</w:t>
-      </w:r>
-      <w:r>
-        <w:rPr>
-          <w:rFonts w:ascii="Hiragino Sans" w:hAnsi="Hiragino Sans" w:cs="Hiragino Sans"/>
-          <w:sz w:val="29"/>
-          <w:sz-cs w:val="29"/>
-          <w:spacing w:val="0"/>
-        </w:rPr>
-        <w:t xml:space="preserve">そういう体験を提供して、その価値をより多くの方へ広げていきたいと思っています。</w:t>
+          <w:b/>
+          <w:spacing w:val="0"/>
+        </w:rPr>
+        <w:t xml:space="preserve">そして私たちはいま、「学ぶ場そのものをつくる」準備を進めています。</w:t>
+      </w:r>
+      <w:r>
+        <w:rPr>
+          <w:rFonts w:ascii="Hiragino Sans" w:hAnsi="Hiragino Sans" w:cs="Hiragino Sans"/>
+          <w:sz w:val="29"/>
+          <w:sz-cs w:val="29"/>
+          <w:spacing w:val="0"/>
+        </w:rPr>
+        <w:t xml:space="preserve"/>
+      </w:r>
+    </w:p>
+    <w:p>
+      <w:pPr>
+        <w:spacing w:after="240"/>
+      </w:pPr>
+      <w:r>
+        <w:rPr>
+          <w:rFonts w:ascii="Hiragino Sans" w:hAnsi="Hiragino Sans" w:cs="Hiragino Sans"/>
+          <w:sz w:val="29"/>
+          <w:sz-cs w:val="29"/>
+          <w:spacing w:val="0"/>
+        </w:rPr>
+        <w:t xml:space="preserve">支援して終わりにするのではなく、次の世代が学べる場所を自分たちの手でつくる。</w:t>
+      </w:r>
+      <w:r>
+        <w:rPr>
+          <w:rFonts w:ascii="Hiragino Sans" w:hAnsi="Hiragino Sans" w:cs="Hiragino Sans"/>
+          <w:sz w:val="29"/>
+          <w:sz-cs w:val="29"/>
+          <w:b/>
+          <w:spacing w:val="0"/>
+        </w:rPr>
+        <w:t xml:space="preserve">この夜は、そのはじまりの一歩です。</w:t>
+      </w:r>
+      <w:r>
+        <w:rPr>
+          <w:rFonts w:ascii="Hiragino Sans" w:hAnsi="Hiragino Sans" w:cs="Hiragino Sans"/>
+          <w:sz w:val="29"/>
+          <w:sz-cs w:val="29"/>
+          <w:spacing w:val="0"/>
+        </w:rPr>
+        <w:t xml:space="preserve"/>
       </w:r>
     </w:p>
     <w:p>
@@ -813,383 +1186,186 @@
           <w:spacing w:val="0"/>
           <w:color w:val="7A0014"/>
         </w:rPr>
-        <w:t xml:space="preserve">4. なぜ「AIリテラシー」に寄付するのか</w:t>
-      </w:r>
-    </w:p>
-    <w:p>
-      <w:pPr>
-        <w:spacing w:after="240"/>
-      </w:pPr>
-      <w:r>
-        <w:rPr>
-          <w:rFonts w:ascii="Hiragino Sans" w:hAnsi="Hiragino Sans" w:cs="Hiragino Sans"/>
-          <w:sz w:val="29"/>
-          <w:sz-cs w:val="29"/>
-          <w:spacing w:val="0"/>
-        </w:rPr>
-        <w:t xml:space="preserve">支援先に </w:t>
-      </w:r>
-      <w:r>
-        <w:rPr>
-          <w:rFonts w:ascii="Hiragino Sans" w:hAnsi="Hiragino Sans" w:cs="Hiragino Sans"/>
-          <w:sz w:val="29"/>
-          <w:sz-cs w:val="29"/>
-          <w:b/>
-          <w:spacing w:val="0"/>
-        </w:rPr>
-        <w:t xml:space="preserve">AIリテラシーの育成</w:t>
-      </w:r>
-      <w:r>
-        <w:rPr>
-          <w:rFonts w:ascii="Hiragino Sans" w:hAnsi="Hiragino Sans" w:cs="Hiragino Sans"/>
-          <w:sz w:val="29"/>
-          <w:sz-cs w:val="29"/>
-          <w:spacing w:val="0"/>
-        </w:rPr>
-        <w:t xml:space="preserve">を選んだのには、はっきりした理由があります。</w:t>
-      </w:r>
-    </w:p>
-    <w:p>
-      <w:pPr>
-        <w:spacing w:after="240"/>
-      </w:pPr>
-      <w:r>
-        <w:rPr>
-          <w:rFonts w:ascii="Hiragino Sans" w:hAnsi="Hiragino Sans" w:cs="Hiragino Sans"/>
-          <w:sz w:val="29"/>
-          <w:sz-cs w:val="29"/>
-          <w:b/>
-          <w:spacing w:val="0"/>
-        </w:rPr>
-        <w:t xml:space="preserve">遠くにある社会課題だから選んだのではありません。私たち自身が、経営の現場で毎日ぶつかっている問題だからです。</w:t>
-      </w:r>
-      <w:r>
-        <w:rPr>
-          <w:rFonts w:ascii="Hiragino Sans" w:hAnsi="Hiragino Sans" w:cs="Hiragino Sans"/>
-          <w:sz w:val="29"/>
-          <w:sz-cs w:val="29"/>
-          <w:spacing w:val="0"/>
-        </w:rPr>
-        <w:t xml:space="preserve"/>
-      </w:r>
-    </w:p>
-    <w:p>
-      <w:pPr>
-        <w:spacing w:after="240"/>
-      </w:pPr>
-      <w:r>
-        <w:rPr>
-          <w:rFonts w:ascii="Hiragino Sans" w:hAnsi="Hiragino Sans" w:cs="Hiragino Sans"/>
-          <w:sz w:val="29"/>
-          <w:sz-cs w:val="29"/>
-          <w:spacing w:val="0"/>
-          <w:color w:val="343434"/>
-        </w:rPr>
-        <w:t xml:space="preserve">世界で1番お金と時間を使うツールが AI である以上、日々使う事が当たり前になった時、使い始めて1年満たない今ですら、社内でのコミュニケーションに違和感を感じたり、思考のロスを感じています。</w:t>
-      </w:r>
-      <w:r>
-        <w:rPr>
-          <w:rFonts w:ascii="Hiragino Sans" w:hAnsi="Hiragino Sans" w:cs="Hiragino Sans"/>
-          <w:sz w:val="29"/>
-          <w:sz-cs w:val="29"/>
-          <w:spacing w:val="0"/>
-          <w:color w:val="343434"/>
-        </w:rPr>
-        <w:t xml:space="preserve"/>
-      </w:r>
-    </w:p>
-    <w:p>
-      <w:pPr>
-        <w:spacing w:after="240"/>
-      </w:pPr>
-      <w:r>
-        <w:rPr>
-          <w:rFonts w:ascii="Hiragino Sans" w:hAnsi="Hiragino Sans" w:cs="Hiragino Sans"/>
-          <w:sz w:val="29"/>
-          <w:sz-cs w:val="29"/>
-          <w:spacing w:val="0"/>
-          <w:color w:val="343434"/>
-        </w:rPr>
-        <w:t xml:space="preserve">その反面、今まで以上に速度早く、簡単に、そしてプロが要らなくなるような内容をAI がつくってくれることも事実です。</w:t>
-      </w:r>
-      <w:r>
-        <w:rPr>
-          <w:rFonts w:ascii="Hiragino Sans" w:hAnsi="Hiragino Sans" w:cs="Hiragino Sans"/>
-          <w:sz w:val="29"/>
-          <w:sz-cs w:val="29"/>
-          <w:spacing w:val="0"/>
-          <w:color w:val="343434"/>
-        </w:rPr>
-        <w:t xml:space="preserve"/>
-      </w:r>
-    </w:p>
-    <w:p>
-      <w:pPr>
-        <w:spacing w:after="240"/>
-      </w:pPr>
-      <w:r>
-        <w:rPr>
-          <w:rFonts w:ascii="Hiragino Sans" w:hAnsi="Hiragino Sans" w:cs="Hiragino Sans"/>
-          <w:sz w:val="29"/>
-          <w:sz-cs w:val="29"/>
-          <w:spacing w:val="0"/>
-          <w:color w:val="343434"/>
-        </w:rPr>
-        <w:t xml:space="preserve">この AI に対して、</w:t>
-      </w:r>
-      <w:r>
-        <w:rPr>
-          <w:rFonts w:ascii="Hiragino Sans" w:hAnsi="Hiragino Sans" w:cs="Hiragino Sans"/>
-          <w:sz w:val="29"/>
-          <w:sz-cs w:val="29"/>
-          <w:b/>
-          <w:spacing w:val="0"/>
-          <w:color w:val="343434"/>
-        </w:rPr>
-        <w:t xml:space="preserve">どう使うか？の倫理観がとっても大切になってくる</w:t>
-      </w:r>
-      <w:r>
-        <w:rPr>
-          <w:rFonts w:ascii="Hiragino Sans" w:hAnsi="Hiragino Sans" w:cs="Hiragino Sans"/>
-          <w:sz w:val="29"/>
-          <w:sz-cs w:val="29"/>
-          <w:spacing w:val="0"/>
-          <w:color w:val="343434"/>
-        </w:rPr>
-        <w:t xml:space="preserve">ことを日々感じています。</w:t>
-      </w:r>
-      <w:r>
-        <w:rPr>
-          <w:rFonts w:ascii="Hiragino Sans" w:hAnsi="Hiragino Sans" w:cs="Hiragino Sans"/>
-          <w:sz w:val="29"/>
-          <w:sz-cs w:val="29"/>
-          <w:spacing w:val="0"/>
-          <w:color w:val="343434"/>
-        </w:rPr>
-        <w:t xml:space="preserve"/>
-      </w:r>
-    </w:p>
-    <w:p>
-      <w:pPr>
-        <w:spacing w:after="240"/>
-      </w:pPr>
-      <w:r>
-        <w:rPr>
-          <w:rFonts w:ascii="Hiragino Sans" w:hAnsi="Hiragino Sans" w:cs="Hiragino Sans"/>
-          <w:sz w:val="29"/>
-          <w:sz-cs w:val="29"/>
-          <w:b/>
-          <w:spacing w:val="0"/>
-          <w:color w:val="343434"/>
-        </w:rPr>
-        <w:t xml:space="preserve">AI は、使われるではなく使いこなし</w:t>
-      </w:r>
-      <w:r>
-        <w:rPr>
-          <w:rFonts w:ascii="Hiragino Sans" w:hAnsi="Hiragino Sans" w:cs="Hiragino Sans"/>
-          <w:sz w:val="29"/>
-          <w:sz-cs w:val="29"/>
-          <w:spacing w:val="0"/>
-          <w:color w:val="343434"/>
-        </w:rPr>
-        <w:t xml:space="preserve">、空いた時間になにをするか？を本当にしたい事を考えられるチャンスと捉え、今の時代だからこそできる時間を楽しんでくれる人たちを増やしていきたいと思っています。</w:t>
-      </w:r>
-      <w:r>
-        <w:rPr>
-          <w:rFonts w:ascii="Hiragino Sans" w:hAnsi="Hiragino Sans" w:cs="Hiragino Sans"/>
-          <w:sz w:val="29"/>
-          <w:sz-cs w:val="29"/>
-          <w:spacing w:val="0"/>
-          <w:color w:val="343434"/>
-        </w:rPr>
-        <w:t xml:space="preserve"/>
-      </w:r>
-    </w:p>
-    <w:p>
-      <w:pPr>
-        <w:spacing w:after="240"/>
-      </w:pPr>
-      <w:r>
-        <w:rPr>
-          <w:rFonts w:ascii="Hiragino Sans" w:hAnsi="Hiragino Sans" w:cs="Hiragino Sans"/>
-          <w:sz w:val="29"/>
-          <w:sz-cs w:val="29"/>
-          <w:spacing w:val="0"/>
-          <w:color w:val="343434"/>
-        </w:rPr>
-        <w:t xml:space="preserve">私が経営者をやりながらも、音楽に没頭できるのも、少なからず AI の力を借りているからと思う分、より AI を追求し、学び、</w:t>
-      </w:r>
-      <w:r>
-        <w:rPr>
-          <w:rFonts w:ascii="Hiragino Sans" w:hAnsi="Hiragino Sans" w:cs="Hiragino Sans"/>
-          <w:sz w:val="29"/>
-          <w:sz-cs w:val="29"/>
-          <w:b/>
-          <w:spacing w:val="0"/>
-          <w:color w:val="343434"/>
-        </w:rPr>
-        <w:t xml:space="preserve">それを新しい体験や価値を生む時間に変えて行きたい</w:t>
-      </w:r>
-      <w:r>
-        <w:rPr>
-          <w:rFonts w:ascii="Hiragino Sans" w:hAnsi="Hiragino Sans" w:cs="Hiragino Sans"/>
-          <w:sz w:val="29"/>
-          <w:sz-cs w:val="29"/>
-          <w:spacing w:val="0"/>
-          <w:color w:val="343434"/>
-        </w:rPr>
-        <w:t xml:space="preserve">と思っています。</w:t>
-      </w:r>
-      <w:r>
-        <w:rPr>
-          <w:rFonts w:ascii="Hiragino Sans" w:hAnsi="Hiragino Sans" w:cs="Hiragino Sans"/>
-          <w:sz w:val="29"/>
-          <w:sz-cs w:val="29"/>
-          <w:spacing w:val="0"/>
-          <w:color w:val="343434"/>
-        </w:rPr>
-        <w:t xml:space="preserve"/>
-      </w:r>
-    </w:p>
-    <w:p>
-      <w:pPr>
-        <w:spacing w:after="240"/>
-      </w:pPr>
-      <w:r>
-        <w:rPr>
-          <w:rFonts w:ascii="Hiragino Sans" w:hAnsi="Hiragino Sans" w:cs="Hiragino Sans"/>
-          <w:sz w:val="29"/>
-          <w:sz-cs w:val="29"/>
-          <w:spacing w:val="0"/>
-          <w:color w:val="343434"/>
-        </w:rPr>
-        <w:t xml:space="preserve">AI が何でも答えてくれる時代に、</w:t>
-      </w:r>
-      <w:r>
-        <w:rPr>
-          <w:rFonts w:ascii="Hiragino Sans" w:hAnsi="Hiragino Sans" w:cs="Hiragino Sans"/>
-          <w:sz w:val="29"/>
-          <w:sz-cs w:val="29"/>
-          <w:b/>
-          <w:spacing w:val="0"/>
-          <w:color w:val="343434"/>
-        </w:rPr>
-        <w:t xml:space="preserve">わざわざ人が集まって、生の音を浴びる意味は何なのか。</w:t>
-      </w:r>
-      <w:r>
-        <w:rPr>
-          <w:rFonts w:ascii="Hiragino Sans" w:hAnsi="Hiragino Sans" w:cs="Hiragino Sans"/>
-          <w:sz w:val="29"/>
-          <w:sz-cs w:val="29"/>
-          <w:spacing w:val="0"/>
-          <w:color w:val="343434"/>
-        </w:rPr>
-        <w:t xml:space="preserve">私たちは、そこに意味があると思っています。だから音楽をやるし、だから人と関わる力を大事にしたい。</w:t>
-      </w:r>
-      <w:r>
-        <w:rPr>
-          <w:rFonts w:ascii="Hiragino Sans" w:hAnsi="Hiragino Sans" w:cs="Hiragino Sans"/>
-          <w:sz w:val="29"/>
-          <w:sz-cs w:val="29"/>
-          <w:spacing w:val="0"/>
-          <w:color w:val="343434"/>
-        </w:rPr>
-        <w:t xml:space="preserve"/>
-      </w:r>
-    </w:p>
-    <w:p>
-      <w:pPr>
-        <w:spacing w:after="240"/>
-      </w:pPr>
-      <w:r>
-        <w:rPr>
-          <w:rFonts w:ascii="Hiragino Sans" w:hAnsi="Hiragino Sans" w:cs="Hiragino Sans"/>
-          <w:sz w:val="29"/>
-          <w:sz-cs w:val="29"/>
-          <w:spacing w:val="0"/>
-          <w:color w:val="343434"/>
-        </w:rPr>
-        <w:t xml:space="preserve">——MIO（社美緒）</w:t>
-      </w:r>
-      <w:r>
-        <w:rPr>
-          <w:rFonts w:ascii="Hiragino Sans" w:hAnsi="Hiragino Sans" w:cs="Hiragino Sans"/>
-          <w:sz w:val="29"/>
-          <w:sz-cs w:val="29"/>
-          <w:spacing w:val="0"/>
-          <w:color w:val="343434"/>
-        </w:rPr>
-        <w:t xml:space="preserve"/>
-      </w:r>
-    </w:p>
-    <w:p>
-      <w:pPr/>
-      <w:r>
-        <w:rPr>
-          <w:rFonts w:ascii="Hiragino Sans" w:hAnsi="Hiragino Sans" w:cs="Hiragino Sans"/>
-          <w:sz w:val="29"/>
-          <w:sz-cs w:val="29"/>
-          <w:spacing w:val="0"/>
-          <w:color w:val="6D6D6D"/>
-        </w:rPr>
-        <w:t xml:space="preserve"/>
-      </w:r>
-    </w:p>
-    <w:p>
-      <w:pPr>
-        <w:spacing w:after="240"/>
-      </w:pPr>
-      <w:r>
-        <w:rPr>
-          <w:rFonts w:ascii="Hiragino Sans" w:hAnsi="Hiragino Sans" w:cs="Hiragino Sans"/>
-          <w:sz w:val="29"/>
-          <w:sz-cs w:val="29"/>
-          <w:b/>
-          <w:spacing w:val="0"/>
-        </w:rPr>
-        <w:t xml:space="preserve">そして私たちはいま、「学ぶ場そのものをつくる」準備を進めています。</w:t>
-      </w:r>
-      <w:r>
-        <w:rPr>
-          <w:rFonts w:ascii="Hiragino Sans" w:hAnsi="Hiragino Sans" w:cs="Hiragino Sans"/>
-          <w:sz w:val="29"/>
-          <w:sz-cs w:val="29"/>
-          <w:spacing w:val="0"/>
-        </w:rPr>
-        <w:t xml:space="preserve"/>
-      </w:r>
-    </w:p>
-    <w:p>
-      <w:pPr>
-        <w:spacing w:after="240"/>
-      </w:pPr>
-      <w:r>
-        <w:rPr>
-          <w:rFonts w:ascii="Hiragino Sans" w:hAnsi="Hiragino Sans" w:cs="Hiragino Sans"/>
-          <w:sz w:val="29"/>
-          <w:sz-cs w:val="29"/>
-          <w:spacing w:val="0"/>
-        </w:rPr>
-        <w:t xml:space="preserve">支援して終わりにするのではなく、次の世代が学べる場所を自分たちの手でつくる。</w:t>
-      </w:r>
-      <w:r>
-        <w:rPr>
-          <w:rFonts w:ascii="Hiragino Sans" w:hAnsi="Hiragino Sans" w:cs="Hiragino Sans"/>
-          <w:sz w:val="29"/>
-          <w:sz-cs w:val="29"/>
-          <w:b/>
-          <w:spacing w:val="0"/>
-        </w:rPr>
-        <w:t xml:space="preserve">この夜は、そのはじまりの一歩です。</w:t>
-      </w:r>
-      <w:r>
-        <w:rPr>
-          <w:rFonts w:ascii="Hiragino Sans" w:hAnsi="Hiragino Sans" w:cs="Hiragino Sans"/>
-          <w:sz w:val="29"/>
-          <w:sz-cs w:val="29"/>
-          <w:spacing w:val="0"/>
-        </w:rPr>
-        <w:t xml:space="preserve"/>
+        <w:t xml:space="preserve">4. 文化 ── 歴史を重んじることが、つながりになる</w:t>
+      </w:r>
+    </w:p>
+    <w:p>
+      <w:pPr>
+        <w:spacing w:after="240"/>
+      </w:pPr>
+      <w:r>
+        <w:rPr>
+          <w:rFonts w:ascii="Hiragino Sans" w:hAnsi="Hiragino Sans" w:cs="Hiragino Sans"/>
+          <w:sz w:val="29"/>
+          <w:sz-cs w:val="29"/>
+          <w:spacing w:val="0"/>
+        </w:rPr>
+        <w:t xml:space="preserve">3つ目が </w:t>
+      </w:r>
+      <w:r>
+        <w:rPr>
+          <w:rFonts w:ascii="Hiragino Sans" w:hAnsi="Hiragino Sans" w:cs="Hiragino Sans"/>
+          <w:sz w:val="29"/>
+          <w:sz-cs w:val="29"/>
+          <w:b/>
+          <w:spacing w:val="0"/>
+        </w:rPr>
+        <w:t xml:space="preserve">文化</w:t>
+      </w:r>
+      <w:r>
+        <w:rPr>
+          <w:rFonts w:ascii="Hiragino Sans" w:hAnsi="Hiragino Sans" w:cs="Hiragino Sans"/>
+          <w:sz w:val="29"/>
+          <w:sz-cs w:val="29"/>
+          <w:spacing w:val="0"/>
+        </w:rPr>
+        <w:t xml:space="preserve">です。</w:t>
+      </w:r>
+    </w:p>
+    <w:p>
+      <w:pPr>
+        <w:spacing w:after="240"/>
+      </w:pPr>
+      <w:r>
+        <w:rPr>
+          <w:rFonts w:ascii="Hiragino Sans" w:hAnsi="Hiragino Sans" w:cs="Hiragino Sans"/>
+          <w:sz w:val="29"/>
+          <w:sz-cs w:val="29"/>
+          <w:spacing w:val="0"/>
+        </w:rPr>
+        <w:t xml:space="preserve">僕たちが大切にしているのは、</w:t>
+      </w:r>
+      <w:r>
+        <w:rPr>
+          <w:rFonts w:ascii="Hiragino Sans" w:hAnsi="Hiragino Sans" w:cs="Hiragino Sans"/>
+          <w:sz w:val="29"/>
+          <w:sz-cs w:val="29"/>
+          <w:b/>
+          <w:spacing w:val="0"/>
+        </w:rPr>
+        <w:t xml:space="preserve">文化そのものの歴史を重んじる</w:t>
+      </w:r>
+      <w:r>
+        <w:rPr>
+          <w:rFonts w:ascii="Hiragino Sans" w:hAnsi="Hiragino Sans" w:cs="Hiragino Sans"/>
+          <w:sz w:val="29"/>
+          <w:sz-cs w:val="29"/>
+          <w:spacing w:val="0"/>
+        </w:rPr>
+        <w:t xml:space="preserve">ということ。</w:t>
+      </w:r>
+    </w:p>
+    <w:p>
+      <w:pPr>
+        <w:spacing w:after="240"/>
+      </w:pPr>
+      <w:r>
+        <w:rPr>
+          <w:rFonts w:ascii="Hiragino Sans" w:hAnsi="Hiragino Sans" w:cs="Hiragino Sans"/>
+          <w:sz w:val="29"/>
+          <w:sz-cs w:val="29"/>
+          <w:spacing w:val="0"/>
+        </w:rPr>
+        <w:t xml:space="preserve">いま自分たちがやっていることは、突然生まれたものではありません。</w:t>
+      </w:r>
+      <w:r>
+        <w:rPr>
+          <w:rFonts w:ascii="Hiragino Sans" w:hAnsi="Hiragino Sans" w:cs="Hiragino Sans"/>
+          <w:sz w:val="29"/>
+          <w:sz-cs w:val="29"/>
+          <w:b/>
+          <w:spacing w:val="0"/>
+        </w:rPr>
+        <w:t xml:space="preserve">受け継がれてきたものの上に立っています。</w:t>
+      </w:r>
+      <w:r>
+        <w:rPr>
+          <w:rFonts w:ascii="Hiragino Sans" w:hAnsi="Hiragino Sans" w:cs="Hiragino Sans"/>
+          <w:sz w:val="29"/>
+          <w:sz-cs w:val="29"/>
+          <w:spacing w:val="0"/>
+        </w:rPr>
+        <w:t xml:space="preserve">その歴史を重んじるからこそ、</w:t>
+      </w:r>
+      <w:r>
+        <w:rPr>
+          <w:rFonts w:ascii="Hiragino Sans" w:hAnsi="Hiragino Sans" w:cs="Hiragino Sans"/>
+          <w:sz w:val="29"/>
+          <w:sz-cs w:val="29"/>
+          <w:b/>
+          <w:spacing w:val="0"/>
+        </w:rPr>
+        <w:t xml:space="preserve">自分たちのやることが、文化のつながりになっていく。</w:t>
+      </w:r>
+      <w:r>
+        <w:rPr>
+          <w:rFonts w:ascii="Hiragino Sans" w:hAnsi="Hiragino Sans" w:cs="Hiragino Sans"/>
+          <w:sz w:val="29"/>
+          <w:sz-cs w:val="29"/>
+          <w:spacing w:val="0"/>
+        </w:rPr>
+        <w:t xml:space="preserve"/>
+      </w:r>
+    </w:p>
+    <w:p>
+      <w:pPr>
+        <w:spacing w:after="240"/>
+      </w:pPr>
+      <w:r>
+        <w:rPr>
+          <w:rFonts w:ascii="Hiragino Sans" w:hAnsi="Hiragino Sans" w:cs="Hiragino Sans"/>
+          <w:sz w:val="29"/>
+          <w:sz-cs w:val="29"/>
+          <w:spacing w:val="0"/>
+        </w:rPr>
+        <w:t xml:space="preserve">だから活動の場所も、そういう場所を選んできました。</w:t>
+      </w:r>
+    </w:p>
+    <w:p>
+      <w:pPr>
+        <w:spacing w:after="240"/>
+      </w:pPr>
+      <w:r>
+        <w:rPr>
+          <w:rFonts w:ascii="Hiragino Sans" w:hAnsi="Hiragino Sans" w:cs="Hiragino Sans"/>
+          <w:sz w:val="29"/>
+          <w:sz-cs w:val="29"/>
+          <w:spacing w:val="0"/>
+        </w:rPr>
+        <w:t xml:space="preserve">同じ日の昼には、文化継承をテーマにしたチャリティーイベント</w:t>
+      </w:r>
+      <w:r>
+        <w:rPr>
+          <w:rFonts w:ascii="Hiragino Sans" w:hAnsi="Hiragino Sans" w:cs="Hiragino Sans"/>
+          <w:sz w:val="29"/>
+          <w:sz-cs w:val="29"/>
+          <w:b/>
+          <w:spacing w:val="0"/>
+        </w:rPr>
+        <w:t xml:space="preserve">「WRAPPING THE EARTH TOKYO 2026」</w:t>
+      </w:r>
+      <w:r>
+        <w:rPr>
+          <w:rFonts w:ascii="Hiragino Sans" w:hAnsi="Hiragino Sans" w:cs="Hiragino Sans"/>
+          <w:sz w:val="29"/>
+          <w:sz-cs w:val="29"/>
+          <w:spacing w:val="0"/>
+        </w:rPr>
+        <w:t xml:space="preserve">が開かれます。守り、次の世代へ渡していく——向いている先は、僕たちと同じです。</w:t>
+      </w:r>
+    </w:p>
+    <w:p>
+      <w:pPr>
+        <w:spacing w:after="240"/>
+      </w:pPr>
+      <w:r>
+        <w:rPr>
+          <w:rFonts w:ascii="Hiragino Sans" w:hAnsi="Hiragino Sans" w:cs="Hiragino Sans"/>
+          <w:sz w:val="29"/>
+          <w:sz-cs w:val="29"/>
+          <w:spacing w:val="0"/>
+        </w:rPr>
+        <w:t xml:space="preserve">その夜を、渋谷の空の上で鳴らします。</w:t>
       </w:r>
     </w:p>
     <w:p>
@@ -1778,7 +1954,268 @@
           <w:spacing w:val="0"/>
           <w:color w:val="7A0014"/>
         </w:rPr>
-        <w:t xml:space="preserve">6. イベント概要</w:t>
+        <w:t xml:space="preserve">6. なぜ、チャリティーライブなのか</w:t>
+      </w:r>
+    </w:p>
+    <w:p>
+      <w:pPr>
+        <w:spacing w:after="240"/>
+      </w:pPr>
+      <w:r>
+        <w:rPr>
+          <w:rFonts w:ascii="Hiragino Sans" w:hAnsi="Hiragino Sans" w:cs="Hiragino Sans"/>
+          <w:sz w:val="29"/>
+          <w:sz-cs w:val="29"/>
+          <w:spacing w:val="0"/>
+        </w:rPr>
+        <w:t xml:space="preserve">はじめに、ひとつだけ書かせてください。</w:t>
+      </w:r>
+    </w:p>
+    <w:p>
+      <w:pPr>
+        <w:spacing w:after="240"/>
+      </w:pPr>
+      <w:r>
+        <w:rPr>
+          <w:rFonts w:ascii="Hiragino Sans" w:hAnsi="Hiragino Sans" w:cs="Hiragino Sans"/>
+          <w:sz w:val="29"/>
+          <w:sz-cs w:val="29"/>
+          <w:b/>
+          <w:spacing w:val="0"/>
+        </w:rPr>
+        <w:t xml:space="preserve">これはホストとしての活動ではありません。VALHALLA というバンドとして、音楽で社会に関わっていきたい</w:t>
+      </w:r>
+      <w:r>
+        <w:rPr>
+          <w:rFonts w:ascii="Hiragino Sans" w:hAnsi="Hiragino Sans" w:cs="Hiragino Sans"/>
+          <w:sz w:val="29"/>
+          <w:sz-cs w:val="29"/>
+          <w:spacing w:val="0"/>
+        </w:rPr>
+        <w:t xml:space="preserve">という想いから始まっています。</w:t>
+      </w:r>
+    </w:p>
+    <w:p>
+      <w:pPr>
+        <w:spacing w:after="240"/>
+      </w:pPr>
+      <w:r>
+        <w:rPr>
+          <w:rFonts w:ascii="Hiragino Sans" w:hAnsi="Hiragino Sans" w:cs="Hiragino Sans"/>
+          <w:sz w:val="29"/>
+          <w:sz-cs w:val="29"/>
+          <w:spacing w:val="0"/>
+        </w:rPr>
+        <w:t xml:space="preserve">そして——</w:t>
+      </w:r>
+      <w:r>
+        <w:rPr>
+          <w:rFonts w:ascii="Hiragino Sans" w:hAnsi="Hiragino Sans" w:cs="Hiragino Sans"/>
+          <w:sz w:val="29"/>
+          <w:sz-cs w:val="29"/>
+          <w:b/>
+          <w:spacing w:val="0"/>
+        </w:rPr>
+        <w:t xml:space="preserve">自分ひとりで寄付をすることは、簡単です。</w:t>
+      </w:r>
+      <w:r>
+        <w:rPr>
+          <w:rFonts w:ascii="Hiragino Sans" w:hAnsi="Hiragino Sans" w:cs="Hiragino Sans"/>
+          <w:sz w:val="29"/>
+          <w:sz-cs w:val="29"/>
+          <w:spacing w:val="0"/>
+        </w:rPr>
+        <w:t xml:space="preserve"/>
+      </w:r>
+    </w:p>
+    <w:p>
+      <w:pPr>
+        <w:spacing w:after="240"/>
+      </w:pPr>
+      <w:r>
+        <w:rPr>
+          <w:rFonts w:ascii="Hiragino Sans" w:hAnsi="Hiragino Sans" w:cs="Hiragino Sans"/>
+          <w:sz w:val="29"/>
+          <w:sz-cs w:val="29"/>
+          <w:spacing w:val="0"/>
+        </w:rPr>
+        <w:t xml:space="preserve">でも僕がやりたいのは、個人で完結させることではありません。</w:t>
+      </w:r>
+    </w:p>
+    <w:p>
+      <w:pPr>
+        <w:spacing w:after="240"/>
+      </w:pPr>
+      <w:r>
+        <w:rPr>
+          <w:rFonts w:ascii="Hiragino Sans" w:hAnsi="Hiragino Sans" w:cs="Hiragino Sans"/>
+          <w:sz w:val="29"/>
+          <w:sz-cs w:val="29"/>
+          <w:b/>
+          <w:spacing w:val="0"/>
+        </w:rPr>
+        <w:t xml:space="preserve">来てくださった方が楽しむことが、そのまま寄付につながる。</w:t>
+      </w:r>
+      <w:r>
+        <w:rPr>
+          <w:rFonts w:ascii="Hiragino Sans" w:hAnsi="Hiragino Sans" w:cs="Hiragino Sans"/>
+          <w:sz w:val="29"/>
+          <w:sz-cs w:val="29"/>
+          <w:spacing w:val="0"/>
+        </w:rPr>
+        <w:t xml:space="preserve">その形にすることで、</w:t>
+      </w:r>
+      <w:r>
+        <w:rPr>
+          <w:rFonts w:ascii="Hiragino Sans" w:hAnsi="Hiragino Sans" w:cs="Hiragino Sans"/>
+          <w:sz w:val="29"/>
+          <w:sz-cs w:val="29"/>
+          <w:b/>
+          <w:spacing w:val="0"/>
+        </w:rPr>
+        <w:t xml:space="preserve">これまで寄付に関わってこなかった人たちも巻き込んでいきたい。</w:t>
+      </w:r>
+      <w:r>
+        <w:rPr>
+          <w:rFonts w:ascii="Hiragino Sans" w:hAnsi="Hiragino Sans" w:cs="Hiragino Sans"/>
+          <w:sz w:val="29"/>
+          <w:sz-cs w:val="29"/>
+          <w:spacing w:val="0"/>
+        </w:rPr>
+        <w:t xml:space="preserve">輪が広がっていくことを、いちばん大切にしたいと考えています。</w:t>
+      </w:r>
+    </w:p>
+    <w:p>
+      <w:pPr/>
+      <w:r>
+        <w:rPr>
+          <w:rFonts w:ascii="Hiragino Sans" w:hAnsi="Hiragino Sans" w:cs="Hiragino Sans"/>
+          <w:sz w:val="29"/>
+          <w:sz-cs w:val="29"/>
+          <w:spacing w:val="0"/>
+          <w:color w:val="6D6D6D"/>
+        </w:rPr>
+        <w:t xml:space="preserve"/>
+      </w:r>
+    </w:p>
+    <w:p>
+      <w:pPr>
+        <w:spacing w:after="240"/>
+      </w:pPr>
+      <w:r>
+        <w:rPr>
+          <w:rFonts w:ascii="Hiragino Sans" w:hAnsi="Hiragino Sans" w:cs="Hiragino Sans"/>
+          <w:sz w:val="29"/>
+          <w:sz-cs w:val="29"/>
+          <w:spacing w:val="0"/>
+        </w:rPr>
+        <w:t xml:space="preserve">経営者として事業を営みながら、音楽が好きでバンドを始めました。いくつもの顔を持つなかで、僕が大切にしたいと思うようになったのは、</w:t>
+      </w:r>
+      <w:r>
+        <w:rPr>
+          <w:rFonts w:ascii="Hiragino Sans" w:hAnsi="Hiragino Sans" w:cs="Hiragino Sans"/>
+          <w:sz w:val="29"/>
+          <w:sz-cs w:val="29"/>
+          <w:b/>
+          <w:spacing w:val="0"/>
+        </w:rPr>
+        <w:t xml:space="preserve">新しい人との出会いから生まれる、体験と価値を届けること</w:t>
+      </w:r>
+      <w:r>
+        <w:rPr>
+          <w:rFonts w:ascii="Hiragino Sans" w:hAnsi="Hiragino Sans" w:cs="Hiragino Sans"/>
+          <w:sz w:val="29"/>
+          <w:sz-cs w:val="29"/>
+          <w:spacing w:val="0"/>
+        </w:rPr>
+        <w:t xml:space="preserve">です。</w:t>
+      </w:r>
+    </w:p>
+    <w:p>
+      <w:pPr>
+        <w:spacing w:after="240"/>
+      </w:pPr>
+      <w:r>
+        <w:rPr>
+          <w:rFonts w:ascii="Hiragino Sans" w:hAnsi="Hiragino Sans" w:cs="Hiragino Sans"/>
+          <w:sz w:val="29"/>
+          <w:sz-cs w:val="29"/>
+          <w:spacing w:val="0"/>
+        </w:rPr>
+        <w:t xml:space="preserve">ライブの一体感は、その時にしかつくられません。</w:t>
+      </w:r>
+      <w:r>
+        <w:rPr>
+          <w:rFonts w:ascii="Hiragino Sans" w:hAnsi="Hiragino Sans" w:cs="Hiragino Sans"/>
+          <w:sz w:val="29"/>
+          <w:sz-cs w:val="29"/>
+          <w:b/>
+          <w:spacing w:val="0"/>
+        </w:rPr>
+        <w:t xml:space="preserve">その場にいる全員が、同じ想いになる。</w:t>
+      </w:r>
+      <w:r>
+        <w:rPr>
+          <w:rFonts w:ascii="Hiragino Sans" w:hAnsi="Hiragino Sans" w:cs="Hiragino Sans"/>
+          <w:sz w:val="29"/>
+          <w:sz-cs w:val="29"/>
+          <w:spacing w:val="0"/>
+        </w:rPr>
+        <w:t xml:space="preserve"/>
+      </w:r>
+    </w:p>
+    <w:p>
+      <w:pPr>
+        <w:spacing w:after="240"/>
+      </w:pPr>
+      <w:r>
+        <w:rPr>
+          <w:rFonts w:ascii="Hiragino Sans" w:hAnsi="Hiragino Sans" w:cs="Hiragino Sans"/>
+          <w:sz w:val="29"/>
+          <w:sz-cs w:val="29"/>
+          <w:spacing w:val="0"/>
+        </w:rPr>
+        <w:t xml:space="preserve">自分だけがする社会貢献ではなく、これからの世界をつくる若者や、同じ想いを持つ人たちを増やしていくこと。それがこれからの世界に必要だと考えています。</w:t>
+      </w:r>
+    </w:p>
+    <w:p>
+      <w:pPr>
+        <w:spacing w:after="240"/>
+      </w:pPr>
+      <w:r>
+        <w:rPr>
+          <w:rFonts w:ascii="Hiragino Sans" w:hAnsi="Hiragino Sans" w:cs="Hiragino Sans"/>
+          <w:sz w:val="29"/>
+          <w:sz-cs w:val="29"/>
+          <w:b/>
+          <w:spacing w:val="0"/>
+        </w:rPr>
+        <w:t xml:space="preserve">私たちと過ごした楽しい時間——その FUN! が、寄付という形で社会貢献につながる。</w:t>
+      </w:r>
+      <w:r>
+        <w:rPr>
+          <w:rFonts w:ascii="Hiragino Sans" w:hAnsi="Hiragino Sans" w:cs="Hiragino Sans"/>
+          <w:sz w:val="29"/>
+          <w:sz-cs w:val="29"/>
+          <w:spacing w:val="0"/>
+        </w:rPr>
+        <w:t xml:space="preserve">そういう体験を提供して、その価値をより多くの方へ広げていきたいと思っています。</w:t>
+      </w:r>
+    </w:p>
+    <w:p>
+      <w:pPr>
+        <w:spacing w:after="287"/>
+      </w:pPr>
+      <w:r>
+        <w:rPr>
+          <w:rFonts w:ascii="Hiragino Sans" w:hAnsi="Hiragino Sans" w:cs="Hiragino Sans"/>
+          <w:sz w:val="34"/>
+          <w:sz-cs w:val="34"/>
+          <w:b/>
+          <w:spacing w:val="0"/>
+          <w:color w:val="7A0014"/>
+        </w:rPr>
+        <w:t xml:space="preserve">7. イベント概要</w:t>
       </w:r>
     </w:p>
     <w:p>
@@ -2705,7 +3142,7 @@
           <w:spacing w:val="0"/>
           <w:color w:val="7A0014"/>
         </w:rPr>
-        <w:t xml:space="preserve">7. 出演者</w:t>
+        <w:t xml:space="preserve">8. 出演者</w:t>
       </w:r>
     </w:p>
     <w:p>
@@ -2949,7 +3386,7 @@
           <w:spacing w:val="0"/>
           <w:color w:val="7A0014"/>
         </w:rPr>
-        <w:t xml:space="preserve">8. リターンのご紹介</w:t>
+        <w:t xml:space="preserve">9. リターンのご紹介</w:t>
       </w:r>
     </w:p>
     <w:p>
@@ -4676,7 +5113,7 @@
           <w:spacing w:val="0"/>
           <w:color w:val="7A0014"/>
         </w:rPr>
-        <w:t xml:space="preserve">9. スケジュール</w:t>
+        <w:t xml:space="preserve">10. スケジュール</w:t>
       </w:r>
     </w:p>
     <w:p>
@@ -4920,7 +5357,7 @@
           <w:spacing w:val="0"/>
           <w:color w:val="7A0014"/>
         </w:rPr>
-        <w:t xml:space="preserve">10. 資金の使い道</w:t>
+        <w:t xml:space="preserve">11. 資金の使い道</w:t>
       </w:r>
     </w:p>
     <w:p>
@@ -5245,102 +5682,140 @@
           <w:spacing w:val="0"/>
           <w:color w:val="7A0014"/>
         </w:rPr>
-        <w:t xml:space="preserve">11. 最後に</w:t>
-      </w:r>
-    </w:p>
-    <w:p>
-      <w:pPr>
-        <w:spacing w:after="240"/>
-      </w:pPr>
-      <w:r>
-        <w:rPr>
-          <w:rFonts w:ascii="Hiragino Sans" w:hAnsi="Hiragino Sans" w:cs="Hiragino Sans"/>
-          <w:sz w:val="29"/>
-          <w:sz-cs w:val="29"/>
-          <w:b/>
-          <w:spacing w:val="0"/>
-        </w:rPr>
-        <w:t xml:space="preserve">「ビジュアル系文化を守り、継ぐ。」</w:t>
-      </w:r>
-      <w:r>
-        <w:rPr>
-          <w:rFonts w:ascii="Hiragino Sans" w:hAnsi="Hiragino Sans" w:cs="Hiragino Sans"/>
-          <w:sz w:val="29"/>
-          <w:sz-cs w:val="29"/>
-          <w:spacing w:val="0"/>
-        </w:rPr>
-        <w:t xml:space="preserve"/>
-      </w:r>
-    </w:p>
-    <w:p>
-      <w:pPr>
-        <w:spacing w:after="240"/>
-      </w:pPr>
-      <w:r>
-        <w:rPr>
-          <w:rFonts w:ascii="Hiragino Sans" w:hAnsi="Hiragino Sans" w:cs="Hiragino Sans"/>
-          <w:sz w:val="29"/>
-          <w:sz-cs w:val="29"/>
-          <w:spacing w:val="0"/>
-        </w:rPr>
-        <w:t xml:space="preserve">これは、このイベントに掲げたスローガンです。けれど、その根底にある私たちの気持ちは、もっと単純です。</w:t>
-      </w:r>
-    </w:p>
-    <w:p>
-      <w:pPr>
-        <w:spacing w:after="240"/>
-      </w:pPr>
-      <w:r>
-        <w:rPr>
-          <w:rFonts w:ascii="Hiragino Sans" w:hAnsi="Hiragino Sans" w:cs="Hiragino Sans"/>
-          <w:sz w:val="29"/>
-          <w:sz-cs w:val="29"/>
-          <w:b/>
-          <w:spacing w:val="0"/>
-        </w:rPr>
-        <w:t xml:space="preserve">ビジュアル系文化を、もう一度、再興したい。</w:t>
-      </w:r>
-      <w:r>
-        <w:rPr>
-          <w:rFonts w:ascii="Hiragino Sans" w:hAnsi="Hiragino Sans" w:cs="Hiragino Sans"/>
-          <w:sz w:val="29"/>
-          <w:sz-cs w:val="29"/>
-          <w:spacing w:val="0"/>
-        </w:rPr>
-        <w:t xml:space="preserve"/>
-      </w:r>
-    </w:p>
-    <w:p>
-      <w:pPr>
-        <w:spacing w:after="240"/>
-      </w:pPr>
-      <w:r>
-        <w:rPr>
-          <w:rFonts w:ascii="Hiragino Sans" w:hAnsi="Hiragino Sans" w:cs="Hiragino Sans"/>
-          <w:sz w:val="29"/>
-          <w:sz-cs w:val="29"/>
-          <w:spacing w:val="0"/>
-        </w:rPr>
-        <w:t xml:space="preserve">守るだけでも、継ぐだけでもなく、</w:t>
-      </w:r>
-      <w:r>
-        <w:rPr>
-          <w:rFonts w:ascii="Hiragino Sans" w:hAnsi="Hiragino Sans" w:cs="Hiragino Sans"/>
-          <w:sz w:val="29"/>
-          <w:sz-cs w:val="29"/>
-          <w:b/>
-          <w:spacing w:val="0"/>
-        </w:rPr>
-        <w:t xml:space="preserve">もう一度大きくしたい。</w:t>
-      </w:r>
-      <w:r>
-        <w:rPr>
-          <w:rFonts w:ascii="Hiragino Sans" w:hAnsi="Hiragino Sans" w:cs="Hiragino Sans"/>
-          <w:sz w:val="29"/>
-          <w:sz-cs w:val="29"/>
-          <w:spacing w:val="0"/>
-        </w:rPr>
-        <w:t xml:space="preserve">私たちが本当に思っているのは、それだけです。</w:t>
+        <w:t xml:space="preserve">12. 最後に</w:t>
+      </w:r>
+    </w:p>
+    <w:p>
+      <w:pPr>
+        <w:spacing w:after="240"/>
+      </w:pPr>
+      <w:r>
+        <w:rPr>
+          <w:rFonts w:ascii="Hiragino Sans" w:hAnsi="Hiragino Sans" w:cs="Hiragino Sans"/>
+          <w:sz w:val="29"/>
+          <w:sz-cs w:val="29"/>
+          <w:b/>
+          <w:spacing w:val="0"/>
+        </w:rPr>
+        <w:t xml:space="preserve">文化 × エンタメ × AI。</w:t>
+      </w:r>
+      <w:r>
+        <w:rPr>
+          <w:rFonts w:ascii="Hiragino Sans" w:hAnsi="Hiragino Sans" w:cs="Hiragino Sans"/>
+          <w:sz w:val="29"/>
+          <w:sz-cs w:val="29"/>
+          <w:spacing w:val="0"/>
+        </w:rPr>
+        <w:t xml:space="preserve"/>
+      </w:r>
+    </w:p>
+    <w:p>
+      <w:pPr>
+        <w:spacing w:after="240"/>
+      </w:pPr>
+      <w:r>
+        <w:rPr>
+          <w:rFonts w:ascii="Hiragino Sans" w:hAnsi="Hiragino Sans" w:cs="Hiragino Sans"/>
+          <w:sz w:val="29"/>
+          <w:sz-cs w:val="29"/>
+          <w:spacing w:val="0"/>
+        </w:rPr>
+        <w:t xml:space="preserve">3つの言葉を掲げましたが、私たちが本当に思っていることは、もっと単純です。</w:t>
+      </w:r>
+    </w:p>
+    <w:p>
+      <w:pPr>
+        <w:spacing w:after="240"/>
+      </w:pPr>
+      <w:r>
+        <w:rPr>
+          <w:rFonts w:ascii="Hiragino Sans" w:hAnsi="Hiragino Sans" w:cs="Hiragino Sans"/>
+          <w:sz w:val="29"/>
+          <w:sz-cs w:val="29"/>
+          <w:b/>
+          <w:spacing w:val="0"/>
+        </w:rPr>
+        <w:t xml:space="preserve">エンタメ業界を、もう一度盛り上げたい。</w:t>
+      </w:r>
+      <w:r>
+        <w:rPr>
+          <w:rFonts w:ascii="Hiragino Sans" w:hAnsi="Hiragino Sans" w:cs="Hiragino Sans"/>
+          <w:sz w:val="29"/>
+          <w:sz-cs w:val="29"/>
+          <w:spacing w:val="0"/>
+        </w:rPr>
+        <w:t xml:space="preserve"/>
+      </w:r>
+    </w:p>
+    <w:p>
+      <w:pPr>
+        <w:spacing w:after="240"/>
+      </w:pPr>
+      <w:r>
+        <w:rPr>
+          <w:rFonts w:ascii="Hiragino Sans" w:hAnsi="Hiragino Sans" w:cs="Hiragino Sans"/>
+          <w:sz w:val="29"/>
+          <w:sz-cs w:val="29"/>
+          <w:spacing w:val="0"/>
+        </w:rPr>
+        <w:t xml:space="preserve">そのために、好きなことに使える時間を </w:t>
+      </w:r>
+      <w:r>
+        <w:rPr>
+          <w:rFonts w:ascii="Hiragino Sans" w:hAnsi="Hiragino Sans" w:cs="Hiragino Sans"/>
+          <w:sz w:val="29"/>
+          <w:sz-cs w:val="29"/>
+          <w:b/>
+          <w:spacing w:val="0"/>
+        </w:rPr>
+        <w:t xml:space="preserve">AI</w:t>
+      </w:r>
+      <w:r>
+        <w:rPr>
+          <w:rFonts w:ascii="Hiragino Sans" w:hAnsi="Hiragino Sans" w:cs="Hiragino Sans"/>
+          <w:sz w:val="29"/>
+          <w:sz-cs w:val="29"/>
+          <w:spacing w:val="0"/>
+        </w:rPr>
+        <w:t xml:space="preserve"> でつくり、受け継がれてきた </w:t>
+      </w:r>
+      <w:r>
+        <w:rPr>
+          <w:rFonts w:ascii="Hiragino Sans" w:hAnsi="Hiragino Sans" w:cs="Hiragino Sans"/>
+          <w:sz w:val="29"/>
+          <w:sz-cs w:val="29"/>
+          <w:b/>
+          <w:spacing w:val="0"/>
+        </w:rPr>
+        <w:t xml:space="preserve">文化</w:t>
+      </w:r>
+      <w:r>
+        <w:rPr>
+          <w:rFonts w:ascii="Hiragino Sans" w:hAnsi="Hiragino Sans" w:cs="Hiragino Sans"/>
+          <w:sz w:val="29"/>
+          <w:sz-cs w:val="29"/>
+          <w:spacing w:val="0"/>
+        </w:rPr>
+        <w:t xml:space="preserve">の上に立って、鳴らし続ける。</w:t>
+      </w:r>
+      <w:r>
+        <w:rPr>
+          <w:rFonts w:ascii="Hiragino Sans" w:hAnsi="Hiragino Sans" w:cs="Hiragino Sans"/>
+          <w:sz w:val="29"/>
+          <w:sz-cs w:val="29"/>
+          <w:b/>
+          <w:spacing w:val="0"/>
+        </w:rPr>
+        <w:t xml:space="preserve">この3つは、ばらばらの話ではなく、ひと続きの話です。</w:t>
+      </w:r>
+      <w:r>
+        <w:rPr>
+          <w:rFonts w:ascii="Hiragino Sans" w:hAnsi="Hiragino Sans" w:cs="Hiragino Sans"/>
+          <w:sz w:val="29"/>
+          <w:sz-cs w:val="29"/>
+          <w:spacing w:val="0"/>
+        </w:rPr>
+        <w:t xml:space="preserve"/>
       </w:r>
     </w:p>
     <w:p>

</xml_diff>

<commit_message>
charity: stop posting returns; hand over, hold over, or send a file
kazuma's call: nothing goes in the mail. Everything is either handed
over on the night, handed over at the November fan meeting, or sent as
a file. The 300-favourite sticker becomes a digital one too.

That clears the worst problem in the whole setup -- CAMPFIRE only takes
an address for returns marked as shipped, and a return registered
without one can never switch to post later. With no post there is no
address to collect, and no postage coming off the donation.

Two things it creates instead, both written down: シンプル応援 never
attends, so its 限定名刺 has to become a file and is no longer the same
object the seated tiers get; and anything handed over on the night has
no route to someone who does not come, which the fan meeting can absorb
only for those who come to that.

Co-Authored-By: Claude Opus 5 <noreply@anthropic.com>
</commit_message>
<xml_diff>
--- a/docs/campfire-body-edit.docx
+++ b/docs/campfire-body-edit.docx
@@ -4871,7 +4871,7 @@
           <w:b/>
           <w:spacing w:val="0"/>
         </w:rPr>
-        <w:t xml:space="preserve">＜後日・郵送＞</w:t>
+        <w:t xml:space="preserve">＜後日・オンライン＞</w:t>
       </w:r>
       <w:r>
         <w:rPr>
@@ -4909,7 +4909,7 @@
           <w:b/>
           <w:spacing w:val="0"/>
         </w:rPr>
-        <w:t xml:space="preserve">限定名刺</w:t>
+        <w:t xml:space="preserve">限定名刺（デジタル版）</w:t>
       </w:r>
       <w:r>
         <w:rPr>
@@ -4919,6 +4919,24 @@
           <w:spacing w:val="0"/>
         </w:rPr>
         <w:t xml:space="preserve">をお送りします</w:t>
+      </w:r>
+      <w:r>
+        <w:rPr>
+          <w:rFonts w:ascii="Hiragino Sans" w:hAnsi="Hiragino Sans" w:cs="Hiragino Sans"/>
+          <w:sz w:val="29"/>
+          <w:sz-cs w:val="29"/>
+          <w:spacing w:val="0"/>
+        </w:rPr>
+        <w:t xml:space="preserve">〔形式は調整中〕</w:t>
+      </w:r>
+      <w:r>
+        <w:rPr>
+          <w:rFonts w:ascii="Hiragino Sans" w:hAnsi="Hiragino Sans" w:cs="Hiragino Sans"/>
+          <w:sz w:val="29"/>
+          <w:sz-cs w:val="29"/>
+          <w:spacing w:val="0"/>
+        </w:rPr>
+        <w:t xml:space="preserve"/>
       </w:r>
     </w:p>
     <w:p>
@@ -6035,7 +6053,7 @@
           <w:sz-cs w:val="29"/>
           <w:spacing w:val="0"/>
         </w:rPr>
-        <w:t xml:space="preserve">A. はい。来場を伴わない「シンプル応援」コース（5,000円）をご用意しています。限定名刺をお送りします。</w:t>
+        <w:t xml:space="preserve">A. はい。来場を伴わない「シンプル応援」コース（5,000円）をご用意しています。限定名刺のデジタル版をオンラインでお送りします。</w:t>
       </w:r>
     </w:p>
     <w:p>

</xml_diff>

<commit_message>
charity: put every page image on 16:9
kazuma asked for one aspect across the page. Each image needed a
different route to get there, so the fitter names which it used and the
handover build refuses to finish if anything lands off-ratio.

The 2:1 diagrams grow rather than crop — their top and bottom are empty
ground, so extending it leaves no seam. The three-word banner is rebuilt
at 1920x1080; its bands drop to 360, and the face strip narrows so the
crop is driven by height rather than width, which is what was cutting
the faces off. The field photo crops to where all three heads survive.

Two could not simply be cropped. The member portraits are 2:3 and a 16:9
crop keeps a face and throws the costume away — for visual-kei that is
the subject, so each becomes a card: photo bled full-height at the left,
name and part at the right. The ONE WORLD flyer is a poster, so it sits
whole on a 16:9 ground rather than being cut.

Co-Authored-By: Claude Opus 5 <noreply@anthropic.com>
</commit_message>
<xml_diff>
--- a/docs/campfire-body-edit.docx
+++ b/docs/campfire-body-edit.docx
@@ -4009,7 +4009,7 @@
           <w:spacing w:val="0"/>
           <w:color w:val="646464"/>
         </w:rPr>
-        <w:t xml:space="preserve">［画像：mio.jpg］</w:t>
+        <w:t xml:space="preserve">［画像：mio_card.jpg］</w:t>
       </w:r>
     </w:p>
     <w:p>
@@ -4066,7 +4066,7 @@
           <w:spacing w:val="0"/>
           <w:color w:val="646464"/>
         </w:rPr>
-        <w:t xml:space="preserve">［画像：rei.jpg］</w:t>
+        <w:t xml:space="preserve">［画像：rei_card.jpg］</w:t>
       </w:r>
     </w:p>
     <w:p>
@@ -4105,7 +4105,7 @@
           <w:spacing w:val="0"/>
           <w:color w:val="646464"/>
         </w:rPr>
-        <w:t xml:space="preserve">［画像：kou.jpg］</w:t>
+        <w:t xml:space="preserve">［画像：kou_card.jpg］</w:t>
       </w:r>
     </w:p>
     <w:p>

</xml_diff>

<commit_message>
charity: correct the member names and the dumpling
Teada sent the official notation and it shows two of ours were wrong:
RAY's host name is 彩波レイ, not 零, and KØU has no Japanese form at all —
コウ was invented. Rather than correct them, the Japanese names come off
the performer section entirely. The page states this is not host work, so
printing host names beside the band ones contradicts it. MIO keeps 社美緒,
which appears as the Yggdrasill chair rather than as a host name.

The dumpling is みおちゃおず, not みちゃおず.

Co-Authored-By: Claude Opus 5 <noreply@anthropic.com>
</commit_message>
<xml_diff>
--- a/docs/campfire-body-edit.docx
+++ b/docs/campfire-body-edit.docx
@@ -503,7 +503,7 @@
           <w:sz-cs w:val="29"/>
           <w:spacing w:val="0"/>
         </w:rPr>
-        <w:t xml:space="preserve">昼の縁日では、社美緒の特製餃子「みちゃおず」を無料で配布</w:t>
+        <w:t xml:space="preserve">昼の縁日では、社美緒の特製餃子「みおちゃおず」を無料で配布</w:t>
       </w:r>
     </w:p>
     <w:p>
@@ -4024,7 +4024,7 @@
           <w:b/>
           <w:spacing w:val="0"/>
         </w:rPr>
-        <w:t xml:space="preserve">MIO ／ 社美緒</w:t>
+        <w:t xml:space="preserve">MIO</w:t>
       </w:r>
       <w:r>
         <w:rPr>
@@ -4081,7 +4081,7 @@
           <w:b/>
           <w:spacing w:val="0"/>
         </w:rPr>
-        <w:t xml:space="preserve">RAY ／ 零</w:t>
+        <w:t xml:space="preserve">RAY</w:t>
       </w:r>
       <w:r>
         <w:rPr>
@@ -4120,7 +4120,7 @@
           <w:b/>
           <w:spacing w:val="0"/>
         </w:rPr>
-        <w:t xml:space="preserve">KØU ／ コウ</w:t>
+        <w:t xml:space="preserve">KØU</w:t>
       </w:r>
       <w:r>
         <w:rPr>

</xml_diff>